<commit_message>
Additional Greedy Cup writeup
</commit_message>
<xml_diff>
--- a/Greedy Cup Molten Salt Reactor/GreedyCupConceptMSR.docx
+++ b/Greedy Cup Molten Salt Reactor/GreedyCupConceptMSR.docx
@@ -9,6 +9,14 @@
           <w:bCs/>
         </w:rPr>
       </w:pPr>
+    </w:p>
+    <w:p>
+      <w:pPr>
+        <w:rPr>
+          <w:b/>
+          <w:bCs/>
+        </w:rPr>
+      </w:pPr>
       <w:r>
         <w:rPr>
           <w:b/>
@@ -156,6 +164,7 @@
     </w:p>
     <w:p>
       <w:r>
+        <w:lastRenderedPageBreak/>
         <w:t xml:space="preserve">The cylindrical core (~3-4 m diameter, 4-5 m height) maintains radial zoning: central thermal (~30% radius) with solid carbon or </w:t>
       </w:r>
       <w:proofErr w:type="spellStart"/>
@@ -164,11 +173,7 @@
       </w:r>
       <w:proofErr w:type="spellEnd"/>
       <w:r>
-        <w:t xml:space="preserve"> moderators, middle epithermal (~40%) unmoderated fuel channels, and outer blanket (~30%) thorium material in HCP lattice </w:t>
-      </w:r>
-      <w:r>
-        <w:lastRenderedPageBreak/>
-        <w:t>(pitch ~15-20 cm). Inert gas overhead (helium or argon) equalizes pressure with the catch tank.</w:t>
+        <w:t xml:space="preserve"> moderators, middle epithermal (~40%) unmoderated fuel channels, and outer blanket (~30%) thorium material in HCP lattice (pitch ~15-20 cm). Inert gas overhead (helium or argon) equalizes pressure with the catch tank.</w:t>
       </w:r>
     </w:p>
     <w:p>
@@ -353,6 +358,7 @@
           <w:b/>
           <w:bCs/>
         </w:rPr>
+        <w:lastRenderedPageBreak/>
         <w:t>ECCS System</w:t>
       </w:r>
       <w:r>
@@ -405,7 +411,6 @@
           <w:b/>
           <w:bCs/>
         </w:rPr>
-        <w:lastRenderedPageBreak/>
         <w:t>No Sodium or Water Risks</w:t>
       </w:r>
       <w:r>
@@ -442,226 +447,476 @@
           <w:b/>
           <w:bCs/>
         </w:rPr>
-        <w:t>Operational Parameters</w:t>
-      </w:r>
-    </w:p>
-    <w:p>
-      <w:r>
-        <w:t>Power density: 100-200 kW/L; outlet temperature: 650-700°C; breeding ratio: 1.05-1.1; flow velocity: 0.5-1 m/s. Cycle efficiency: 45-50% with Brayton + combined.</w:t>
-      </w:r>
-    </w:p>
-    <w:p>
-      <w:pPr>
-        <w:rPr>
-          <w:b/>
-          <w:bCs/>
-        </w:rPr>
-      </w:pPr>
-      <w:r>
-        <w:rPr>
-          <w:b/>
-          <w:bCs/>
-        </w:rPr>
-        <w:t>Conceptual Drawings</w:t>
-      </w:r>
-    </w:p>
-    <w:p>
-      <w:r>
-        <w:t>Drawings emphasize lead/LBE natural circulation without pumps, greedy cup, and Brayton cycle.</w:t>
+        <w:t>Safety Features</w:t>
+      </w:r>
+    </w:p>
+    <w:p>
+      <w:pPr>
+        <w:rPr>
+          <w:b/>
+          <w:bCs/>
+        </w:rPr>
+      </w:pPr>
+      <w:r>
+        <w:rPr>
+          <w:b/>
+          <w:bCs/>
+        </w:rPr>
+        <w:t>Passive safety is paramount. The design incorporates:</w:t>
       </w:r>
     </w:p>
     <w:p>
       <w:pPr>
         <w:numPr>
           <w:ilvl w:val="0"/>
-          <w:numId w:val="4"/>
+          <w:numId w:val="8"/>
         </w:numPr>
       </w:pPr>
       <w:r>
-        <w:rPr>
-          <w:b/>
-          <w:bCs/>
-        </w:rPr>
-        <w:t>Greedy Cup and ECCS Integration (ASCII Art)</w:t>
-      </w:r>
-      <w:r>
-        <w:t>:</w:t>
-      </w:r>
-    </w:p>
-    <w:p>
-      <w:r>
-        <w:t>text</w:t>
-      </w:r>
-    </w:p>
-    <w:p>
-      <w:r>
-        <w:t>Normal:                           Emergency:</w:t>
-      </w:r>
-    </w:p>
-    <w:p>
-      <w:r>
-        <w:t xml:space="preserve">  _______________                  _______________</w:t>
-      </w:r>
-    </w:p>
-    <w:p>
-      <w:r>
-        <w:t xml:space="preserve"> | Gas Overhead |                 | Gas Overhead |</w:t>
-      </w:r>
-    </w:p>
-    <w:p>
-      <w:r>
-        <w:t xml:space="preserve"> |______________|                 |______________|</w:t>
-      </w:r>
-    </w:p>
-    <w:p>
-      <w:r>
-        <w:t xml:space="preserve"> | Fuel Level   </w:t>
-      </w:r>
-      <w:r>
-        <w:t xml:space="preserve">      </w:t>
-      </w:r>
-      <w:r>
-        <w:t xml:space="preserve">|                 </w:t>
-      </w:r>
-      <w:r>
-        <w:t xml:space="preserve"> </w:t>
-      </w:r>
-      <w:r>
-        <w:t xml:space="preserve">| Raised Level </w:t>
-      </w:r>
-      <w:r>
-        <w:t xml:space="preserve">   </w:t>
-      </w:r>
-      <w:r>
-        <w:t>| &lt;-- ECCS Injection</w:t>
-      </w:r>
-    </w:p>
-    <w:p>
-      <w:r>
-        <w:t xml:space="preserve"> | (Below </w:t>
-      </w:r>
-      <w:proofErr w:type="gramStart"/>
-      <w:r>
-        <w:t xml:space="preserve">Bend) </w:t>
-      </w:r>
-      <w:r>
-        <w:t xml:space="preserve"> </w:t>
-      </w:r>
-      <w:r>
-        <w:t>|</w:t>
-      </w:r>
-      <w:proofErr w:type="gramEnd"/>
-      <w:r>
-        <w:t xml:space="preserve">                </w:t>
-      </w:r>
-      <w:r>
-        <w:t xml:space="preserve">  </w:t>
-      </w:r>
-      <w:r>
-        <w:t xml:space="preserve"> </w:t>
-      </w:r>
-      <w:r>
-        <w:t xml:space="preserve">| (Over </w:t>
-      </w:r>
-      <w:proofErr w:type="gramStart"/>
-      <w:r>
-        <w:t>Bend)  |</w:t>
-      </w:r>
-      <w:proofErr w:type="gramEnd"/>
-    </w:p>
-    <w:p>
-      <w:r>
-        <w:t xml:space="preserve"> | Core         </w:t>
-      </w:r>
-      <w:r>
-        <w:t xml:space="preserve">           </w:t>
-      </w:r>
-      <w:r>
-        <w:t xml:space="preserve">|                 </w:t>
-      </w:r>
-      <w:r>
-        <w:t xml:space="preserve">  </w:t>
-      </w:r>
-      <w:r>
-        <w:t xml:space="preserve">| Core         </w:t>
-      </w:r>
-      <w:r>
-        <w:t xml:space="preserve">          </w:t>
-      </w:r>
-      <w:r>
-        <w:t>|</w:t>
-      </w:r>
-    </w:p>
-    <w:p>
-      <w:r>
-        <w:t xml:space="preserve"> |______________|                 </w:t>
-      </w:r>
-      <w:r>
-        <w:t xml:space="preserve"> </w:t>
-      </w:r>
-      <w:r>
-        <w:t>|______________|</w:t>
-      </w:r>
-    </w:p>
-    <w:p>
-      <w:r>
-        <w:t xml:space="preserve"> |                                |</w:t>
-      </w:r>
-    </w:p>
-    <w:p>
-      <w:r>
-        <w:t xml:space="preserve">     | Siphon Bend                  </w:t>
-      </w:r>
-      <w:r>
-        <w:t xml:space="preserve"> </w:t>
-      </w:r>
-      <w:r>
-        <w:t>| Activated Siphon</w:t>
-      </w:r>
-    </w:p>
-    <w:p>
-      <w:r>
-        <w:t xml:space="preserve">     v                                </w:t>
-      </w:r>
-      <w:r>
-        <w:t xml:space="preserve">               </w:t>
-      </w:r>
-      <w:proofErr w:type="spellStart"/>
-      <w:r>
-        <w:t>v</w:t>
-      </w:r>
-      <w:proofErr w:type="spellEnd"/>
-    </w:p>
-    <w:p>
-      <w:r>
-        <w:t xml:space="preserve"> </w:t>
-      </w:r>
-      <w:proofErr w:type="gramStart"/>
-      <w:r>
-        <w:t xml:space="preserve">No Drainage                      </w:t>
-      </w:r>
-      <w:proofErr w:type="gramEnd"/>
-      <w:r>
-        <w:t xml:space="preserve"> </w:t>
-      </w:r>
-      <w:proofErr w:type="spellStart"/>
-      <w:r>
-        <w:t>Drainage</w:t>
-      </w:r>
-      <w:proofErr w:type="spellEnd"/>
-      <w:r>
-        <w:t xml:space="preserve"> to Catch (No Freeze Plug)</w:t>
-      </w:r>
-    </w:p>
-    <w:p/>
+        <w:t>Greedy Cup Mechanism: The core vessel includes an inverted siphon tube integrated into the fuel plenum. Under normal operation, fuel level remains below the siphon bend. In loss-of-coolant or overheating scenarios, the Emergency Core Cooling System (ECCS) injects additional molten salt (potentially in solid pellet form for rapid melting and volume addition) to raise the fluid level. Once the level exceeds the siphon threshold, the entire core fuel drains passively into a subcritical catch tank below, halting the reaction without active intervention.</w:t>
+      </w:r>
+    </w:p>
+    <w:p>
+      <w:pPr>
+        <w:rPr>
+          <w:b/>
+          <w:bCs/>
+        </w:rPr>
+      </w:pPr>
+      <w:r>
+        <w:rPr>
+          <w:b/>
+          <w:bCs/>
+        </w:rPr>
+        <w:drawing>
+          <wp:inline distT="0" distB="0" distL="0" distR="0" wp14:anchorId="2D1008BC" wp14:editId="1AE93269">
+            <wp:extent cx="5943600" cy="3343275"/>
+            <wp:effectExtent l="0" t="0" r="0" b="9525"/>
+            <wp:docPr id="976480024" name="Picture 2" descr="The Greedy Cup Has Become Even More Devious"/>
+            <wp:cNvGraphicFramePr>
+              <a:graphicFrameLocks xmlns:a="http://schemas.openxmlformats.org/drawingml/2006/main" noChangeAspect="1"/>
+            </wp:cNvGraphicFramePr>
+            <a:graphic xmlns:a="http://schemas.openxmlformats.org/drawingml/2006/main">
+              <a:graphicData uri="http://schemas.openxmlformats.org/drawingml/2006/picture">
+                <pic:pic xmlns:pic="http://schemas.openxmlformats.org/drawingml/2006/picture">
+                  <pic:nvPicPr>
+                    <pic:cNvPr id="0" name="Picture 6" descr="The Greedy Cup Has Become Even More Devious"/>
+                    <pic:cNvPicPr>
+                      <a:picLocks noChangeAspect="1" noChangeArrowheads="1"/>
+                    </pic:cNvPicPr>
+                  </pic:nvPicPr>
+                  <pic:blipFill>
+                    <a:blip r:embed="rId5">
+                      <a:extLst>
+                        <a:ext uri="{28A0092B-C50C-407E-A947-70E740481C1C}">
+                          <a14:useLocalDpi xmlns:a14="http://schemas.microsoft.com/office/drawing/2010/main" val="0"/>
+                        </a:ext>
+                      </a:extLst>
+                    </a:blip>
+                    <a:srcRect/>
+                    <a:stretch>
+                      <a:fillRect/>
+                    </a:stretch>
+                  </pic:blipFill>
+                  <pic:spPr bwMode="auto">
+                    <a:xfrm>
+                      <a:off x="0" y="0"/>
+                      <a:ext cx="5943600" cy="3343275"/>
+                    </a:xfrm>
+                    <a:prstGeom prst="rect">
+                      <a:avLst/>
+                    </a:prstGeom>
+                    <a:noFill/>
+                    <a:ln>
+                      <a:noFill/>
+                    </a:ln>
+                  </pic:spPr>
+                </pic:pic>
+              </a:graphicData>
+            </a:graphic>
+          </wp:inline>
+        </w:drawing>
+      </w:r>
+    </w:p>
+    <w:p>
+      <w:pPr>
+        <w:rPr>
+          <w:b/>
+          <w:bCs/>
+        </w:rPr>
+      </w:pPr>
+      <w:hyperlink r:id="rId6" w:tgtFrame="_blank" w:history="1">
+        <w:r>
+          <w:rPr>
+            <w:rStyle w:val="Hyperlink"/>
+            <w:b/>
+            <w:bCs/>
+          </w:rPr>
+          <w:t>youtube.com</w:t>
+        </w:r>
+      </w:hyperlink>
+    </w:p>
     <w:p>
       <w:pPr>
         <w:numPr>
           <w:ilvl w:val="0"/>
-          <w:numId w:val="5"/>
+          <w:numId w:val="9"/>
         </w:numPr>
       </w:pPr>
-    </w:p>
+      <w:r>
+        <w:lastRenderedPageBreak/>
+        <w:t>Negative Feedback Coefficients: The mixed spectrum ensures negative void and temperature coefficients, with the thermal zone providing damping.</w:t>
+      </w:r>
+    </w:p>
+    <w:p>
+      <w:pPr>
+        <w:numPr>
+          <w:ilvl w:val="0"/>
+          <w:numId w:val="9"/>
+        </w:numPr>
+      </w:pPr>
+      <w:r>
+        <w:t>Natural Circulation: Eliminates pump failures; decay heat removal via passive loops.</w:t>
+      </w:r>
+    </w:p>
+    <w:p>
+      <w:pPr>
+        <w:numPr>
+          <w:ilvl w:val="0"/>
+          <w:numId w:val="9"/>
+        </w:numPr>
+      </w:pPr>
+      <w:r>
+        <w:t>Blanket Breeding: Reduces long-lived waste by converting Th-232 to U-233, with online processing to remove protactinium.</w:t>
+      </w:r>
+    </w:p>
+    <w:p>
+      <w:pPr>
+        <w:numPr>
+          <w:ilvl w:val="0"/>
+          <w:numId w:val="9"/>
+        </w:numPr>
+      </w:pPr>
+      <w:r>
+        <w:t>By having multiple regions and siphons</w:t>
+      </w:r>
+      <w:proofErr w:type="gramStart"/>
+      <w:r>
+        <w:t>, should</w:t>
+      </w:r>
+      <w:proofErr w:type="gramEnd"/>
+      <w:r>
+        <w:t xml:space="preserve"> coolant ingress into one region, other siphons would be </w:t>
+      </w:r>
+      <w:proofErr w:type="gramStart"/>
+      <w:r>
+        <w:t>activate</w:t>
+      </w:r>
+      <w:proofErr w:type="gramEnd"/>
+      <w:r>
+        <w:t xml:space="preserve"> draining sufficient reactor fuel for rapid shutdown. </w:t>
+      </w:r>
+    </w:p>
+    <w:p>
+      <w:pPr>
+        <w:numPr>
+          <w:ilvl w:val="0"/>
+          <w:numId w:val="9"/>
+        </w:numPr>
+      </w:pPr>
+      <w:r>
+        <w:t xml:space="preserve">With online refueling, only the power defect </w:t>
+      </w:r>
+      <w:proofErr w:type="gramStart"/>
+      <w:r>
+        <w:t>has to</w:t>
+      </w:r>
+      <w:proofErr w:type="gramEnd"/>
+      <w:r>
+        <w:t xml:space="preserve"> be covered, reducing any overpower for transient reactivity accidents.</w:t>
+      </w:r>
+    </w:p>
+    <w:p>
+      <w:pPr>
+        <w:numPr>
+          <w:ilvl w:val="0"/>
+          <w:numId w:val="9"/>
+        </w:numPr>
+      </w:pPr>
+      <w:r>
+        <w:t xml:space="preserve">Using the Brayton cycle with a high conversion or breeding ratio, fuel costs are very </w:t>
+      </w:r>
+      <w:proofErr w:type="gramStart"/>
+      <w:r>
+        <w:t>low</w:t>
+      </w:r>
+      <w:proofErr w:type="gramEnd"/>
+      <w:r>
+        <w:t xml:space="preserve"> and economic resources can be concentrated on reliability, safety and cleanliness. </w:t>
+      </w:r>
+    </w:p>
+    <w:p>
+      <w:pPr>
+        <w:numPr>
+          <w:ilvl w:val="0"/>
+          <w:numId w:val="9"/>
+        </w:numPr>
+      </w:pPr>
+      <w:r>
+        <w:t>Use of Lead coolant over the level of the gas overpressure acts as a radiation shield.</w:t>
+      </w:r>
+    </w:p>
+    <w:p>
+      <w:pPr>
+        <w:numPr>
+          <w:ilvl w:val="0"/>
+          <w:numId w:val="9"/>
+        </w:numPr>
+      </w:pPr>
+      <w:r>
+        <w:t>Should fuel leak, it floats – there is no danger of meltdown.</w:t>
+      </w:r>
+    </w:p>
+    <w:p>
+      <w:pPr>
+        <w:rPr>
+          <w:b/>
+          <w:bCs/>
+        </w:rPr>
+      </w:pPr>
+      <w:r>
+        <w:rPr>
+          <w:b/>
+          <w:bCs/>
+        </w:rPr>
+        <w:t>Operational Parameters</w:t>
+      </w:r>
+    </w:p>
+    <w:p>
+      <w:r>
+        <w:t>Power density: 100-200 kW/L; outlet temperature: 650-700°C; breeding ratio: 1.05-1.1; flow velocity: 0.5-1 m/s. Cycle efficiency: 45-50% with Brayton + combined.</w:t>
+      </w:r>
+    </w:p>
+    <w:p>
+      <w:pPr>
+        <w:rPr>
+          <w:b/>
+          <w:bCs/>
+        </w:rPr>
+      </w:pPr>
+      <w:r>
+        <w:rPr>
+          <w:b/>
+          <w:bCs/>
+        </w:rPr>
+        <w:t>Conceptual Drawings</w:t>
+      </w:r>
+    </w:p>
+    <w:p>
+      <w:r>
+        <w:t>Drawings emphasize lead/LBE natural circulation without pumps, greedy cup, and Brayton cycle.</w:t>
+      </w:r>
+    </w:p>
+    <w:p>
+      <w:pPr>
+        <w:rPr>
+          <w:b/>
+          <w:bCs/>
+        </w:rPr>
+      </w:pPr>
+      <w:r>
+        <w:rPr>
+          <w:b/>
+          <w:bCs/>
+        </w:rPr>
+        <w:br w:type="page"/>
+      </w:r>
+    </w:p>
+    <w:p>
+      <w:r>
+        <w:rPr>
+          <w:b/>
+          <w:bCs/>
+        </w:rPr>
+        <w:lastRenderedPageBreak/>
+        <w:t>Greedy Cup and ECCS Integration (ASCII Art)</w:t>
+      </w:r>
+      <w:r>
+        <w:t>:</w:t>
+      </w:r>
+    </w:p>
+    <w:p>
+      <w:r>
+        <w:t>text</w:t>
+      </w:r>
+    </w:p>
+    <w:p>
+      <w:r>
+        <w:t xml:space="preserve">Normal:                           </w:t>
+      </w:r>
+      <w:r>
+        <w:t xml:space="preserve">       </w:t>
+      </w:r>
+      <w:r>
+        <w:t>Emergency:</w:t>
+      </w:r>
+    </w:p>
+    <w:p>
+      <w:r>
+        <w:t xml:space="preserve">  _______________                  _______________</w:t>
+      </w:r>
+    </w:p>
+    <w:p>
+      <w:r>
+        <w:t xml:space="preserve"> | Gas Overhead |                 | Gas Overhead |</w:t>
+      </w:r>
+    </w:p>
+    <w:p>
+      <w:r>
+        <w:t xml:space="preserve"> |______________|                 |______________|</w:t>
+      </w:r>
+    </w:p>
+    <w:p>
+      <w:r>
+        <w:t xml:space="preserve"> | Fuel Level   </w:t>
+      </w:r>
+      <w:r>
+        <w:t xml:space="preserve">      </w:t>
+      </w:r>
+      <w:r>
+        <w:t xml:space="preserve">|                 </w:t>
+      </w:r>
+      <w:r>
+        <w:t xml:space="preserve"> </w:t>
+      </w:r>
+      <w:r>
+        <w:t xml:space="preserve">| Raised Level </w:t>
+      </w:r>
+      <w:r>
+        <w:t xml:space="preserve">   </w:t>
+      </w:r>
+      <w:r>
+        <w:t>| &lt;-- ECCS Injection</w:t>
+      </w:r>
+    </w:p>
+    <w:p>
+      <w:r>
+        <w:t xml:space="preserve"> | (Below </w:t>
+      </w:r>
+      <w:proofErr w:type="gramStart"/>
+      <w:r>
+        <w:t xml:space="preserve">Bend) </w:t>
+      </w:r>
+      <w:r>
+        <w:t xml:space="preserve"> </w:t>
+      </w:r>
+      <w:r>
+        <w:t>|</w:t>
+      </w:r>
+      <w:proofErr w:type="gramEnd"/>
+      <w:r>
+        <w:t xml:space="preserve">                </w:t>
+      </w:r>
+      <w:r>
+        <w:t xml:space="preserve">  </w:t>
+      </w:r>
+      <w:r>
+        <w:t xml:space="preserve"> </w:t>
+      </w:r>
+      <w:r>
+        <w:t xml:space="preserve">| (Over </w:t>
+      </w:r>
+      <w:proofErr w:type="gramStart"/>
+      <w:r>
+        <w:t>Bend)  |</w:t>
+      </w:r>
+      <w:proofErr w:type="gramEnd"/>
+    </w:p>
+    <w:p>
+      <w:r>
+        <w:t xml:space="preserve"> | Core         </w:t>
+      </w:r>
+      <w:r>
+        <w:t xml:space="preserve">           </w:t>
+      </w:r>
+      <w:r>
+        <w:t xml:space="preserve">|                 </w:t>
+      </w:r>
+      <w:r>
+        <w:t xml:space="preserve">  </w:t>
+      </w:r>
+      <w:r>
+        <w:t xml:space="preserve">| Core         </w:t>
+      </w:r>
+      <w:r>
+        <w:t xml:space="preserve">          </w:t>
+      </w:r>
+      <w:r>
+        <w:t>|</w:t>
+      </w:r>
+    </w:p>
+    <w:p>
+      <w:r>
+        <w:t xml:space="preserve"> |______________|                 </w:t>
+      </w:r>
+      <w:r>
+        <w:t xml:space="preserve"> </w:t>
+      </w:r>
+      <w:r>
+        <w:t>|______________|</w:t>
+      </w:r>
+    </w:p>
+    <w:p>
+      <w:r>
+        <w:t xml:space="preserve"> |                                |</w:t>
+      </w:r>
+    </w:p>
+    <w:p>
+      <w:r>
+        <w:t xml:space="preserve">     | Siphon Bend                  </w:t>
+      </w:r>
+      <w:r>
+        <w:t xml:space="preserve"> </w:t>
+      </w:r>
+      <w:r>
+        <w:t>| Activated Siphon</w:t>
+      </w:r>
+    </w:p>
+    <w:p>
+      <w:r>
+        <w:t xml:space="preserve">     v                                </w:t>
+      </w:r>
+      <w:r>
+        <w:t xml:space="preserve">               </w:t>
+      </w:r>
+      <w:proofErr w:type="spellStart"/>
+      <w:r>
+        <w:t>v</w:t>
+      </w:r>
+      <w:proofErr w:type="spellEnd"/>
+    </w:p>
+    <w:p>
+      <w:r>
+        <w:t xml:space="preserve"> </w:t>
+      </w:r>
+      <w:proofErr w:type="gramStart"/>
+      <w:r>
+        <w:t xml:space="preserve">No Drainage                      </w:t>
+      </w:r>
+      <w:proofErr w:type="gramEnd"/>
+      <w:r>
+        <w:t xml:space="preserve"> </w:t>
+      </w:r>
+      <w:proofErr w:type="spellStart"/>
+      <w:r>
+        <w:t>Drainage</w:t>
+      </w:r>
+      <w:proofErr w:type="spellEnd"/>
+      <w:r>
+        <w:t xml:space="preserve"> to Catch (No Freeze Plug)</w:t>
+      </w:r>
+    </w:p>
+    <w:p/>
     <w:p>
       <w:r>
         <w:t>(Diagram of closed Brayton cycle with supercritical CO₂ for nuclear heat, adaptable to nitrogen.)</w:t>
@@ -669,6 +924,9 @@
     </w:p>
     <w:p>
       <w:r>
+        <w:rPr>
+          <w:noProof/>
+        </w:rPr>
         <w:lastRenderedPageBreak/>
         <w:drawing>
           <wp:inline distT="0" distB="0" distL="0" distR="0" wp14:anchorId="101B66B2" wp14:editId="00481C4D">
@@ -688,7 +946,7 @@
                     </pic:cNvPicPr>
                   </pic:nvPicPr>
                   <pic:blipFill>
-                    <a:blip r:embed="rId5">
+                    <a:blip r:embed="rId7">
                       <a:extLst>
                         <a:ext uri="{28A0092B-C50C-407E-A947-70E740481C1C}">
                           <a14:useLocalDpi xmlns:a14="http://schemas.microsoft.com/office/drawing/2010/main" val="0"/>
@@ -721,7 +979,7 @@
       </w:r>
     </w:p>
     <w:p>
-      <w:hyperlink r:id="rId6" w:tgtFrame="_blank" w:history="1">
+      <w:hyperlink r:id="rId8" w:tgtFrame="_blank" w:history="1">
         <w:r>
           <w:rPr>
             <w:rStyle w:val="Hyperlink"/>
@@ -903,6 +1161,153 @@
         <w:t>This design prioritizes passivity and safety, ideal for further development.</w:t>
       </w:r>
     </w:p>
+    <w:p>
+      <w:pPr>
+        <w:numPr>
+          <w:ilvl w:val="0"/>
+          <w:numId w:val="7"/>
+        </w:numPr>
+        <w:rPr>
+          <w:b/>
+          <w:bCs/>
+        </w:rPr>
+      </w:pPr>
+      <w:r>
+        <w:rPr>
+          <w:b/>
+          <w:bCs/>
+        </w:rPr>
+        <w:t>Fuel Options:</w:t>
+      </w:r>
+    </w:p>
+    <w:p>
+      <w:pPr>
+        <w:numPr>
+          <w:ilvl w:val="1"/>
+          <w:numId w:val="7"/>
+        </w:numPr>
+      </w:pPr>
+      <w:r>
+        <w:lastRenderedPageBreak/>
+        <w:t>Molten Salt Fuel: A eutectic mixture such as 7LiF-BeF₂-UF₄ (</w:t>
+      </w:r>
+      <w:proofErr w:type="spellStart"/>
+      <w:r>
+        <w:t>FLiBe</w:t>
+      </w:r>
+      <w:proofErr w:type="spellEnd"/>
+      <w:r>
+        <w:t>-UF₄), with uranium enriched to ~5-10% U-235 initially, transitioning to bred U-233 from the thorium blanket.</w:t>
+      </w:r>
+    </w:p>
+    <w:p>
+      <w:pPr>
+        <w:numPr>
+          <w:ilvl w:val="1"/>
+          <w:numId w:val="7"/>
+        </w:numPr>
+      </w:pPr>
+      <w:r>
+        <w:t xml:space="preserve">ULIMES Fuel: UO₂ microparticles (~10-50 </w:t>
+      </w:r>
+      <w:proofErr w:type="spellStart"/>
+      <w:r>
+        <w:t>μm</w:t>
+      </w:r>
+      <w:proofErr w:type="spellEnd"/>
+      <w:r>
+        <w:t xml:space="preserve">) suspended in liquid metal (e.g., 44.5% Pb-55.5% </w:t>
+      </w:r>
+      <w:proofErr w:type="spellStart"/>
+      <w:r>
+        <w:t>Bi</w:t>
+      </w:r>
+      <w:proofErr w:type="spellEnd"/>
+      <w:r>
+        <w:t xml:space="preserve"> for LBE, or Bi-Pb-Sn alloys). This provides ~5-10x higher thermal conductivity than solid UO₂, enabling higher power densities.</w:t>
+      </w:r>
+    </w:p>
+    <w:p>
+      <w:pPr>
+        <w:numPr>
+          <w:ilvl w:val="1"/>
+          <w:numId w:val="7"/>
+        </w:numPr>
+      </w:pPr>
+      <w:r>
+        <w:t xml:space="preserve">Use of </w:t>
+      </w:r>
+      <w:proofErr w:type="gramStart"/>
+      <w:r>
+        <w:t>ULIMES in particular, means</w:t>
+      </w:r>
+      <w:proofErr w:type="gramEnd"/>
+      <w:r>
+        <w:t xml:space="preserve"> the natural circulation flow rate with the fuel loop can be very low or practically zero with simple local circulation. It requires sufficient circulation to assure suspension. </w:t>
+      </w:r>
+    </w:p>
+    <w:p>
+      <w:pPr>
+        <w:numPr>
+          <w:ilvl w:val="0"/>
+          <w:numId w:val="7"/>
+        </w:numPr>
+        <w:rPr>
+          <w:b/>
+          <w:bCs/>
+        </w:rPr>
+      </w:pPr>
+      <w:r>
+        <w:rPr>
+          <w:b/>
+          <w:bCs/>
+        </w:rPr>
+        <w:t>Coolant: Separate from fuel to prevent mixing and allow independent optimization. Options include:</w:t>
+      </w:r>
+    </w:p>
+    <w:p>
+      <w:pPr>
+        <w:numPr>
+          <w:ilvl w:val="1"/>
+          <w:numId w:val="7"/>
+        </w:numPr>
+      </w:pPr>
+      <w:r>
+        <w:t xml:space="preserve">Molten salt (e.g., </w:t>
+      </w:r>
+      <w:proofErr w:type="spellStart"/>
+      <w:r>
+        <w:t>FLiNaK</w:t>
+      </w:r>
+      <w:proofErr w:type="spellEnd"/>
+      <w:r>
+        <w:t>: 46.5% LiF-11.5% NaF-42% KF) for high heat capacity.</w:t>
+      </w:r>
+    </w:p>
+    <w:p>
+      <w:pPr>
+        <w:numPr>
+          <w:ilvl w:val="1"/>
+          <w:numId w:val="7"/>
+        </w:numPr>
+      </w:pPr>
+      <w:r>
+        <w:t>Lead or LBE for superior neutronics and corrosion resistance at high temperatures (~400-600°C).</w:t>
+      </w:r>
+    </w:p>
+    <w:p>
+      <w:r>
+        <w:rPr>
+          <w:b/>
+          <w:bCs/>
+        </w:rPr>
+        <w:t xml:space="preserve">Both loops rely on natural circulation: </w:t>
+      </w:r>
+      <w:r>
+        <w:t>heated fluid rises in the core, cools in heat exchangers, and descends. Intermediate heat exchangers transfer heat from fuel to coolant, then to a supercritical CO₂ or steam cycle for power generation.</w:t>
+      </w:r>
+    </w:p>
+    <w:p/>
     <w:p/>
     <w:p/>
     <w:sectPr>
@@ -1216,6 +1621,453 @@
     </w:lvl>
   </w:abstractNum>
   <w:abstractNum w:abstractNumId="2" w15:restartNumberingAfterBreak="0">
+    <w:nsid w:val="38A25DCF"/>
+    <w:multiLevelType w:val="multilevel"/>
+    <w:tmpl w:val="397CDBFC"/>
+    <w:lvl w:ilvl="0">
+      <w:start w:val="1"/>
+      <w:numFmt w:val="bullet"/>
+      <w:lvlText w:val=""/>
+      <w:lvlJc w:val="left"/>
+      <w:pPr>
+        <w:tabs>
+          <w:tab w:val="num" w:pos="720"/>
+        </w:tabs>
+        <w:ind w:left="720" w:hanging="360"/>
+      </w:pPr>
+      <w:rPr>
+        <w:rFonts w:ascii="Symbol" w:hAnsi="Symbol" w:hint="default"/>
+        <w:sz w:val="20"/>
+      </w:rPr>
+    </w:lvl>
+    <w:lvl w:ilvl="1" w:tentative="1">
+      <w:start w:val="1"/>
+      <w:numFmt w:val="bullet"/>
+      <w:lvlText w:val="o"/>
+      <w:lvlJc w:val="left"/>
+      <w:pPr>
+        <w:tabs>
+          <w:tab w:val="num" w:pos="1440"/>
+        </w:tabs>
+        <w:ind w:left="1440" w:hanging="360"/>
+      </w:pPr>
+      <w:rPr>
+        <w:rFonts w:ascii="Courier New" w:hAnsi="Courier New" w:hint="default"/>
+        <w:sz w:val="20"/>
+      </w:rPr>
+    </w:lvl>
+    <w:lvl w:ilvl="2" w:tentative="1">
+      <w:start w:val="1"/>
+      <w:numFmt w:val="bullet"/>
+      <w:lvlText w:val=""/>
+      <w:lvlJc w:val="left"/>
+      <w:pPr>
+        <w:tabs>
+          <w:tab w:val="num" w:pos="2160"/>
+        </w:tabs>
+        <w:ind w:left="2160" w:hanging="360"/>
+      </w:pPr>
+      <w:rPr>
+        <w:rFonts w:ascii="Wingdings" w:hAnsi="Wingdings" w:hint="default"/>
+        <w:sz w:val="20"/>
+      </w:rPr>
+    </w:lvl>
+    <w:lvl w:ilvl="3" w:tentative="1">
+      <w:start w:val="1"/>
+      <w:numFmt w:val="bullet"/>
+      <w:lvlText w:val=""/>
+      <w:lvlJc w:val="left"/>
+      <w:pPr>
+        <w:tabs>
+          <w:tab w:val="num" w:pos="2880"/>
+        </w:tabs>
+        <w:ind w:left="2880" w:hanging="360"/>
+      </w:pPr>
+      <w:rPr>
+        <w:rFonts w:ascii="Wingdings" w:hAnsi="Wingdings" w:hint="default"/>
+        <w:sz w:val="20"/>
+      </w:rPr>
+    </w:lvl>
+    <w:lvl w:ilvl="4" w:tentative="1">
+      <w:start w:val="1"/>
+      <w:numFmt w:val="bullet"/>
+      <w:lvlText w:val=""/>
+      <w:lvlJc w:val="left"/>
+      <w:pPr>
+        <w:tabs>
+          <w:tab w:val="num" w:pos="3600"/>
+        </w:tabs>
+        <w:ind w:left="3600" w:hanging="360"/>
+      </w:pPr>
+      <w:rPr>
+        <w:rFonts w:ascii="Wingdings" w:hAnsi="Wingdings" w:hint="default"/>
+        <w:sz w:val="20"/>
+      </w:rPr>
+    </w:lvl>
+    <w:lvl w:ilvl="5" w:tentative="1">
+      <w:start w:val="1"/>
+      <w:numFmt w:val="bullet"/>
+      <w:lvlText w:val=""/>
+      <w:lvlJc w:val="left"/>
+      <w:pPr>
+        <w:tabs>
+          <w:tab w:val="num" w:pos="4320"/>
+        </w:tabs>
+        <w:ind w:left="4320" w:hanging="360"/>
+      </w:pPr>
+      <w:rPr>
+        <w:rFonts w:ascii="Wingdings" w:hAnsi="Wingdings" w:hint="default"/>
+        <w:sz w:val="20"/>
+      </w:rPr>
+    </w:lvl>
+    <w:lvl w:ilvl="6" w:tentative="1">
+      <w:start w:val="1"/>
+      <w:numFmt w:val="bullet"/>
+      <w:lvlText w:val=""/>
+      <w:lvlJc w:val="left"/>
+      <w:pPr>
+        <w:tabs>
+          <w:tab w:val="num" w:pos="5040"/>
+        </w:tabs>
+        <w:ind w:left="5040" w:hanging="360"/>
+      </w:pPr>
+      <w:rPr>
+        <w:rFonts w:ascii="Wingdings" w:hAnsi="Wingdings" w:hint="default"/>
+        <w:sz w:val="20"/>
+      </w:rPr>
+    </w:lvl>
+    <w:lvl w:ilvl="7" w:tentative="1">
+      <w:start w:val="1"/>
+      <w:numFmt w:val="bullet"/>
+      <w:lvlText w:val=""/>
+      <w:lvlJc w:val="left"/>
+      <w:pPr>
+        <w:tabs>
+          <w:tab w:val="num" w:pos="5760"/>
+        </w:tabs>
+        <w:ind w:left="5760" w:hanging="360"/>
+      </w:pPr>
+      <w:rPr>
+        <w:rFonts w:ascii="Wingdings" w:hAnsi="Wingdings" w:hint="default"/>
+        <w:sz w:val="20"/>
+      </w:rPr>
+    </w:lvl>
+    <w:lvl w:ilvl="8" w:tentative="1">
+      <w:start w:val="1"/>
+      <w:numFmt w:val="bullet"/>
+      <w:lvlText w:val=""/>
+      <w:lvlJc w:val="left"/>
+      <w:pPr>
+        <w:tabs>
+          <w:tab w:val="num" w:pos="6480"/>
+        </w:tabs>
+        <w:ind w:left="6480" w:hanging="360"/>
+      </w:pPr>
+      <w:rPr>
+        <w:rFonts w:ascii="Wingdings" w:hAnsi="Wingdings" w:hint="default"/>
+        <w:sz w:val="20"/>
+      </w:rPr>
+    </w:lvl>
+  </w:abstractNum>
+  <w:abstractNum w:abstractNumId="3" w15:restartNumberingAfterBreak="0">
+    <w:nsid w:val="460A2CC7"/>
+    <w:multiLevelType w:val="multilevel"/>
+    <w:tmpl w:val="04801F38"/>
+    <w:lvl w:ilvl="0">
+      <w:start w:val="1"/>
+      <w:numFmt w:val="bullet"/>
+      <w:lvlText w:val=""/>
+      <w:lvlJc w:val="left"/>
+      <w:pPr>
+        <w:tabs>
+          <w:tab w:val="num" w:pos="720"/>
+        </w:tabs>
+        <w:ind w:left="720" w:hanging="360"/>
+      </w:pPr>
+      <w:rPr>
+        <w:rFonts w:ascii="Symbol" w:hAnsi="Symbol" w:hint="default"/>
+        <w:sz w:val="20"/>
+      </w:rPr>
+    </w:lvl>
+    <w:lvl w:ilvl="1" w:tentative="1">
+      <w:start w:val="1"/>
+      <w:numFmt w:val="bullet"/>
+      <w:lvlText w:val="o"/>
+      <w:lvlJc w:val="left"/>
+      <w:pPr>
+        <w:tabs>
+          <w:tab w:val="num" w:pos="1440"/>
+        </w:tabs>
+        <w:ind w:left="1440" w:hanging="360"/>
+      </w:pPr>
+      <w:rPr>
+        <w:rFonts w:ascii="Courier New" w:hAnsi="Courier New" w:hint="default"/>
+        <w:sz w:val="20"/>
+      </w:rPr>
+    </w:lvl>
+    <w:lvl w:ilvl="2" w:tentative="1">
+      <w:start w:val="1"/>
+      <w:numFmt w:val="bullet"/>
+      <w:lvlText w:val=""/>
+      <w:lvlJc w:val="left"/>
+      <w:pPr>
+        <w:tabs>
+          <w:tab w:val="num" w:pos="2160"/>
+        </w:tabs>
+        <w:ind w:left="2160" w:hanging="360"/>
+      </w:pPr>
+      <w:rPr>
+        <w:rFonts w:ascii="Wingdings" w:hAnsi="Wingdings" w:hint="default"/>
+        <w:sz w:val="20"/>
+      </w:rPr>
+    </w:lvl>
+    <w:lvl w:ilvl="3" w:tentative="1">
+      <w:start w:val="1"/>
+      <w:numFmt w:val="bullet"/>
+      <w:lvlText w:val=""/>
+      <w:lvlJc w:val="left"/>
+      <w:pPr>
+        <w:tabs>
+          <w:tab w:val="num" w:pos="2880"/>
+        </w:tabs>
+        <w:ind w:left="2880" w:hanging="360"/>
+      </w:pPr>
+      <w:rPr>
+        <w:rFonts w:ascii="Wingdings" w:hAnsi="Wingdings" w:hint="default"/>
+        <w:sz w:val="20"/>
+      </w:rPr>
+    </w:lvl>
+    <w:lvl w:ilvl="4" w:tentative="1">
+      <w:start w:val="1"/>
+      <w:numFmt w:val="bullet"/>
+      <w:lvlText w:val=""/>
+      <w:lvlJc w:val="left"/>
+      <w:pPr>
+        <w:tabs>
+          <w:tab w:val="num" w:pos="3600"/>
+        </w:tabs>
+        <w:ind w:left="3600" w:hanging="360"/>
+      </w:pPr>
+      <w:rPr>
+        <w:rFonts w:ascii="Wingdings" w:hAnsi="Wingdings" w:hint="default"/>
+        <w:sz w:val="20"/>
+      </w:rPr>
+    </w:lvl>
+    <w:lvl w:ilvl="5" w:tentative="1">
+      <w:start w:val="1"/>
+      <w:numFmt w:val="bullet"/>
+      <w:lvlText w:val=""/>
+      <w:lvlJc w:val="left"/>
+      <w:pPr>
+        <w:tabs>
+          <w:tab w:val="num" w:pos="4320"/>
+        </w:tabs>
+        <w:ind w:left="4320" w:hanging="360"/>
+      </w:pPr>
+      <w:rPr>
+        <w:rFonts w:ascii="Wingdings" w:hAnsi="Wingdings" w:hint="default"/>
+        <w:sz w:val="20"/>
+      </w:rPr>
+    </w:lvl>
+    <w:lvl w:ilvl="6" w:tentative="1">
+      <w:start w:val="1"/>
+      <w:numFmt w:val="bullet"/>
+      <w:lvlText w:val=""/>
+      <w:lvlJc w:val="left"/>
+      <w:pPr>
+        <w:tabs>
+          <w:tab w:val="num" w:pos="5040"/>
+        </w:tabs>
+        <w:ind w:left="5040" w:hanging="360"/>
+      </w:pPr>
+      <w:rPr>
+        <w:rFonts w:ascii="Wingdings" w:hAnsi="Wingdings" w:hint="default"/>
+        <w:sz w:val="20"/>
+      </w:rPr>
+    </w:lvl>
+    <w:lvl w:ilvl="7" w:tentative="1">
+      <w:start w:val="1"/>
+      <w:numFmt w:val="bullet"/>
+      <w:lvlText w:val=""/>
+      <w:lvlJc w:val="left"/>
+      <w:pPr>
+        <w:tabs>
+          <w:tab w:val="num" w:pos="5760"/>
+        </w:tabs>
+        <w:ind w:left="5760" w:hanging="360"/>
+      </w:pPr>
+      <w:rPr>
+        <w:rFonts w:ascii="Wingdings" w:hAnsi="Wingdings" w:hint="default"/>
+        <w:sz w:val="20"/>
+      </w:rPr>
+    </w:lvl>
+    <w:lvl w:ilvl="8" w:tentative="1">
+      <w:start w:val="1"/>
+      <w:numFmt w:val="bullet"/>
+      <w:lvlText w:val=""/>
+      <w:lvlJc w:val="left"/>
+      <w:pPr>
+        <w:tabs>
+          <w:tab w:val="num" w:pos="6480"/>
+        </w:tabs>
+        <w:ind w:left="6480" w:hanging="360"/>
+      </w:pPr>
+      <w:rPr>
+        <w:rFonts w:ascii="Wingdings" w:hAnsi="Wingdings" w:hint="default"/>
+        <w:sz w:val="20"/>
+      </w:rPr>
+    </w:lvl>
+  </w:abstractNum>
+  <w:abstractNum w:abstractNumId="4" w15:restartNumberingAfterBreak="0">
+    <w:nsid w:val="48AA658D"/>
+    <w:multiLevelType w:val="multilevel"/>
+    <w:tmpl w:val="303821CE"/>
+    <w:lvl w:ilvl="0">
+      <w:start w:val="1"/>
+      <w:numFmt w:val="bullet"/>
+      <w:lvlText w:val=""/>
+      <w:lvlJc w:val="left"/>
+      <w:pPr>
+        <w:tabs>
+          <w:tab w:val="num" w:pos="720"/>
+        </w:tabs>
+        <w:ind w:left="720" w:hanging="360"/>
+      </w:pPr>
+      <w:rPr>
+        <w:rFonts w:ascii="Symbol" w:hAnsi="Symbol" w:hint="default"/>
+        <w:sz w:val="20"/>
+      </w:rPr>
+    </w:lvl>
+    <w:lvl w:ilvl="1">
+      <w:start w:val="1"/>
+      <w:numFmt w:val="bullet"/>
+      <w:lvlText w:val="o"/>
+      <w:lvlJc w:val="left"/>
+      <w:pPr>
+        <w:tabs>
+          <w:tab w:val="num" w:pos="1440"/>
+        </w:tabs>
+        <w:ind w:left="1440" w:hanging="360"/>
+      </w:pPr>
+      <w:rPr>
+        <w:rFonts w:ascii="Courier New" w:hAnsi="Courier New" w:hint="default"/>
+        <w:sz w:val="20"/>
+      </w:rPr>
+    </w:lvl>
+    <w:lvl w:ilvl="2" w:tentative="1">
+      <w:start w:val="1"/>
+      <w:numFmt w:val="bullet"/>
+      <w:lvlText w:val=""/>
+      <w:lvlJc w:val="left"/>
+      <w:pPr>
+        <w:tabs>
+          <w:tab w:val="num" w:pos="2160"/>
+        </w:tabs>
+        <w:ind w:left="2160" w:hanging="360"/>
+      </w:pPr>
+      <w:rPr>
+        <w:rFonts w:ascii="Wingdings" w:hAnsi="Wingdings" w:hint="default"/>
+        <w:sz w:val="20"/>
+      </w:rPr>
+    </w:lvl>
+    <w:lvl w:ilvl="3" w:tentative="1">
+      <w:start w:val="1"/>
+      <w:numFmt w:val="bullet"/>
+      <w:lvlText w:val=""/>
+      <w:lvlJc w:val="left"/>
+      <w:pPr>
+        <w:tabs>
+          <w:tab w:val="num" w:pos="2880"/>
+        </w:tabs>
+        <w:ind w:left="2880" w:hanging="360"/>
+      </w:pPr>
+      <w:rPr>
+        <w:rFonts w:ascii="Wingdings" w:hAnsi="Wingdings" w:hint="default"/>
+        <w:sz w:val="20"/>
+      </w:rPr>
+    </w:lvl>
+    <w:lvl w:ilvl="4" w:tentative="1">
+      <w:start w:val="1"/>
+      <w:numFmt w:val="bullet"/>
+      <w:lvlText w:val=""/>
+      <w:lvlJc w:val="left"/>
+      <w:pPr>
+        <w:tabs>
+          <w:tab w:val="num" w:pos="3600"/>
+        </w:tabs>
+        <w:ind w:left="3600" w:hanging="360"/>
+      </w:pPr>
+      <w:rPr>
+        <w:rFonts w:ascii="Wingdings" w:hAnsi="Wingdings" w:hint="default"/>
+        <w:sz w:val="20"/>
+      </w:rPr>
+    </w:lvl>
+    <w:lvl w:ilvl="5" w:tentative="1">
+      <w:start w:val="1"/>
+      <w:numFmt w:val="bullet"/>
+      <w:lvlText w:val=""/>
+      <w:lvlJc w:val="left"/>
+      <w:pPr>
+        <w:tabs>
+          <w:tab w:val="num" w:pos="4320"/>
+        </w:tabs>
+        <w:ind w:left="4320" w:hanging="360"/>
+      </w:pPr>
+      <w:rPr>
+        <w:rFonts w:ascii="Wingdings" w:hAnsi="Wingdings" w:hint="default"/>
+        <w:sz w:val="20"/>
+      </w:rPr>
+    </w:lvl>
+    <w:lvl w:ilvl="6" w:tentative="1">
+      <w:start w:val="1"/>
+      <w:numFmt w:val="bullet"/>
+      <w:lvlText w:val=""/>
+      <w:lvlJc w:val="left"/>
+      <w:pPr>
+        <w:tabs>
+          <w:tab w:val="num" w:pos="5040"/>
+        </w:tabs>
+        <w:ind w:left="5040" w:hanging="360"/>
+      </w:pPr>
+      <w:rPr>
+        <w:rFonts w:ascii="Wingdings" w:hAnsi="Wingdings" w:hint="default"/>
+        <w:sz w:val="20"/>
+      </w:rPr>
+    </w:lvl>
+    <w:lvl w:ilvl="7" w:tentative="1">
+      <w:start w:val="1"/>
+      <w:numFmt w:val="bullet"/>
+      <w:lvlText w:val=""/>
+      <w:lvlJc w:val="left"/>
+      <w:pPr>
+        <w:tabs>
+          <w:tab w:val="num" w:pos="5760"/>
+        </w:tabs>
+        <w:ind w:left="5760" w:hanging="360"/>
+      </w:pPr>
+      <w:rPr>
+        <w:rFonts w:ascii="Wingdings" w:hAnsi="Wingdings" w:hint="default"/>
+        <w:sz w:val="20"/>
+      </w:rPr>
+    </w:lvl>
+    <w:lvl w:ilvl="8" w:tentative="1">
+      <w:start w:val="1"/>
+      <w:numFmt w:val="bullet"/>
+      <w:lvlText w:val=""/>
+      <w:lvlJc w:val="left"/>
+      <w:pPr>
+        <w:tabs>
+          <w:tab w:val="num" w:pos="6480"/>
+        </w:tabs>
+        <w:ind w:left="6480" w:hanging="360"/>
+      </w:pPr>
+      <w:rPr>
+        <w:rFonts w:ascii="Wingdings" w:hAnsi="Wingdings" w:hint="default"/>
+        <w:sz w:val="20"/>
+      </w:rPr>
+    </w:lvl>
+  </w:abstractNum>
+  <w:abstractNum w:abstractNumId="5" w15:restartNumberingAfterBreak="0">
     <w:nsid w:val="521B1C4D"/>
     <w:multiLevelType w:val="multilevel"/>
     <w:tmpl w:val="E43214B8"/>
@@ -1328,7 +2180,7 @@
       </w:pPr>
     </w:lvl>
   </w:abstractNum>
-  <w:abstractNum w:abstractNumId="3" w15:restartNumberingAfterBreak="0">
+  <w:abstractNum w:abstractNumId="6" w15:restartNumberingAfterBreak="0">
     <w:nsid w:val="560A0F3E"/>
     <w:multiLevelType w:val="multilevel"/>
     <w:tmpl w:val="BDB45386"/>
@@ -1441,7 +2293,7 @@
       </w:pPr>
     </w:lvl>
   </w:abstractNum>
-  <w:abstractNum w:abstractNumId="4" w15:restartNumberingAfterBreak="0">
+  <w:abstractNum w:abstractNumId="7" w15:restartNumberingAfterBreak="0">
     <w:nsid w:val="627328FD"/>
     <w:multiLevelType w:val="multilevel"/>
     <w:tmpl w:val="3314F8C2"/>
@@ -1590,7 +2442,7 @@
       </w:rPr>
     </w:lvl>
   </w:abstractNum>
-  <w:abstractNum w:abstractNumId="5" w15:restartNumberingAfterBreak="0">
+  <w:abstractNum w:abstractNumId="8" w15:restartNumberingAfterBreak="0">
     <w:nsid w:val="66686037"/>
     <w:multiLevelType w:val="multilevel"/>
     <w:tmpl w:val="BA249774"/>
@@ -1710,16 +2562,25 @@
     <w:abstractNumId w:val="0"/>
   </w:num>
   <w:num w:numId="3" w16cid:durableId="1627420682">
-    <w:abstractNumId w:val="3"/>
+    <w:abstractNumId w:val="6"/>
   </w:num>
   <w:num w:numId="4" w16cid:durableId="479231708">
+    <w:abstractNumId w:val="5"/>
+  </w:num>
+  <w:num w:numId="5" w16cid:durableId="1973367036">
+    <w:abstractNumId w:val="8"/>
+  </w:num>
+  <w:num w:numId="6" w16cid:durableId="1485465316">
+    <w:abstractNumId w:val="7"/>
+  </w:num>
+  <w:num w:numId="7" w16cid:durableId="277689442">
+    <w:abstractNumId w:val="4"/>
+  </w:num>
+  <w:num w:numId="8" w16cid:durableId="2016105192">
     <w:abstractNumId w:val="2"/>
   </w:num>
-  <w:num w:numId="5" w16cid:durableId="1973367036">
-    <w:abstractNumId w:val="5"/>
-  </w:num>
-  <w:num w:numId="6" w16cid:durableId="1485465316">
-    <w:abstractNumId w:val="4"/>
+  <w:num w:numId="9" w16cid:durableId="243103607">
+    <w:abstractNumId w:val="3"/>
   </w:num>
 </w:numbering>
 </file>

</xml_diff>

<commit_message>
Changes to documentation for ULIMES research
</commit_message>
<xml_diff>
--- a/Greedy Cup Molten Salt Reactor/GreedyCupConceptMSR.docx
+++ b/Greedy Cup Molten Salt Reactor/GreedyCupConceptMSR.docx
@@ -1597,6 +1597,3110 @@
         <w:t>heated fluid rises in the core, cools in heat exchangers, and descends. Intermediate heat exchangers transfer heat from fuel to coolant, then to a supercritical CO₂ or steam cycle for power generation.</w:t>
       </w:r>
     </w:p>
+    <w:p>
+      <w:pPr>
+        <w:rPr>
+          <w:b/>
+          <w:bCs/>
+        </w:rPr>
+      </w:pPr>
+      <w:r>
+        <w:rPr>
+          <w:b/>
+          <w:bCs/>
+        </w:rPr>
+        <w:t>Section 4: Heat Transfer Properties of Key Materials</w:t>
+      </w:r>
+    </w:p>
+    <w:p>
+      <w:r>
+        <w:t xml:space="preserve">Effective heat management is critical in this design, relying on natural circulation to drive fuel and coolant flows without pumps, reducing failure points. Heat conduction within materials (governed by thermal conductivity, </w:t>
+      </w:r>
+      <w:r>
+        <w:rPr>
+          <w:i/>
+          <w:iCs/>
+        </w:rPr>
+        <w:t>k</w:t>
+      </w:r>
+      <w:r>
+        <w:t xml:space="preserve">) and convection at interfaces (governed by the convective heat transfer coefficient, </w:t>
+      </w:r>
+      <w:r>
+        <w:rPr>
+          <w:i/>
+          <w:iCs/>
+        </w:rPr>
+        <w:t>h</w:t>
+      </w:r>
+      <w:r>
+        <w:t>) are detailed below for ULIMES fuel and lead coolant. Properties are based on literature correlations and estimates, as experimental data for ULIMES remains limited. Where applicable, temperature-dependent functions are provided for typical operating ranges (600–1000 K, aligning with core temperatures ~400–700°C). Convection coefficients are flow-dependent and estimated for natural circulation conditions in hexagonal channels (hydraulic diameter ~0.01–0.02 m, Rayleigh number Ra ~10^9–10^12 for natural convection dominance).</w:t>
+      </w:r>
+    </w:p>
+    <w:p>
+      <w:pPr>
+        <w:rPr>
+          <w:b/>
+          <w:bCs/>
+        </w:rPr>
+      </w:pPr>
+      <w:r>
+        <w:rPr>
+          <w:b/>
+          <w:bCs/>
+        </w:rPr>
+        <w:t xml:space="preserve">4.1 Heat Conduction Coefficients (Thermal Conductivity, </w:t>
+      </w:r>
+      <w:r>
+        <w:rPr>
+          <w:b/>
+          <w:bCs/>
+          <w:i/>
+          <w:iCs/>
+        </w:rPr>
+        <w:t>k</w:t>
+      </w:r>
+      <w:r>
+        <w:rPr>
+          <w:b/>
+          <w:bCs/>
+        </w:rPr>
+        <w:t>)</w:t>
+      </w:r>
+    </w:p>
+    <w:p>
+      <w:r>
+        <w:t>Thermal conductivity quantifies intrinsic heat conduction through the material. For ULIMES, it is enhanced compared to traditional sintered UO₂ pellets due to the liquid metal matrix suspending UO₂ particles, reducing thermal resistance.</w:t>
+      </w:r>
+    </w:p>
+    <w:p>
+      <w:pPr>
+        <w:numPr>
+          <w:ilvl w:val="0"/>
+          <w:numId w:val="12"/>
+        </w:numPr>
+      </w:pPr>
+      <w:r>
+        <w:rPr>
+          <w:b/>
+          <w:bCs/>
+        </w:rPr>
+        <w:lastRenderedPageBreak/>
+        <w:t>ULIMES (UO₂ in Pb-Sn Liquid Metal Suspension)</w:t>
+      </w:r>
+      <w:r>
+        <w:t>:</w:t>
+      </w:r>
+    </w:p>
+    <w:p>
+      <w:pPr>
+        <w:numPr>
+          <w:ilvl w:val="1"/>
+          <w:numId w:val="12"/>
+        </w:numPr>
+      </w:pPr>
+      <w:r>
+        <w:t xml:space="preserve">ULIMES uses </w:t>
+      </w:r>
+      <w:proofErr w:type="spellStart"/>
+      <w:r>
+        <w:t>unsintered</w:t>
+      </w:r>
+      <w:proofErr w:type="spellEnd"/>
+      <w:r>
+        <w:t xml:space="preserve"> UO₂ particles (13–25 </w:t>
+      </w:r>
+      <w:proofErr w:type="spellStart"/>
+      <w:r>
+        <w:t>wt</w:t>
+      </w:r>
+      <w:proofErr w:type="spellEnd"/>
+      <w:r>
+        <w:t xml:space="preserve">% UO₂, corresponding to volume fraction </w:t>
+      </w:r>
+      <w:proofErr w:type="spellStart"/>
+      <w:r>
+        <w:rPr>
+          <w:i/>
+          <w:iCs/>
+        </w:rPr>
+        <w:t>f_v</w:t>
+      </w:r>
+      <w:proofErr w:type="spellEnd"/>
+      <w:r>
+        <w:t xml:space="preserve"> ≈ 0.12–0.245) suspended in Pb-Sn alloy for improved conductivity over sintered UO₂ (~3–6 W/</w:t>
+      </w:r>
+      <w:proofErr w:type="spellStart"/>
+      <w:r>
+        <w:t>m·K</w:t>
+      </w:r>
+      <w:proofErr w:type="spellEnd"/>
+      <w:r>
+        <w:t xml:space="preserve"> at operating temperatures).</w:t>
+      </w:r>
+    </w:p>
+    <w:p>
+      <w:pPr>
+        <w:numPr>
+          <w:ilvl w:val="1"/>
+          <w:numId w:val="12"/>
+        </w:numPr>
+      </w:pPr>
+      <w:r>
+        <w:t>Effective thermal conductivity (</w:t>
+      </w:r>
+      <w:proofErr w:type="spellStart"/>
+      <w:r>
+        <w:rPr>
+          <w:i/>
+          <w:iCs/>
+        </w:rPr>
+        <w:t>k_eff</w:t>
+      </w:r>
+      <w:proofErr w:type="spellEnd"/>
+      <w:r>
+        <w:t>) is estimated using Hale's correlation for particle-matrix composites:</w:t>
+      </w:r>
+    </w:p>
+    <w:p>
+      <m:oMathPara>
+        <m:oMath>
+          <m:sSub>
+            <m:sSubPr>
+              <m:ctrlPr>
+                <w:rPr>
+                  <w:rFonts w:ascii="Cambria Math" w:hAnsi="Cambria Math"/>
+                </w:rPr>
+              </m:ctrlPr>
+            </m:sSubPr>
+            <m:e>
+              <m:r>
+                <w:rPr>
+                  <w:rFonts w:ascii="Cambria Math" w:hAnsi="Cambria Math"/>
+                </w:rPr>
+                <m:t>k</m:t>
+              </m:r>
+            </m:e>
+            <m:sub>
+              <m:r>
+                <m:rPr>
+                  <m:nor/>
+                </m:rPr>
+                <m:t>eff</m:t>
+              </m:r>
+            </m:sub>
+          </m:sSub>
+          <m:r>
+            <w:rPr>
+              <w:rFonts w:ascii="Cambria Math" w:hAnsi="Cambria Math"/>
+            </w:rPr>
+            <m:t>=</m:t>
+          </m:r>
+          <m:sSub>
+            <m:sSubPr>
+              <m:ctrlPr>
+                <w:rPr>
+                  <w:rFonts w:ascii="Cambria Math" w:hAnsi="Cambria Math"/>
+                </w:rPr>
+              </m:ctrlPr>
+            </m:sSubPr>
+            <m:e>
+              <m:r>
+                <w:rPr>
+                  <w:rFonts w:ascii="Cambria Math" w:hAnsi="Cambria Math"/>
+                </w:rPr>
+                <m:t>k</m:t>
+              </m:r>
+            </m:e>
+            <m:sub>
+              <m:r>
+                <m:rPr>
+                  <m:nor/>
+                </m:rPr>
+                <m:t>LM</m:t>
+              </m:r>
+            </m:sub>
+          </m:sSub>
+          <m:d>
+            <m:dPr>
+              <m:begChr m:val="["/>
+              <m:sepChr m:val="−"/>
+              <m:endChr m:val="]"/>
+              <m:ctrlPr>
+                <w:rPr>
+                  <w:rFonts w:ascii="Cambria Math" w:hAnsi="Cambria Math"/>
+                </w:rPr>
+              </m:ctrlPr>
+            </m:dPr>
+            <m:e>
+              <m:r>
+                <w:rPr>
+                  <w:rFonts w:ascii="Cambria Math" w:hAnsi="Cambria Math"/>
+                </w:rPr>
+                <m:t>1</m:t>
+              </m:r>
+            </m:e>
+            <m:e>
+              <m:r>
+                <w:rPr>
+                  <w:rFonts w:ascii="Cambria Math" w:hAnsi="Cambria Math"/>
+                </w:rPr>
+                <m:t>2</m:t>
+              </m:r>
+              <m:sSub>
+                <m:sSubPr>
+                  <m:ctrlPr>
+                    <w:rPr>
+                      <w:rFonts w:ascii="Cambria Math" w:hAnsi="Cambria Math"/>
+                    </w:rPr>
+                  </m:ctrlPr>
+                </m:sSubPr>
+                <m:e>
+                  <m:r>
+                    <w:rPr>
+                      <w:rFonts w:ascii="Cambria Math" w:hAnsi="Cambria Math"/>
+                    </w:rPr>
+                    <m:t>f</m:t>
+                  </m:r>
+                </m:e>
+                <m:sub>
+                  <m:r>
+                    <w:rPr>
+                      <w:rFonts w:ascii="Cambria Math" w:hAnsi="Cambria Math"/>
+                    </w:rPr>
+                    <m:t>v</m:t>
+                  </m:r>
+                </m:sub>
+              </m:sSub>
+              <m:f>
+                <m:fPr>
+                  <m:ctrlPr>
+                    <w:rPr>
+                      <w:rFonts w:ascii="Cambria Math" w:hAnsi="Cambria Math"/>
+                    </w:rPr>
+                  </m:ctrlPr>
+                </m:fPr>
+                <m:num>
+                  <m:r>
+                    <w:rPr>
+                      <w:rFonts w:ascii="Cambria Math" w:hAnsi="Cambria Math"/>
+                    </w:rPr>
+                    <m:t>1-</m:t>
+                  </m:r>
+                  <m:sSub>
+                    <m:sSubPr>
+                      <m:ctrlPr>
+                        <w:rPr>
+                          <w:rFonts w:ascii="Cambria Math" w:hAnsi="Cambria Math"/>
+                        </w:rPr>
+                      </m:ctrlPr>
+                    </m:sSubPr>
+                    <m:e>
+                      <m:r>
+                        <w:rPr>
+                          <w:rFonts w:ascii="Cambria Math" w:hAnsi="Cambria Math"/>
+                        </w:rPr>
+                        <m:t>k</m:t>
+                      </m:r>
+                    </m:e>
+                    <m:sub>
+                      <m:r>
+                        <m:rPr>
+                          <m:nor/>
+                        </m:rPr>
+                        <m:t>UO2</m:t>
+                      </m:r>
+                    </m:sub>
+                  </m:sSub>
+                  <m:r>
+                    <m:rPr>
+                      <m:sty m:val="p"/>
+                    </m:rPr>
+                    <w:rPr>
+                      <w:rFonts w:ascii="Cambria Math" w:hAnsi="Cambria Math"/>
+                    </w:rPr>
+                    <m:t>/</m:t>
+                  </m:r>
+                  <m:sSub>
+                    <m:sSubPr>
+                      <m:ctrlPr>
+                        <w:rPr>
+                          <w:rFonts w:ascii="Cambria Math" w:hAnsi="Cambria Math"/>
+                        </w:rPr>
+                      </m:ctrlPr>
+                    </m:sSubPr>
+                    <m:e>
+                      <m:r>
+                        <w:rPr>
+                          <w:rFonts w:ascii="Cambria Math" w:hAnsi="Cambria Math"/>
+                        </w:rPr>
+                        <m:t>k</m:t>
+                      </m:r>
+                    </m:e>
+                    <m:sub>
+                      <m:r>
+                        <m:rPr>
+                          <m:nor/>
+                        </m:rPr>
+                        <m:t>LM</m:t>
+                      </m:r>
+                    </m:sub>
+                  </m:sSub>
+                </m:num>
+                <m:den>
+                  <m:r>
+                    <w:rPr>
+                      <w:rFonts w:ascii="Cambria Math" w:hAnsi="Cambria Math"/>
+                    </w:rPr>
+                    <m:t>2+</m:t>
+                  </m:r>
+                  <m:sSub>
+                    <m:sSubPr>
+                      <m:ctrlPr>
+                        <w:rPr>
+                          <w:rFonts w:ascii="Cambria Math" w:hAnsi="Cambria Math"/>
+                        </w:rPr>
+                      </m:ctrlPr>
+                    </m:sSubPr>
+                    <m:e>
+                      <m:r>
+                        <w:rPr>
+                          <w:rFonts w:ascii="Cambria Math" w:hAnsi="Cambria Math"/>
+                        </w:rPr>
+                        <m:t>f</m:t>
+                      </m:r>
+                    </m:e>
+                    <m:sub>
+                      <m:r>
+                        <w:rPr>
+                          <w:rFonts w:ascii="Cambria Math" w:hAnsi="Cambria Math"/>
+                        </w:rPr>
+                        <m:t>v</m:t>
+                      </m:r>
+                    </m:sub>
+                  </m:sSub>
+                  <m:r>
+                    <w:rPr>
+                      <w:rFonts w:ascii="Cambria Math" w:hAnsi="Cambria Math"/>
+                    </w:rPr>
+                    <m:t>(1-</m:t>
+                  </m:r>
+                  <m:sSub>
+                    <m:sSubPr>
+                      <m:ctrlPr>
+                        <w:rPr>
+                          <w:rFonts w:ascii="Cambria Math" w:hAnsi="Cambria Math"/>
+                        </w:rPr>
+                      </m:ctrlPr>
+                    </m:sSubPr>
+                    <m:e>
+                      <m:r>
+                        <w:rPr>
+                          <w:rFonts w:ascii="Cambria Math" w:hAnsi="Cambria Math"/>
+                        </w:rPr>
+                        <m:t>k</m:t>
+                      </m:r>
+                    </m:e>
+                    <m:sub>
+                      <m:r>
+                        <m:rPr>
+                          <m:nor/>
+                        </m:rPr>
+                        <m:t>UO2</m:t>
+                      </m:r>
+                    </m:sub>
+                  </m:sSub>
+                  <m:r>
+                    <m:rPr>
+                      <m:sty m:val="p"/>
+                    </m:rPr>
+                    <w:rPr>
+                      <w:rFonts w:ascii="Cambria Math" w:hAnsi="Cambria Math"/>
+                    </w:rPr>
+                    <m:t>/</m:t>
+                  </m:r>
+                  <m:sSub>
+                    <m:sSubPr>
+                      <m:ctrlPr>
+                        <w:rPr>
+                          <w:rFonts w:ascii="Cambria Math" w:hAnsi="Cambria Math"/>
+                        </w:rPr>
+                      </m:ctrlPr>
+                    </m:sSubPr>
+                    <m:e>
+                      <m:r>
+                        <w:rPr>
+                          <w:rFonts w:ascii="Cambria Math" w:hAnsi="Cambria Math"/>
+                        </w:rPr>
+                        <m:t>k</m:t>
+                      </m:r>
+                    </m:e>
+                    <m:sub>
+                      <m:r>
+                        <m:rPr>
+                          <m:nor/>
+                        </m:rPr>
+                        <m:t>LM</m:t>
+                      </m:r>
+                    </m:sub>
+                  </m:sSub>
+                  <m:r>
+                    <w:rPr>
+                      <w:rFonts w:ascii="Cambria Math" w:hAnsi="Cambria Math"/>
+                    </w:rPr>
+                    <m:t>)</m:t>
+                  </m:r>
+                </m:den>
+              </m:f>
+            </m:e>
+          </m:d>
+          <m:r>
+            <m:rPr>
+              <m:sty m:val="p"/>
+            </m:rPr>
+            <w:br/>
+          </m:r>
+        </m:oMath>
+      </m:oMathPara>
+    </w:p>
+    <w:p>
+      <w:r>
+        <w:t xml:space="preserve">where </w:t>
+      </w:r>
+      <w:proofErr w:type="spellStart"/>
+      <w:r>
+        <w:rPr>
+          <w:i/>
+          <w:iCs/>
+        </w:rPr>
+        <w:t>k_LM</w:t>
+      </w:r>
+      <w:proofErr w:type="spellEnd"/>
+      <w:r>
+        <w:t xml:space="preserve"> is the liquid metal conductivity, </w:t>
+      </w:r>
+      <w:r>
+        <w:rPr>
+          <w:i/>
+          <w:iCs/>
+        </w:rPr>
+        <w:t>k_UO2</w:t>
+      </w:r>
+      <w:r>
+        <w:t xml:space="preserve"> is UO₂ conductivity, and </w:t>
+      </w:r>
+      <w:proofErr w:type="spellStart"/>
+      <w:r>
+        <w:rPr>
+          <w:i/>
+          <w:iCs/>
+        </w:rPr>
+        <w:t>f_v</w:t>
+      </w:r>
+      <w:proofErr w:type="spellEnd"/>
+      <w:r>
+        <w:t xml:space="preserve"> is the UO₂ volume fraction.</w:t>
+      </w:r>
+    </w:p>
+    <w:p>
+      <w:pPr>
+        <w:numPr>
+          <w:ilvl w:val="1"/>
+          <w:numId w:val="12"/>
+        </w:numPr>
+      </w:pPr>
+      <w:r>
+        <w:t>Component correlations:</w:t>
+      </w:r>
+    </w:p>
+    <w:p>
+      <w:pPr>
+        <w:numPr>
+          <w:ilvl w:val="2"/>
+          <w:numId w:val="12"/>
+        </w:numPr>
+      </w:pPr>
+      <w:r>
+        <w:t xml:space="preserve">UO₂: </w:t>
+      </w:r>
+      <m:oMath>
+        <m:sSub>
+          <m:sSubPr>
+            <m:ctrlPr>
+              <w:rPr>
+                <w:rFonts w:ascii="Cambria Math" w:hAnsi="Cambria Math"/>
+              </w:rPr>
+            </m:ctrlPr>
+          </m:sSubPr>
+          <m:e>
+            <m:r>
+              <w:rPr>
+                <w:rFonts w:ascii="Cambria Math" w:hAnsi="Cambria Math"/>
+              </w:rPr>
+              <m:t>k</m:t>
+            </m:r>
+          </m:e>
+          <m:sub>
+            <m:r>
+              <m:rPr>
+                <m:nor/>
+              </m:rPr>
+              <m:t>UO2</m:t>
+            </m:r>
+          </m:sub>
+        </m:sSub>
+        <m:r>
+          <w:rPr>
+            <w:rFonts w:ascii="Cambria Math" w:hAnsi="Cambria Math"/>
+          </w:rPr>
+          <m:t>=(0.0375+2.165×</m:t>
+        </m:r>
+        <m:sSup>
+          <m:sSupPr>
+            <m:ctrlPr>
+              <w:rPr>
+                <w:rFonts w:ascii="Cambria Math" w:hAnsi="Cambria Math"/>
+              </w:rPr>
+            </m:ctrlPr>
+          </m:sSupPr>
+          <m:e>
+            <m:r>
+              <w:rPr>
+                <w:rFonts w:ascii="Cambria Math" w:hAnsi="Cambria Math"/>
+              </w:rPr>
+              <m:t>10</m:t>
+            </m:r>
+          </m:e>
+          <m:sup>
+            <m:r>
+              <w:rPr>
+                <w:rFonts w:ascii="Cambria Math" w:hAnsi="Cambria Math"/>
+              </w:rPr>
+              <m:t>-4</m:t>
+            </m:r>
+          </m:sup>
+        </m:sSup>
+        <m:r>
+          <w:rPr>
+            <w:rFonts w:ascii="Cambria Math" w:hAnsi="Cambria Math"/>
+          </w:rPr>
+          <m:t>T</m:t>
+        </m:r>
+        <m:sSup>
+          <m:sSupPr>
+            <m:ctrlPr>
+              <w:rPr>
+                <w:rFonts w:ascii="Cambria Math" w:hAnsi="Cambria Math"/>
+              </w:rPr>
+            </m:ctrlPr>
+          </m:sSupPr>
+          <m:e>
+            <m:r>
+              <w:rPr>
+                <w:rFonts w:ascii="Cambria Math" w:hAnsi="Cambria Math"/>
+              </w:rPr>
+              <m:t>)</m:t>
+            </m:r>
+          </m:e>
+          <m:sup>
+            <m:r>
+              <w:rPr>
+                <w:rFonts w:ascii="Cambria Math" w:hAnsi="Cambria Math"/>
+              </w:rPr>
+              <m:t>-1</m:t>
+            </m:r>
+          </m:sup>
+        </m:sSup>
+        <m:r>
+          <w:rPr>
+            <w:rFonts w:ascii="Cambria Math" w:hAnsi="Cambria Math"/>
+          </w:rPr>
+          <m:t>+4.715×</m:t>
+        </m:r>
+        <m:sSup>
+          <m:sSupPr>
+            <m:ctrlPr>
+              <w:rPr>
+                <w:rFonts w:ascii="Cambria Math" w:hAnsi="Cambria Math"/>
+              </w:rPr>
+            </m:ctrlPr>
+          </m:sSupPr>
+          <m:e>
+            <m:r>
+              <w:rPr>
+                <w:rFonts w:ascii="Cambria Math" w:hAnsi="Cambria Math"/>
+              </w:rPr>
+              <m:t>10</m:t>
+            </m:r>
+          </m:e>
+          <m:sup>
+            <m:r>
+              <w:rPr>
+                <w:rFonts w:ascii="Cambria Math" w:hAnsi="Cambria Math"/>
+              </w:rPr>
+              <m:t>9</m:t>
+            </m:r>
+          </m:sup>
+        </m:sSup>
+        <m:sSup>
+          <m:sSupPr>
+            <m:ctrlPr>
+              <w:rPr>
+                <w:rFonts w:ascii="Cambria Math" w:hAnsi="Cambria Math"/>
+              </w:rPr>
+            </m:ctrlPr>
+          </m:sSupPr>
+          <m:e>
+            <m:r>
+              <w:rPr>
+                <w:rFonts w:ascii="Cambria Math" w:hAnsi="Cambria Math"/>
+              </w:rPr>
+              <m:t>T</m:t>
+            </m:r>
+          </m:e>
+          <m:sup>
+            <m:r>
+              <w:rPr>
+                <w:rFonts w:ascii="Cambria Math" w:hAnsi="Cambria Math"/>
+              </w:rPr>
+              <m:t>-5</m:t>
+            </m:r>
+            <m:r>
+              <m:rPr>
+                <m:sty m:val="p"/>
+              </m:rPr>
+              <w:rPr>
+                <w:rFonts w:ascii="Cambria Math" w:hAnsi="Cambria Math"/>
+              </w:rPr>
+              <m:t>/</m:t>
+            </m:r>
+            <m:r>
+              <w:rPr>
+                <w:rFonts w:ascii="Cambria Math" w:hAnsi="Cambria Math"/>
+              </w:rPr>
+              <m:t>2</m:t>
+            </m:r>
+          </m:sup>
+        </m:sSup>
+        <m:r>
+          <m:rPr>
+            <m:sty m:val="p"/>
+          </m:rPr>
+          <w:rPr>
+            <w:rFonts w:ascii="Cambria Math" w:hAnsi="Cambria Math"/>
+          </w:rPr>
+          <m:t>exp</m:t>
+        </m:r>
+        <m:r>
+          <w:rPr>
+            <w:rFonts w:ascii="Cambria Math" w:hAnsi="Cambria Math"/>
+          </w:rPr>
+          <m:t>⁡</m:t>
+        </m:r>
+        <m:d>
+          <m:dPr>
+            <m:sepChr m:val="−"/>
+            <m:ctrlPr>
+              <w:rPr>
+                <w:rFonts w:ascii="Cambria Math" w:hAnsi="Cambria Math"/>
+              </w:rPr>
+            </m:ctrlPr>
+          </m:dPr>
+          <m:e/>
+          <m:e>
+            <m:f>
+              <m:fPr>
+                <m:ctrlPr>
+                  <w:rPr>
+                    <w:rFonts w:ascii="Cambria Math" w:hAnsi="Cambria Math"/>
+                  </w:rPr>
+                </m:ctrlPr>
+              </m:fPr>
+              <m:num>
+                <m:r>
+                  <w:rPr>
+                    <w:rFonts w:ascii="Cambria Math" w:hAnsi="Cambria Math"/>
+                  </w:rPr>
+                  <m:t>16363</m:t>
+                </m:r>
+              </m:num>
+              <m:den>
+                <m:r>
+                  <w:rPr>
+                    <w:rFonts w:ascii="Cambria Math" w:hAnsi="Cambria Math"/>
+                  </w:rPr>
+                  <m:t>T</m:t>
+                </m:r>
+              </m:den>
+            </m:f>
+          </m:e>
+        </m:d>
+      </m:oMath>
+      <w:r>
+        <w:t>W/m·K (T in K). Approximate values: 6.0 W/m·K at 600 K, 4.5 W/m·K at 800 K, 3.5 W/m·K at 1000 K.</w:t>
+      </w:r>
+    </w:p>
+    <w:p>
+      <w:pPr>
+        <w:numPr>
+          <w:ilvl w:val="2"/>
+          <w:numId w:val="12"/>
+        </w:numPr>
+      </w:pPr>
+      <w:r>
+        <w:t xml:space="preserve">Pb-Sn LM: </w:t>
+      </w:r>
+      <m:oMath>
+        <m:sSub>
+          <m:sSubPr>
+            <m:ctrlPr>
+              <w:rPr>
+                <w:rFonts w:ascii="Cambria Math" w:hAnsi="Cambria Math"/>
+              </w:rPr>
+            </m:ctrlPr>
+          </m:sSubPr>
+          <m:e>
+            <m:r>
+              <w:rPr>
+                <w:rFonts w:ascii="Cambria Math" w:hAnsi="Cambria Math"/>
+              </w:rPr>
+              <m:t>k</m:t>
+            </m:r>
+          </m:e>
+          <m:sub>
+            <m:r>
+              <m:rPr>
+                <m:nor/>
+              </m:rPr>
+              <m:t>Pb-Sn</m:t>
+            </m:r>
+          </m:sub>
+        </m:sSub>
+        <m:r>
+          <w:rPr>
+            <w:rFonts w:ascii="Cambria Math" w:hAnsi="Cambria Math"/>
+          </w:rPr>
+          <m:t>=3.5887+0.0373T</m:t>
+        </m:r>
+      </m:oMath>
+      <w:r>
+        <w:t>W/m·K (T in K). Values: ~22 W/m·K at 493 K, ~29 W/m·K at 700 K, ~33 W/m·K at 788 K.</w:t>
+      </w:r>
+    </w:p>
+    <w:p>
+      <w:pPr>
+        <w:numPr>
+          <w:ilvl w:val="1"/>
+          <w:numId w:val="12"/>
+        </w:numPr>
+      </w:pPr>
+      <w:r>
+        <w:t xml:space="preserve">Estimated </w:t>
+      </w:r>
+      <w:proofErr w:type="spellStart"/>
+      <w:r>
+        <w:rPr>
+          <w:i/>
+          <w:iCs/>
+        </w:rPr>
+        <w:t>k_eff</w:t>
+      </w:r>
+      <w:proofErr w:type="spellEnd"/>
+      <w:r>
+        <w:t xml:space="preserve"> for 25 </w:t>
+      </w:r>
+      <w:proofErr w:type="spellStart"/>
+      <w:r>
+        <w:t>wt</w:t>
+      </w:r>
+      <w:proofErr w:type="spellEnd"/>
+      <w:r>
+        <w:t>% UO₂ (</w:t>
+      </w:r>
+      <w:proofErr w:type="spellStart"/>
+      <w:r>
+        <w:rPr>
+          <w:i/>
+          <w:iCs/>
+        </w:rPr>
+        <w:t>f_v</w:t>
+      </w:r>
+      <w:proofErr w:type="spellEnd"/>
+      <w:r>
+        <w:t xml:space="preserve"> ≈ 0.245):</w:t>
+      </w:r>
+    </w:p>
+    <w:p>
+      <w:pPr>
+        <w:numPr>
+          <w:ilvl w:val="2"/>
+          <w:numId w:val="12"/>
+        </w:numPr>
+      </w:pPr>
+      <w:r>
+        <w:t>At 600 K: ~15–18 W/</w:t>
+      </w:r>
+      <w:proofErr w:type="spellStart"/>
+      <w:r>
+        <w:t>m·K</w:t>
+      </w:r>
+      <w:proofErr w:type="spellEnd"/>
+      <w:r>
+        <w:t xml:space="preserve"> (2–3× higher than UO₂).</w:t>
+      </w:r>
+    </w:p>
+    <w:p>
+      <w:pPr>
+        <w:numPr>
+          <w:ilvl w:val="2"/>
+          <w:numId w:val="12"/>
+        </w:numPr>
+      </w:pPr>
+      <w:r>
+        <w:t>At 800 K: ~20–24 W/</w:t>
+      </w:r>
+      <w:proofErr w:type="spellStart"/>
+      <w:r>
+        <w:t>m·K</w:t>
+      </w:r>
+      <w:proofErr w:type="spellEnd"/>
+      <w:r>
+        <w:t>.</w:t>
+      </w:r>
+    </w:p>
+    <w:p>
+      <w:pPr>
+        <w:numPr>
+          <w:ilvl w:val="2"/>
+          <w:numId w:val="12"/>
+        </w:numPr>
+      </w:pPr>
+      <w:r>
+        <w:t>At 1000 K: ~24–28 W/</w:t>
+      </w:r>
+      <w:proofErr w:type="spellStart"/>
+      <w:r>
+        <w:t>m·K</w:t>
+      </w:r>
+      <w:proofErr w:type="spellEnd"/>
+      <w:r>
+        <w:t>.</w:t>
+      </w:r>
+    </w:p>
+    <w:p>
+      <w:pPr>
+        <w:numPr>
+          <w:ilvl w:val="1"/>
+          <w:numId w:val="12"/>
+        </w:numPr>
+      </w:pPr>
+      <w:r>
+        <w:t xml:space="preserve">For lower 13 </w:t>
+      </w:r>
+      <w:proofErr w:type="spellStart"/>
+      <w:r>
+        <w:t>wt</w:t>
+      </w:r>
+      <w:proofErr w:type="spellEnd"/>
+      <w:r>
+        <w:t>% UO₂ (</w:t>
+      </w:r>
+      <w:proofErr w:type="spellStart"/>
+      <w:r>
+        <w:rPr>
+          <w:i/>
+          <w:iCs/>
+        </w:rPr>
+        <w:t>f_v</w:t>
+      </w:r>
+      <w:proofErr w:type="spellEnd"/>
+      <w:r>
+        <w:t xml:space="preserve"> ≈ 0.12): </w:t>
+      </w:r>
+      <w:proofErr w:type="spellStart"/>
+      <w:r>
+        <w:rPr>
+          <w:i/>
+          <w:iCs/>
+        </w:rPr>
+        <w:t>k_eff</w:t>
+      </w:r>
+      <w:proofErr w:type="spellEnd"/>
+      <w:r>
+        <w:t xml:space="preserve"> approaches </w:t>
+      </w:r>
+      <w:proofErr w:type="spellStart"/>
+      <w:r>
+        <w:rPr>
+          <w:i/>
+          <w:iCs/>
+        </w:rPr>
+        <w:t>k_LM</w:t>
+      </w:r>
+      <w:proofErr w:type="spellEnd"/>
+      <w:r>
+        <w:t xml:space="preserve"> (~80–90% of LM value), yielding 20–30 W/</w:t>
+      </w:r>
+      <w:proofErr w:type="spellStart"/>
+      <w:r>
+        <w:t>m·K</w:t>
+      </w:r>
+      <w:proofErr w:type="spellEnd"/>
+      <w:r>
+        <w:t xml:space="preserve"> across the range. This enhances passive cooling in the greedy cup drain scenario by reducing peak fuel temperatures (~515°C simulated vs. ~1400°C in conventional LWRs).</w:t>
+      </w:r>
+    </w:p>
+    <w:p>
+      <w:pPr>
+        <w:numPr>
+          <w:ilvl w:val="1"/>
+          <w:numId w:val="12"/>
+        </w:numPr>
+      </w:pPr>
+      <w:r>
+        <w:t>Note: Actual values depend on particle size/distribution and require experimental validation; Bi-Pb-Sn alloy properties are unknown but expected similar.</w:t>
+      </w:r>
+    </w:p>
+    <w:p>
+      <w:pPr>
+        <w:numPr>
+          <w:ilvl w:val="0"/>
+          <w:numId w:val="12"/>
+        </w:numPr>
+      </w:pPr>
+      <w:r>
+        <w:rPr>
+          <w:b/>
+          <w:bCs/>
+        </w:rPr>
+        <w:t>Lead Coolant (Pure Liquid Lead)</w:t>
+      </w:r>
+      <w:r>
+        <w:t>:</w:t>
+      </w:r>
+    </w:p>
+    <w:p>
+      <w:pPr>
+        <w:numPr>
+          <w:ilvl w:val="1"/>
+          <w:numId w:val="12"/>
+        </w:numPr>
+      </w:pPr>
+      <w:r>
+        <w:t xml:space="preserve">Correlation: </w:t>
+      </w:r>
+      <m:oMath>
+        <m:sSub>
+          <m:sSubPr>
+            <m:ctrlPr>
+              <w:rPr>
+                <w:rFonts w:ascii="Cambria Math" w:hAnsi="Cambria Math"/>
+              </w:rPr>
+            </m:ctrlPr>
+          </m:sSubPr>
+          <m:e>
+            <m:r>
+              <w:rPr>
+                <w:rFonts w:ascii="Cambria Math" w:hAnsi="Cambria Math"/>
+              </w:rPr>
+              <m:t>k</m:t>
+            </m:r>
+          </m:e>
+          <m:sub>
+            <m:r>
+              <m:rPr>
+                <m:nor/>
+              </m:rPr>
+              <m:t>Pb</m:t>
+            </m:r>
+          </m:sub>
+        </m:sSub>
+        <m:r>
+          <w:rPr>
+            <w:rFonts w:ascii="Cambria Math" w:hAnsi="Cambria Math"/>
+          </w:rPr>
+          <m:t>=9.2+0.011T</m:t>
+        </m:r>
+      </m:oMath>
+      <w:r>
+        <w:t>W/m·K (T in K, valid from melting point ~600 K to 1300 K).</w:t>
+      </w:r>
+    </w:p>
+    <w:p>
+      <w:pPr>
+        <w:numPr>
+          <w:ilvl w:val="1"/>
+          <w:numId w:val="12"/>
+        </w:numPr>
+      </w:pPr>
+      <w:r>
+        <w:lastRenderedPageBreak/>
+        <w:t>Values:</w:t>
+      </w:r>
+    </w:p>
+    <w:p>
+      <w:pPr>
+        <w:numPr>
+          <w:ilvl w:val="2"/>
+          <w:numId w:val="12"/>
+        </w:numPr>
+      </w:pPr>
+      <w:r>
+        <w:t>At 600 K: 15.8 W/</w:t>
+      </w:r>
+      <w:proofErr w:type="spellStart"/>
+      <w:r>
+        <w:t>m·K</w:t>
+      </w:r>
+      <w:proofErr w:type="spellEnd"/>
+      <w:r>
+        <w:t>.</w:t>
+      </w:r>
+    </w:p>
+    <w:p>
+      <w:pPr>
+        <w:numPr>
+          <w:ilvl w:val="2"/>
+          <w:numId w:val="12"/>
+        </w:numPr>
+      </w:pPr>
+      <w:r>
+        <w:t>At 800 K: 18.0 W/</w:t>
+      </w:r>
+      <w:proofErr w:type="spellStart"/>
+      <w:r>
+        <w:t>m·K</w:t>
+      </w:r>
+      <w:proofErr w:type="spellEnd"/>
+      <w:r>
+        <w:t>.</w:t>
+      </w:r>
+    </w:p>
+    <w:p>
+      <w:pPr>
+        <w:numPr>
+          <w:ilvl w:val="2"/>
+          <w:numId w:val="12"/>
+        </w:numPr>
+      </w:pPr>
+      <w:r>
+        <w:t>At 1000 K: 20.2 W/</w:t>
+      </w:r>
+      <w:proofErr w:type="spellStart"/>
+      <w:r>
+        <w:t>m·K</w:t>
+      </w:r>
+      <w:proofErr w:type="spellEnd"/>
+      <w:r>
+        <w:t>.</w:t>
+      </w:r>
+    </w:p>
+    <w:p>
+      <w:pPr>
+        <w:numPr>
+          <w:ilvl w:val="1"/>
+          <w:numId w:val="12"/>
+        </w:numPr>
+      </w:pPr>
+      <w:r>
+        <w:t>Increases linearly with temperature (~14% from 600 K to 773 K). For lead-bismuth eutectic (LBE, alternative coolant): Similar, ~10–15 W/</w:t>
+      </w:r>
+      <w:proofErr w:type="spellStart"/>
+      <w:r>
+        <w:t>m·K</w:t>
+      </w:r>
+      <w:proofErr w:type="spellEnd"/>
+      <w:r>
+        <w:t>, but with slight Prandtl number differences affecting convection.</w:t>
+      </w:r>
+    </w:p>
+    <w:p>
+      <w:pPr>
+        <w:rPr>
+          <w:b/>
+          <w:bCs/>
+        </w:rPr>
+      </w:pPr>
+      <w:r>
+        <w:rPr>
+          <w:b/>
+          <w:bCs/>
+        </w:rPr>
+        <w:t>4.2 Heat Convection Coefficients (</w:t>
+      </w:r>
+      <w:r>
+        <w:rPr>
+          <w:b/>
+          <w:bCs/>
+          <w:i/>
+          <w:iCs/>
+        </w:rPr>
+        <w:t>h</w:t>
+      </w:r>
+      <w:r>
+        <w:rPr>
+          <w:b/>
+          <w:bCs/>
+        </w:rPr>
+        <w:t>)</w:t>
+      </w:r>
+    </w:p>
+    <w:p>
+      <w:r>
+        <w:t xml:space="preserve">The convective heat transfer coefficient describes heat transfer from solid surfaces to flowing fluids. In this natural circulation design, </w:t>
+      </w:r>
+      <w:r>
+        <w:rPr>
+          <w:i/>
+          <w:iCs/>
+        </w:rPr>
+        <w:t>h</w:t>
+      </w:r>
+      <w:r>
+        <w:t xml:space="preserve"> is lower than in forced convection systems but sufficient for passive operation. Values are estimated using Nusselt number (Nu) correlations: </w:t>
+      </w:r>
+      <w:r>
+        <w:rPr>
+          <w:i/>
+          <w:iCs/>
+        </w:rPr>
+        <w:t xml:space="preserve">h = Nu · k / </w:t>
+      </w:r>
+      <w:proofErr w:type="spellStart"/>
+      <w:r>
+        <w:rPr>
+          <w:i/>
+          <w:iCs/>
+        </w:rPr>
+        <w:t>D_e</w:t>
+      </w:r>
+      <w:proofErr w:type="spellEnd"/>
+      <w:r>
+        <w:t xml:space="preserve">, where </w:t>
+      </w:r>
+      <w:proofErr w:type="spellStart"/>
+      <w:r>
+        <w:rPr>
+          <w:i/>
+          <w:iCs/>
+        </w:rPr>
+        <w:t>D_e</w:t>
+      </w:r>
+      <w:proofErr w:type="spellEnd"/>
+      <w:r>
+        <w:t xml:space="preserve"> is hydraulic diameter (~0.01 m for hexagonal channels), and Nu depends on Rayleigh (Ra) or Peclet (Pe) numbers. For liquid metals (low </w:t>
+      </w:r>
+      <w:proofErr w:type="spellStart"/>
+      <w:r>
+        <w:t>Pr</w:t>
+      </w:r>
+      <w:proofErr w:type="spellEnd"/>
+      <w:r>
+        <w:t xml:space="preserve"> ~0.02), molecular conduction dominates over momentum transfer.</w:t>
+      </w:r>
+    </w:p>
+    <w:p>
+      <w:pPr>
+        <w:numPr>
+          <w:ilvl w:val="0"/>
+          <w:numId w:val="13"/>
+        </w:numPr>
+      </w:pPr>
+      <w:r>
+        <w:rPr>
+          <w:b/>
+          <w:bCs/>
+        </w:rPr>
+        <w:t>ULIMES Fuel Loop (Natural Circulation in Hexagonal Channels)</w:t>
+      </w:r>
+      <w:r>
+        <w:t>:</w:t>
+      </w:r>
+    </w:p>
+    <w:p>
+      <w:pPr>
+        <w:numPr>
+          <w:ilvl w:val="1"/>
+          <w:numId w:val="13"/>
+        </w:numPr>
+      </w:pPr>
+      <w:r>
+        <w:t>Flow is buoyancy-driven in the epithermal/blanket regions; assume Ra ~10^10–10^12, Pe ~100–500.</w:t>
+      </w:r>
+    </w:p>
+    <w:p>
+      <w:pPr>
+        <w:numPr>
+          <w:ilvl w:val="1"/>
+          <w:numId w:val="13"/>
+        </w:numPr>
+      </w:pPr>
+      <w:r>
+        <w:t xml:space="preserve">Correlation for natural convection in vertical channels (low </w:t>
+      </w:r>
+      <w:proofErr w:type="spellStart"/>
+      <w:r>
+        <w:t>Pr</w:t>
+      </w:r>
+      <w:proofErr w:type="spellEnd"/>
+      <w:r>
+        <w:t xml:space="preserve"> fluids): Modified Churchill-Chu: Nu = [0.825 + 0.387 Ra</w:t>
+      </w:r>
+      <w:proofErr w:type="gramStart"/>
+      <w:r>
+        <w:t>^{</w:t>
+      </w:r>
+      <w:proofErr w:type="gramEnd"/>
+      <w:r>
+        <w:t>1/</w:t>
+      </w:r>
+      <w:proofErr w:type="gramStart"/>
+      <w:r>
+        <w:t>6} /</w:t>
+      </w:r>
+      <w:proofErr w:type="gramEnd"/>
+      <w:r>
+        <w:t xml:space="preserve"> (1 + (0.492/</w:t>
+      </w:r>
+      <w:proofErr w:type="spellStart"/>
+      <w:proofErr w:type="gramStart"/>
+      <w:r>
+        <w:t>Pr</w:t>
+      </w:r>
+      <w:proofErr w:type="spellEnd"/>
+      <w:r>
+        <w:t>)^</w:t>
+      </w:r>
+      <w:proofErr w:type="gramEnd"/>
+      <w:r>
+        <w:t>{9/16</w:t>
+      </w:r>
+      <w:proofErr w:type="gramStart"/>
+      <w:r>
+        <w:t>})^</w:t>
+      </w:r>
+      <w:proofErr w:type="gramEnd"/>
+      <w:r>
+        <w:t>{8/27</w:t>
+      </w:r>
+      <w:proofErr w:type="gramStart"/>
+      <w:r>
+        <w:t>}]^</w:t>
+      </w:r>
+      <w:proofErr w:type="gramEnd"/>
+      <w:r>
+        <w:t>2.</w:t>
+      </w:r>
+    </w:p>
+    <w:p>
+      <w:pPr>
+        <w:numPr>
+          <w:ilvl w:val="1"/>
+          <w:numId w:val="13"/>
+        </w:numPr>
+      </w:pPr>
+      <w:r>
+        <w:t xml:space="preserve">Typical </w:t>
+      </w:r>
+      <w:r>
+        <w:rPr>
+          <w:i/>
+          <w:iCs/>
+        </w:rPr>
+        <w:t>h</w:t>
+      </w:r>
+      <w:r>
+        <w:t xml:space="preserve"> (using </w:t>
+      </w:r>
+      <w:proofErr w:type="spellStart"/>
+      <w:r>
+        <w:rPr>
+          <w:i/>
+          <w:iCs/>
+        </w:rPr>
+        <w:t>k_eff</w:t>
+      </w:r>
+      <w:proofErr w:type="spellEnd"/>
+      <w:r>
+        <w:t xml:space="preserve"> ~20 W/</w:t>
+      </w:r>
+      <w:proofErr w:type="spellStart"/>
+      <w:r>
+        <w:t>m·K</w:t>
+      </w:r>
+      <w:proofErr w:type="spellEnd"/>
+      <w:r>
+        <w:t>):</w:t>
+      </w:r>
+    </w:p>
+    <w:p>
+      <w:pPr>
+        <w:numPr>
+          <w:ilvl w:val="2"/>
+          <w:numId w:val="13"/>
+        </w:numPr>
+      </w:pPr>
+      <w:r>
+        <w:t>At 700 K, low flow (~0.1–0.5 m/s): 500–2000 W/m²·K (sideward heat transfer along moderator walls).</w:t>
+      </w:r>
+    </w:p>
+    <w:p>
+      <w:pPr>
+        <w:numPr>
+          <w:ilvl w:val="2"/>
+          <w:numId w:val="13"/>
+        </w:numPr>
+      </w:pPr>
+      <w:r>
+        <w:t>Rayleigh-Benard (upward/downward in greedy cup): Nu ≈ 0.069 Ra</w:t>
+      </w:r>
+      <w:proofErr w:type="gramStart"/>
+      <w:r>
+        <w:t>^{</w:t>
+      </w:r>
+      <w:proofErr w:type="gramEnd"/>
+      <w:r>
+        <w:t xml:space="preserve">0.333} </w:t>
+      </w:r>
+      <w:proofErr w:type="spellStart"/>
+      <w:r>
+        <w:t>Pr</w:t>
+      </w:r>
+      <w:proofErr w:type="spellEnd"/>
+      <w:proofErr w:type="gramStart"/>
+      <w:r>
+        <w:t>^{</w:t>
+      </w:r>
+      <w:proofErr w:type="gramEnd"/>
+      <w:r>
+        <w:t xml:space="preserve">0.074}, yielding </w:t>
+      </w:r>
+      <w:r>
+        <w:rPr>
+          <w:i/>
+          <w:iCs/>
+        </w:rPr>
+        <w:t>h</w:t>
+      </w:r>
+      <w:r>
+        <w:t xml:space="preserve"> ~300–1000 W/m²·K.</w:t>
+      </w:r>
+    </w:p>
+    <w:p>
+      <w:pPr>
+        <w:numPr>
+          <w:ilvl w:val="1"/>
+          <w:numId w:val="13"/>
+        </w:numPr>
+      </w:pPr>
+      <w:r>
+        <w:t xml:space="preserve">In ECCS injection: Transient </w:t>
+      </w:r>
+      <w:r>
+        <w:rPr>
+          <w:i/>
+          <w:iCs/>
+        </w:rPr>
+        <w:t>h</w:t>
+      </w:r>
+      <w:r>
+        <w:t xml:space="preserve"> rises with salt mixing, ~2000–5000 W/m²·K due to phase change effects.</w:t>
+      </w:r>
+    </w:p>
+    <w:p>
+      <w:pPr>
+        <w:numPr>
+          <w:ilvl w:val="0"/>
+          <w:numId w:val="13"/>
+        </w:numPr>
+      </w:pPr>
+      <w:r>
+        <w:rPr>
+          <w:b/>
+          <w:bCs/>
+        </w:rPr>
+        <w:t>Lead Coolant Loop (Natural Circulation)</w:t>
+      </w:r>
+      <w:r>
+        <w:t>:</w:t>
+      </w:r>
+    </w:p>
+    <w:p>
+      <w:pPr>
+        <w:numPr>
+          <w:ilvl w:val="1"/>
+          <w:numId w:val="13"/>
+        </w:numPr>
+      </w:pPr>
+      <w:proofErr w:type="gramStart"/>
+      <w:r>
+        <w:t>Similar to</w:t>
+      </w:r>
+      <w:proofErr w:type="gramEnd"/>
+      <w:r>
+        <w:t xml:space="preserve"> ULIMES but with pure lead properties; Ra ~10^9–10^11 in secondary loops.</w:t>
+      </w:r>
+    </w:p>
+    <w:p>
+      <w:pPr>
+        <w:numPr>
+          <w:ilvl w:val="1"/>
+          <w:numId w:val="13"/>
+        </w:numPr>
+      </w:pPr>
+      <w:r>
+        <w:lastRenderedPageBreak/>
+        <w:t>Correlation for liquid metal natural convection (e.g., in RCCS-like pools): Nu = 0.565 Ra</w:t>
+      </w:r>
+      <w:proofErr w:type="gramStart"/>
+      <w:r>
+        <w:t>^{</w:t>
+      </w:r>
+      <w:proofErr w:type="gramEnd"/>
+      <w:r>
+        <w:t>0.25} (for vertical walls).</w:t>
+      </w:r>
+    </w:p>
+    <w:p>
+      <w:pPr>
+        <w:numPr>
+          <w:ilvl w:val="1"/>
+          <w:numId w:val="13"/>
+        </w:numPr>
+      </w:pPr>
+      <w:r>
+        <w:t xml:space="preserve">Typical </w:t>
+      </w:r>
+      <w:r>
+        <w:rPr>
+          <w:i/>
+          <w:iCs/>
+        </w:rPr>
+        <w:t>h</w:t>
+      </w:r>
+      <w:r>
+        <w:t xml:space="preserve"> (using </w:t>
+      </w:r>
+      <w:proofErr w:type="spellStart"/>
+      <w:r>
+        <w:rPr>
+          <w:i/>
+          <w:iCs/>
+        </w:rPr>
+        <w:t>k_Pb</w:t>
+      </w:r>
+      <w:proofErr w:type="spellEnd"/>
+      <w:r>
+        <w:t xml:space="preserve"> ~18 W/</w:t>
+      </w:r>
+      <w:proofErr w:type="spellStart"/>
+      <w:r>
+        <w:t>m·K</w:t>
+      </w:r>
+      <w:proofErr w:type="spellEnd"/>
+      <w:r>
+        <w:t xml:space="preserve">, </w:t>
+      </w:r>
+      <w:proofErr w:type="spellStart"/>
+      <w:r>
+        <w:rPr>
+          <w:i/>
+          <w:iCs/>
+        </w:rPr>
+        <w:t>D_e</w:t>
+      </w:r>
+      <w:proofErr w:type="spellEnd"/>
+      <w:r>
+        <w:t xml:space="preserve"> ~0.02 m):</w:t>
+      </w:r>
+    </w:p>
+    <w:p>
+      <w:pPr>
+        <w:numPr>
+          <w:ilvl w:val="2"/>
+          <w:numId w:val="13"/>
+        </w:numPr>
+      </w:pPr>
+      <w:r>
+        <w:t>At 600–800 K: 1000–3000 W/m²·K for pool-type flow.</w:t>
+      </w:r>
+    </w:p>
+    <w:p>
+      <w:pPr>
+        <w:numPr>
+          <w:ilvl w:val="2"/>
+          <w:numId w:val="13"/>
+        </w:numPr>
+      </w:pPr>
+      <w:r>
+        <w:t>In channels: Kirillov correlation for LBE (adaptable to lead): Nu = 4.75 + 0.0175 Pe</w:t>
+      </w:r>
+      <w:proofErr w:type="gramStart"/>
+      <w:r>
+        <w:t>^{</w:t>
+      </w:r>
+      <w:proofErr w:type="gramEnd"/>
+      <w:r>
+        <w:t>0.8} (D_2/D_</w:t>
+      </w:r>
+      <w:proofErr w:type="gramStart"/>
+      <w:r>
+        <w:t>1)^</w:t>
+      </w:r>
+      <w:proofErr w:type="gramEnd"/>
+      <w:r>
+        <w:t xml:space="preserve">{0.3}, yielding </w:t>
+      </w:r>
+      <w:r>
+        <w:rPr>
+          <w:i/>
+          <w:iCs/>
+        </w:rPr>
+        <w:t>h</w:t>
+      </w:r>
+      <w:r>
+        <w:t xml:space="preserve"> ~5000–10,000 W/m²·K at Pe ~200–400.</w:t>
+      </w:r>
+    </w:p>
+    <w:p>
+      <w:pPr>
+        <w:numPr>
+          <w:ilvl w:val="1"/>
+          <w:numId w:val="13"/>
+        </w:numPr>
+      </w:pPr>
+      <w:r>
+        <w:t>For blanket region interface (</w:t>
+      </w:r>
+      <w:proofErr w:type="spellStart"/>
+      <w:r>
+        <w:t>ThO</w:t>
+      </w:r>
+      <w:proofErr w:type="spellEnd"/>
+      <w:r>
+        <w:t xml:space="preserve">₂ in lead): </w:t>
+      </w:r>
+      <w:r>
+        <w:rPr>
+          <w:i/>
+          <w:iCs/>
+        </w:rPr>
+        <w:t>h</w:t>
+      </w:r>
+      <w:r>
+        <w:t xml:space="preserve"> ~2000–4000 W/m²·K, enhanced by thorium dissolution.</w:t>
+      </w:r>
+    </w:p>
+    <w:p>
+      <w:pPr>
+        <w:rPr>
+          <w:b/>
+          <w:bCs/>
+        </w:rPr>
+      </w:pPr>
+      <w:r>
+        <w:rPr>
+          <w:b/>
+          <w:bCs/>
+        </w:rPr>
+        <w:t>4.3 Design Implications</w:t>
+      </w:r>
+    </w:p>
+    <w:p>
+      <w:pPr>
+        <w:numPr>
+          <w:ilvl w:val="0"/>
+          <w:numId w:val="14"/>
+        </w:numPr>
+      </w:pPr>
+      <w:r>
+        <w:rPr>
+          <w:b/>
+          <w:bCs/>
+        </w:rPr>
+        <w:t>Passive Safety</w:t>
+      </w:r>
+      <w:r>
+        <w:t xml:space="preserve">: Higher </w:t>
+      </w:r>
+      <w:r>
+        <w:rPr>
+          <w:i/>
+          <w:iCs/>
+        </w:rPr>
+        <w:t>k</w:t>
+      </w:r>
+      <w:r>
+        <w:t xml:space="preserve"> in ULIMES enables greedy cup drainage without melting (peak T &lt;400°</w:t>
+      </w:r>
+      <w:proofErr w:type="spellStart"/>
+      <w:r>
+        <w:t>C at</w:t>
+      </w:r>
+      <w:proofErr w:type="spellEnd"/>
+      <w:r>
+        <w:t xml:space="preserve"> walls for Zr compatibility). Natural circulation ensures </w:t>
+      </w:r>
+      <w:r>
+        <w:rPr>
+          <w:i/>
+          <w:iCs/>
+        </w:rPr>
+        <w:t>h</w:t>
+      </w:r>
+      <w:r>
+        <w:t xml:space="preserve"> suffices for decay heat removal (~10–20% of full power).</w:t>
+      </w:r>
+    </w:p>
+    <w:p>
+      <w:pPr>
+        <w:numPr>
+          <w:ilvl w:val="0"/>
+          <w:numId w:val="14"/>
+        </w:numPr>
+      </w:pPr>
+      <w:r>
+        <w:rPr>
+          <w:b/>
+          <w:bCs/>
+        </w:rPr>
+        <w:t>Material Compatibility</w:t>
+      </w:r>
+      <w:r>
+        <w:t xml:space="preserve">: Lead coolant limits wall T to &lt;400°C to avoid corrosion; Bi-Pb-Sn in ULIMES shows minimal reaction layers (~2 </w:t>
+      </w:r>
+      <w:proofErr w:type="spellStart"/>
+      <w:r>
+        <w:t>μm</w:t>
+      </w:r>
+      <w:proofErr w:type="spellEnd"/>
+      <w:r>
+        <w:t xml:space="preserve"> at 600°C).</w:t>
+      </w:r>
+    </w:p>
+    <w:p>
+      <w:pPr>
+        <w:numPr>
+          <w:ilvl w:val="0"/>
+          <w:numId w:val="14"/>
+        </w:numPr>
+      </w:pPr>
+      <w:r>
+        <w:rPr>
+          <w:b/>
+          <w:bCs/>
+        </w:rPr>
+        <w:t>Uncertainties</w:t>
+      </w:r>
+      <w:r>
+        <w:t>: Viscosity and settling in ULIMES need measurement; convection assumes stagnant fuel in simulations but may include weak internal flows.</w:t>
+      </w:r>
+    </w:p>
+    <w:p>
+      <w:pPr>
+        <w:numPr>
+          <w:ilvl w:val="0"/>
+          <w:numId w:val="14"/>
+        </w:numPr>
+      </w:pPr>
+      <w:r>
+        <w:rPr>
+          <w:b/>
+          <w:bCs/>
+        </w:rPr>
+        <w:t>Recommendations</w:t>
+      </w:r>
+      <w:r>
+        <w:t xml:space="preserve">: Use carbon moderators in thermal zone for stable </w:t>
+      </w:r>
+      <w:r>
+        <w:rPr>
+          <w:i/>
+          <w:iCs/>
+        </w:rPr>
+        <w:t>k</w:t>
+      </w:r>
+      <w:r>
+        <w:t xml:space="preserve"> (~100–150 W/</w:t>
+      </w:r>
+      <w:proofErr w:type="spellStart"/>
+      <w:r>
+        <w:t>m·K</w:t>
+      </w:r>
+      <w:proofErr w:type="spellEnd"/>
+      <w:r>
+        <w:t xml:space="preserve">); validate </w:t>
+      </w:r>
+      <w:r>
+        <w:rPr>
+          <w:i/>
+          <w:iCs/>
+        </w:rPr>
+        <w:t>h</w:t>
+      </w:r>
+      <w:r>
+        <w:t xml:space="preserve"> via CFD for hexagonal geometry.</w:t>
+      </w:r>
+    </w:p>
+    <w:p>
+      <w:r>
+        <w:t xml:space="preserve">This design prioritizes inherent safety through physics-based </w:t>
+      </w:r>
+      <w:proofErr w:type="gramStart"/>
+      <w:r>
+        <w:t>feedbacks</w:t>
+      </w:r>
+      <w:proofErr w:type="gramEnd"/>
+      <w:r>
+        <w:t>, with all data public domain for open collaboration.</w:t>
+      </w:r>
+    </w:p>
+    <w:p>
+      <w:pPr>
+        <w:rPr>
+          <w:b/>
+          <w:bCs/>
+        </w:rPr>
+      </w:pPr>
+      <w:r>
+        <w:rPr>
+          <w:b/>
+          <w:bCs/>
+        </w:rPr>
+        <w:t>Public Domain Document: Evaluation of Beryllium Carbide as a Moderator for Compact Greedy Cup ULIMES-Fueled Naval Reactors with Natural Circulation</w:t>
+      </w:r>
+    </w:p>
+    <w:p>
+      <w:pPr>
+        <w:rPr>
+          <w:b/>
+          <w:bCs/>
+        </w:rPr>
+      </w:pPr>
+      <w:r>
+        <w:rPr>
+          <w:b/>
+          <w:bCs/>
+        </w:rPr>
+        <w:t>Overview</w:t>
+      </w:r>
+    </w:p>
+    <w:p>
+      <w:r>
+        <w:t>This document assesses the potential use of beryllium carbide (</w:t>
+      </w:r>
+      <w:proofErr w:type="spellStart"/>
+      <w:r>
+        <w:t>Be₂C</w:t>
+      </w:r>
+      <w:proofErr w:type="spellEnd"/>
+      <w:r>
+        <w:t xml:space="preserve">) as a solid moderator in the thermal region of a mixed-spectrum Greedy Cup ULIMES (UO₂-liquid metal suspension)-fueled reactor design, tailored for compact applications such as naval propulsion systems. Naval reactors often operate at reduced power levels (e.g., approximately one-third of full power during cruise modes) to optimize fuel efficiency and stealth, necessitating highly compact cores with efficient neutron moderation to minimize size while maintaining criticality and safety margins. The design incorporates natural circulation for both fuel and coolant loops (using lead or lead-bismuth eutectic), ECCS </w:t>
+      </w:r>
+      <w:r>
+        <w:lastRenderedPageBreak/>
+        <w:t>molten salt injection (potentially in solid form) for passive drainage via the greedy cup mechanism, a central thermal zone with solid moderators (preferring Be₂</w:t>
+      </w:r>
+      <w:proofErr w:type="spellStart"/>
+      <w:r>
+        <w:t>C over</w:t>
+      </w:r>
+      <w:proofErr w:type="spellEnd"/>
+      <w:r>
+        <w:t xml:space="preserve"> </w:t>
+      </w:r>
+      <w:proofErr w:type="spellStart"/>
+      <w:r>
+        <w:t>ZrH</w:t>
+      </w:r>
+      <w:proofErr w:type="spellEnd"/>
+      <w:r>
+        <w:t xml:space="preserve">₂ or carbon for superior performance), an epithermal fuel region without moderators, and a blanket region with thorium molten salt or dissolved </w:t>
+      </w:r>
+      <w:proofErr w:type="spellStart"/>
+      <w:r>
+        <w:t>ThO</w:t>
+      </w:r>
+      <w:proofErr w:type="spellEnd"/>
+      <w:r>
+        <w:t xml:space="preserve">₂ in liquid metal, arranged in hexagonal close-packed geometry. This evaluation focuses on whether </w:t>
+      </w:r>
+      <w:proofErr w:type="spellStart"/>
+      <w:r>
+        <w:t>Be₂C</w:t>
+      </w:r>
+      <w:proofErr w:type="spellEnd"/>
+      <w:r>
+        <w:t xml:space="preserve"> can enable core size reduction through enhanced moderation efficiency, drawing on its nuclear, thermal, and mechanical properties. All data </w:t>
+      </w:r>
+      <w:proofErr w:type="gramStart"/>
+      <w:r>
+        <w:t>are</w:t>
+      </w:r>
+      <w:proofErr w:type="gramEnd"/>
+      <w:r>
+        <w:t xml:space="preserve"> derived from public sources to support open development of advanced reactor concepts.</w:t>
+      </w:r>
+    </w:p>
+    <w:p>
+      <w:pPr>
+        <w:rPr>
+          <w:b/>
+          <w:bCs/>
+        </w:rPr>
+      </w:pPr>
+      <w:r>
+        <w:rPr>
+          <w:b/>
+          <w:bCs/>
+        </w:rPr>
+        <w:t>Section 1: Properties of Beryllium Carbide as a Neutron Moderator</w:t>
+      </w:r>
+    </w:p>
+    <w:p>
+      <w:r>
+        <w:t>Beryllium carbide (</w:t>
+      </w:r>
+      <w:proofErr w:type="spellStart"/>
+      <w:r>
+        <w:t>Be₂C</w:t>
+      </w:r>
+      <w:proofErr w:type="spellEnd"/>
+      <w:r>
+        <w:t>) is an antifluorite-structured ceramic with promising attributes for high-temperature moderation in molten salt or liquid metal-cooled reactors. Its key advantages stem from beryllium's low atomic mass (A=9), which provides a higher logarithmic energy decrement (ξ ≈ 0.207) compared to carbon (ξ ≈ 0.158 in graphite), allowing neutrons to lose more energy per collision and thermalize more efficiently. The macroscopic slowing-down power of Be (~2.5 times that of carbon on a per-atom basis, adjusted for density in compounds) enables superior moderation in compact volumes.</w:t>
+      </w:r>
+    </w:p>
+    <w:p>
+      <w:pPr>
+        <w:numPr>
+          <w:ilvl w:val="0"/>
+          <w:numId w:val="17"/>
+        </w:numPr>
+        <w:spacing w:line="276" w:lineRule="auto"/>
+        <w:rPr>
+          <w:rFonts w:eastAsia="Times New Roman"/>
+          <w:kern w:val="0"/>
+          <w14:ligatures w14:val="none"/>
+        </w:rPr>
+      </w:pPr>
+      <w:r>
+        <w:rPr>
+          <w:rFonts w:eastAsia="Times New Roman"/>
+          <w:b/>
+          <w:bCs/>
+        </w:rPr>
+        <w:t>Nuclear Properties</w:t>
+      </w:r>
+      <w:r>
+        <w:rPr>
+          <w:rFonts w:eastAsia="Times New Roman"/>
+        </w:rPr>
+        <w:t>:</w:t>
+      </w:r>
+    </w:p>
+    <w:p>
+      <w:pPr>
+        <w:numPr>
+          <w:ilvl w:val="0"/>
+          <w:numId w:val="17"/>
+        </w:numPr>
+        <w:spacing w:line="276" w:lineRule="auto"/>
+        <w:rPr>
+          <w:rFonts w:eastAsia="Times New Roman"/>
+        </w:rPr>
+      </w:pPr>
+      <w:r>
+        <w:rPr>
+          <w:rFonts w:eastAsia="Times New Roman"/>
+        </w:rPr>
+        <w:t>Moderating ratio (</w:t>
+      </w:r>
+      <w:proofErr w:type="spellStart"/>
+      <w:r>
+        <w:rPr>
+          <w:rFonts w:eastAsia="Times New Roman"/>
+        </w:rPr>
+        <w:t>ξΣ_s</w:t>
+      </w:r>
+      <w:proofErr w:type="spellEnd"/>
+      <w:r>
+        <w:rPr>
+          <w:rFonts w:eastAsia="Times New Roman"/>
+        </w:rPr>
+        <w:t xml:space="preserve"> / </w:t>
+      </w:r>
+      <w:proofErr w:type="spellStart"/>
+      <w:r>
+        <w:rPr>
+          <w:rFonts w:eastAsia="Times New Roman"/>
+        </w:rPr>
+        <w:t>Σ_a</w:t>
+      </w:r>
+      <w:proofErr w:type="spellEnd"/>
+      <w:r>
+        <w:rPr>
+          <w:rFonts w:eastAsia="Times New Roman"/>
+        </w:rPr>
+        <w:t xml:space="preserve">): ~153 for </w:t>
+      </w:r>
+      <w:proofErr w:type="spellStart"/>
+      <w:r>
+        <w:rPr>
+          <w:rFonts w:eastAsia="Times New Roman"/>
+        </w:rPr>
+        <w:t>Be₂C</w:t>
+      </w:r>
+      <w:proofErr w:type="spellEnd"/>
+      <w:r>
+        <w:rPr>
+          <w:rFonts w:eastAsia="Times New Roman"/>
+        </w:rPr>
+        <w:t>, compared to ~234 for graphite (C) and ~146 for pure Be, indicating low neutron absorption (</w:t>
+      </w:r>
+      <w:proofErr w:type="spellStart"/>
+      <w:r>
+        <w:rPr>
+          <w:rFonts w:eastAsia="Times New Roman"/>
+        </w:rPr>
+        <w:t>Σ_a</w:t>
+      </w:r>
+      <w:proofErr w:type="spellEnd"/>
+      <w:r>
+        <w:rPr>
+          <w:rFonts w:eastAsia="Times New Roman"/>
+        </w:rPr>
+        <w:t xml:space="preserve"> ≈ 0.074 b for </w:t>
+      </w:r>
+      <w:proofErr w:type="spellStart"/>
+      <w:r>
+        <w:rPr>
+          <w:rFonts w:eastAsia="Times New Roman"/>
+        </w:rPr>
+        <w:t>Be₂C</w:t>
+      </w:r>
+      <w:proofErr w:type="spellEnd"/>
+      <w:r>
+        <w:rPr>
+          <w:rFonts w:eastAsia="Times New Roman"/>
+        </w:rPr>
+        <w:t xml:space="preserve"> at thermal energies).</w:t>
+      </w:r>
+    </w:p>
+    <w:p>
+      <w:pPr>
+        <w:numPr>
+          <w:ilvl w:val="0"/>
+          <w:numId w:val="17"/>
+        </w:numPr>
+        <w:spacing w:line="276" w:lineRule="auto"/>
+        <w:rPr>
+          <w:rFonts w:eastAsia="Times New Roman"/>
+        </w:rPr>
+      </w:pPr>
+      <w:r>
+        <w:rPr>
+          <w:rFonts w:eastAsia="Times New Roman"/>
+        </w:rPr>
+        <w:t>Moderating power (</w:t>
+      </w:r>
+      <w:proofErr w:type="spellStart"/>
+      <w:r>
+        <w:rPr>
+          <w:rFonts w:eastAsia="Times New Roman"/>
+        </w:rPr>
+        <w:t>ξΣ_s</w:t>
+      </w:r>
+      <w:proofErr w:type="spellEnd"/>
+      <w:r>
+        <w:rPr>
+          <w:rFonts w:eastAsia="Times New Roman"/>
+        </w:rPr>
+        <w:t xml:space="preserve">, cm </w:t>
+      </w:r>
+      <w:r>
+        <w:rPr>
+          <w:rFonts w:ascii="Cambria Math" w:eastAsia="Times New Roman" w:hAnsi="Cambria Math"/>
+        </w:rPr>
+        <w:t>⁻</w:t>
+      </w:r>
+      <w:r>
+        <w:rPr>
+          <w:rFonts w:eastAsia="Times New Roman"/>
+        </w:rPr>
+        <w:t xml:space="preserve"> ¹): ~0.369 for </w:t>
+      </w:r>
+      <w:proofErr w:type="spellStart"/>
+      <w:r>
+        <w:rPr>
+          <w:rFonts w:eastAsia="Times New Roman"/>
+        </w:rPr>
+        <w:t>Be₂C</w:t>
+      </w:r>
+      <w:proofErr w:type="spellEnd"/>
+      <w:r>
+        <w:rPr>
+          <w:rFonts w:eastAsia="Times New Roman"/>
+        </w:rPr>
+        <w:t xml:space="preserve">, </w:t>
+      </w:r>
+      <w:proofErr w:type="gramStart"/>
+      <w:r>
+        <w:rPr>
+          <w:rFonts w:eastAsia="Times New Roman"/>
+        </w:rPr>
+        <w:t>similar to</w:t>
+      </w:r>
+      <w:proofErr w:type="gramEnd"/>
+      <w:r>
+        <w:rPr>
+          <w:rFonts w:eastAsia="Times New Roman"/>
+        </w:rPr>
+        <w:t xml:space="preserve"> graphite (~0.385) but enhanced by higher density (~2.44 g/cm³ vs. ~1.7 g/cm³ for graphite), reducing the required moderator volume for equivalent thermalization.</w:t>
+      </w:r>
+    </w:p>
+    <w:p>
+      <w:pPr>
+        <w:numPr>
+          <w:ilvl w:val="0"/>
+          <w:numId w:val="17"/>
+        </w:numPr>
+        <w:spacing w:line="276" w:lineRule="auto"/>
+        <w:rPr>
+          <w:rFonts w:eastAsia="Times New Roman"/>
+        </w:rPr>
+      </w:pPr>
+      <w:r>
+        <w:rPr>
+          <w:rFonts w:eastAsia="Times New Roman"/>
+        </w:rPr>
+        <w:t>High melting point (~2373 K) ensures stability in reactor environments up to 1000 K, compatible with ULIMES operating temperatures (~600–800 K).</w:t>
+      </w:r>
+    </w:p>
+    <w:p>
+      <w:pPr>
+        <w:numPr>
+          <w:ilvl w:val="0"/>
+          <w:numId w:val="17"/>
+        </w:numPr>
+        <w:spacing w:line="276" w:lineRule="auto"/>
+        <w:rPr>
+          <w:rFonts w:eastAsia="Times New Roman"/>
+        </w:rPr>
+      </w:pPr>
+      <w:r>
+        <w:rPr>
+          <w:rFonts w:eastAsia="Times New Roman"/>
+        </w:rPr>
+        <w:t xml:space="preserve">Chemical compatibility with molten salts (e.g., </w:t>
+      </w:r>
+      <w:proofErr w:type="spellStart"/>
+      <w:r>
+        <w:rPr>
+          <w:rFonts w:eastAsia="Times New Roman"/>
+        </w:rPr>
+        <w:t>FLiBe</w:t>
+      </w:r>
+      <w:proofErr w:type="spellEnd"/>
+      <w:r>
+        <w:rPr>
+          <w:rFonts w:eastAsia="Times New Roman"/>
+        </w:rPr>
+        <w:t xml:space="preserve"> or thorium salts) and liquid metals (e.g., Pb or Pb-Bi), with minimal reaction layers observed in tests.</w:t>
+      </w:r>
+    </w:p>
+    <w:p>
+      <w:pPr>
+        <w:spacing w:after="0"/>
+        <w:rPr>
+          <w:rFonts w:ascii="Times New Roman" w:eastAsia="Times New Roman" w:hAnsi="Times New Roman"/>
+        </w:rPr>
+      </w:pPr>
+      <w:proofErr w:type="gramStart"/>
+      <w:r>
+        <w:rPr>
+          <w:rFonts w:ascii="Times New Roman" w:eastAsia="Times New Roman" w:hAnsi="Symbol"/>
+        </w:rPr>
+        <w:t></w:t>
+      </w:r>
+      <w:r>
+        <w:rPr>
+          <w:rFonts w:ascii="Times New Roman" w:eastAsia="Times New Roman" w:hAnsi="Times New Roman"/>
+        </w:rPr>
+        <w:t xml:space="preserve">  </w:t>
+      </w:r>
+      <w:r>
+        <w:rPr>
+          <w:rFonts w:ascii="Times New Roman" w:eastAsia="Times New Roman" w:hAnsi="Times New Roman"/>
+          <w:b/>
+          <w:bCs/>
+        </w:rPr>
+        <w:t>Thermal</w:t>
+      </w:r>
+      <w:proofErr w:type="gramEnd"/>
+      <w:r>
+        <w:rPr>
+          <w:rFonts w:ascii="Times New Roman" w:eastAsia="Times New Roman" w:hAnsi="Times New Roman"/>
+          <w:b/>
+          <w:bCs/>
+        </w:rPr>
+        <w:t xml:space="preserve"> and Mechanical Properties</w:t>
+      </w:r>
+      <w:r>
+        <w:rPr>
+          <w:rFonts w:ascii="Times New Roman" w:eastAsia="Times New Roman" w:hAnsi="Times New Roman"/>
+        </w:rPr>
+        <w:t>:</w:t>
+      </w:r>
+    </w:p>
+    <w:p>
+      <w:pPr>
+        <w:numPr>
+          <w:ilvl w:val="0"/>
+          <w:numId w:val="18"/>
+        </w:numPr>
+        <w:spacing w:line="276" w:lineRule="auto"/>
+        <w:rPr>
+          <w:rFonts w:ascii="Aptos" w:eastAsia="Times New Roman" w:hAnsi="Aptos"/>
+        </w:rPr>
+      </w:pPr>
+      <w:r>
+        <w:rPr>
+          <w:rFonts w:eastAsia="Times New Roman"/>
+        </w:rPr>
+        <w:t>Thermal conductivity: ~1.81 W/</w:t>
+      </w:r>
+      <w:proofErr w:type="spellStart"/>
+      <w:r>
+        <w:rPr>
+          <w:rFonts w:eastAsia="Times New Roman"/>
+        </w:rPr>
+        <w:t>m·K</w:t>
+      </w:r>
+      <w:proofErr w:type="spellEnd"/>
+      <w:r>
+        <w:rPr>
+          <w:rFonts w:eastAsia="Times New Roman"/>
+        </w:rPr>
+        <w:t xml:space="preserve"> at 900 K, lower than graphite (~31 W/</w:t>
+      </w:r>
+      <w:proofErr w:type="spellStart"/>
+      <w:r>
+        <w:rPr>
+          <w:rFonts w:eastAsia="Times New Roman"/>
+        </w:rPr>
+        <w:t>m·K</w:t>
+      </w:r>
+      <w:proofErr w:type="spellEnd"/>
+      <w:r>
+        <w:rPr>
+          <w:rFonts w:eastAsia="Times New Roman"/>
+        </w:rPr>
+        <w:t>) but sufficient for natural circulation designs where heat transfer is dominated by convection in fuel/coolant loops.</w:t>
+      </w:r>
+    </w:p>
+    <w:p>
+      <w:pPr>
+        <w:numPr>
+          <w:ilvl w:val="0"/>
+          <w:numId w:val="18"/>
+        </w:numPr>
+        <w:spacing w:line="276" w:lineRule="auto"/>
+        <w:rPr>
+          <w:rFonts w:eastAsia="Times New Roman"/>
+        </w:rPr>
+      </w:pPr>
+      <w:r>
+        <w:rPr>
+          <w:rFonts w:eastAsia="Times New Roman"/>
+        </w:rPr>
+        <w:t>Specific heat: ~1870 J/</w:t>
+      </w:r>
+      <w:proofErr w:type="spellStart"/>
+      <w:r>
+        <w:rPr>
+          <w:rFonts w:eastAsia="Times New Roman"/>
+        </w:rPr>
+        <w:t>kg·K</w:t>
+      </w:r>
+      <w:proofErr w:type="spellEnd"/>
+      <w:r>
+        <w:rPr>
+          <w:rFonts w:eastAsia="Times New Roman"/>
+        </w:rPr>
+        <w:t>, aiding thermal inertia during transients.</w:t>
+      </w:r>
+    </w:p>
+    <w:p>
+      <w:pPr>
+        <w:numPr>
+          <w:ilvl w:val="0"/>
+          <w:numId w:val="18"/>
+        </w:numPr>
+        <w:spacing w:line="276" w:lineRule="auto"/>
+        <w:rPr>
+          <w:rFonts w:eastAsia="Times New Roman"/>
+        </w:rPr>
+      </w:pPr>
+      <w:r>
+        <w:rPr>
+          <w:rFonts w:eastAsia="Times New Roman"/>
+        </w:rPr>
+        <w:lastRenderedPageBreak/>
+        <w:t>Density: 2.44 g/cm³, enabling denser packing in hexagonal assemblies and contributing to core compactness.</w:t>
+      </w:r>
+    </w:p>
+    <w:p>
+      <w:pPr>
+        <w:numPr>
+          <w:ilvl w:val="0"/>
+          <w:numId w:val="18"/>
+        </w:numPr>
+        <w:spacing w:line="276" w:lineRule="auto"/>
+        <w:rPr>
+          <w:rFonts w:eastAsia="Times New Roman"/>
+        </w:rPr>
+      </w:pPr>
+      <w:r>
+        <w:rPr>
+          <w:rFonts w:eastAsia="Times New Roman"/>
+        </w:rPr>
+        <w:t xml:space="preserve">Challenges include brittleness (prone to thermal stress cracking) and radiation-induced swelling/discoloration at high fluences (&gt;3×10²² n/cm²), though antifluorite structure suggests high damage tolerance </w:t>
+      </w:r>
+      <w:proofErr w:type="gramStart"/>
+      <w:r>
+        <w:rPr>
+          <w:rFonts w:eastAsia="Times New Roman"/>
+        </w:rPr>
+        <w:t>similar to</w:t>
+      </w:r>
+      <w:proofErr w:type="gramEnd"/>
+      <w:r>
+        <w:rPr>
+          <w:rFonts w:eastAsia="Times New Roman"/>
+        </w:rPr>
+        <w:t xml:space="preserve"> UO₂. Mitigation strategies: Fiber reinforcement or thin coatings (e.g., </w:t>
+      </w:r>
+      <w:proofErr w:type="spellStart"/>
+      <w:r>
+        <w:rPr>
+          <w:rFonts w:eastAsia="Times New Roman"/>
+        </w:rPr>
+        <w:t>SiO</w:t>
+      </w:r>
+      <w:proofErr w:type="spellEnd"/>
+      <w:r>
+        <w:rPr>
+          <w:rFonts w:eastAsia="Times New Roman"/>
+        </w:rPr>
+        <w:t xml:space="preserve">₂ or </w:t>
+      </w:r>
+      <w:proofErr w:type="spellStart"/>
+      <w:r>
+        <w:rPr>
+          <w:rFonts w:eastAsia="Times New Roman"/>
+        </w:rPr>
+        <w:t>NbC</w:t>
+      </w:r>
+      <w:proofErr w:type="spellEnd"/>
+      <w:r>
+        <w:rPr>
+          <w:rFonts w:eastAsia="Times New Roman"/>
+        </w:rPr>
+        <w:t>) to enhance ductility and protect against moisture/U reactions.</w:t>
+      </w:r>
+    </w:p>
+    <w:p>
+      <w:proofErr w:type="spellStart"/>
+      <w:r>
+        <w:t>Be₂C's</w:t>
+      </w:r>
+      <w:proofErr w:type="spellEnd"/>
+      <w:r>
+        <w:t xml:space="preserve"> radiation resistance requires further validation, but limited low-dose studies indicate viability for long-life naval cores.</w:t>
+      </w:r>
+    </w:p>
+    <w:p>
+      <w:pPr>
+        <w:rPr>
+          <w:b/>
+          <w:bCs/>
+        </w:rPr>
+      </w:pPr>
+      <w:r>
+        <w:rPr>
+          <w:b/>
+          <w:bCs/>
+        </w:rPr>
+        <w:t>Section 2: Impact on Core Size Reduction in Compact Designs</w:t>
+      </w:r>
+    </w:p>
+    <w:p>
+      <w:r>
+        <w:t xml:space="preserve">In naval reactors, core compactness is critical for space constraints in submarines or ships, where traditional PWRs use water moderation but advanced designs like ULIMES/MSR hybrids benefit from solid moderators for high-temperature operation. </w:t>
+      </w:r>
+      <w:proofErr w:type="spellStart"/>
+      <w:r>
+        <w:t>Be₂C's</w:t>
+      </w:r>
+      <w:proofErr w:type="spellEnd"/>
+      <w:r>
+        <w:t xml:space="preserve"> superior moderation efficiency (~2.5× slowing-down power vs. graphite) allows neutrons to thermalize in a smaller volume, reducing the thermal zone's radius and overall core dimensions. Higher density further compresses the moderator lattice in hexagonal close-packed arrangements, potentially shrinking core volume by 20–40% compared to graphite-moderated equivalents while maintaining </w:t>
+      </w:r>
+      <w:proofErr w:type="spellStart"/>
+      <w:r>
+        <w:t>k_eff</w:t>
+      </w:r>
+      <w:proofErr w:type="spellEnd"/>
+      <w:r>
+        <w:t xml:space="preserve"> &gt;1.</w:t>
+      </w:r>
+    </w:p>
+    <w:p>
+      <w:pPr>
+        <w:numPr>
+          <w:ilvl w:val="0"/>
+          <w:numId w:val="15"/>
+        </w:numPr>
+      </w:pPr>
+      <w:r>
+        <w:rPr>
+          <w:b/>
+          <w:bCs/>
+        </w:rPr>
+        <w:t>Neutronic Modeling Considerations</w:t>
+      </w:r>
+      <w:r>
+        <w:t>:</w:t>
+      </w:r>
+    </w:p>
+    <w:p>
+      <w:pPr>
+        <w:numPr>
+          <w:ilvl w:val="1"/>
+          <w:numId w:val="15"/>
+        </w:numPr>
+      </w:pPr>
+      <w:r>
+        <w:t xml:space="preserve">In a mixed-spectrum core, the central thermal region (moderated by </w:t>
+      </w:r>
+      <w:proofErr w:type="spellStart"/>
+      <w:r>
+        <w:t>Be₂C</w:t>
+      </w:r>
+      <w:proofErr w:type="spellEnd"/>
+      <w:r>
+        <w:t>) enhances control via higher thermal absorption in rods, while the epithermal and blanket regions leverage fast neutrons for breeding.</w:t>
+      </w:r>
+    </w:p>
+    <w:p>
+      <w:pPr>
+        <w:numPr>
+          <w:ilvl w:val="1"/>
+          <w:numId w:val="15"/>
+        </w:numPr>
+      </w:pPr>
+      <w:r>
+        <w:t xml:space="preserve">Core size scaling: Moderator volume </w:t>
+      </w:r>
+      <w:proofErr w:type="spellStart"/>
+      <w:r>
+        <w:t>V_m</w:t>
+      </w:r>
+      <w:proofErr w:type="spellEnd"/>
+      <w:r>
+        <w:t xml:space="preserve"> </w:t>
+      </w:r>
+      <w:r>
+        <w:rPr>
+          <w:rFonts w:ascii="Cambria Math" w:hAnsi="Cambria Math" w:cs="Cambria Math"/>
+        </w:rPr>
+        <w:t>∝</w:t>
+      </w:r>
+      <w:r>
+        <w:t xml:space="preserve"> 1 / (</w:t>
+      </w:r>
+      <w:proofErr w:type="spellStart"/>
+      <w:r>
+        <w:rPr>
+          <w:rFonts w:ascii="Aptos" w:hAnsi="Aptos" w:cs="Aptos"/>
+        </w:rPr>
+        <w:t>ξΣ</w:t>
+      </w:r>
+      <w:r>
+        <w:t>_s</w:t>
+      </w:r>
+      <w:proofErr w:type="spellEnd"/>
+      <w:r>
+        <w:t xml:space="preserve">), so </w:t>
+      </w:r>
+      <w:proofErr w:type="spellStart"/>
+      <w:r>
+        <w:t>Be</w:t>
+      </w:r>
+      <w:r>
+        <w:rPr>
+          <w:rFonts w:ascii="Aptos" w:hAnsi="Aptos" w:cs="Aptos"/>
+        </w:rPr>
+        <w:t>₂</w:t>
+      </w:r>
+      <w:r>
+        <w:t>C's</w:t>
+      </w:r>
+      <w:proofErr w:type="spellEnd"/>
+      <w:r>
+        <w:t xml:space="preserve"> higher </w:t>
+      </w:r>
+      <w:proofErr w:type="spellStart"/>
+      <w:r>
+        <w:rPr>
+          <w:rFonts w:ascii="Aptos" w:hAnsi="Aptos" w:cs="Aptos"/>
+        </w:rPr>
+        <w:t>ξΣ</w:t>
+      </w:r>
+      <w:r>
+        <w:t>_s</w:t>
+      </w:r>
+      <w:proofErr w:type="spellEnd"/>
+      <w:r>
+        <w:t xml:space="preserve"> reduces </w:t>
+      </w:r>
+      <w:proofErr w:type="spellStart"/>
+      <w:r>
+        <w:t>V_m</w:t>
+      </w:r>
+      <w:proofErr w:type="spellEnd"/>
+      <w:r>
+        <w:t xml:space="preserve"> relative to carbon.</w:t>
+      </w:r>
+    </w:p>
+    <w:p>
+      <w:pPr>
+        <w:numPr>
+          <w:ilvl w:val="1"/>
+          <w:numId w:val="15"/>
+        </w:numPr>
+      </w:pPr>
+      <w:r>
+        <w:t xml:space="preserve">For one-third power operation (~30–50 </w:t>
+      </w:r>
+      <w:proofErr w:type="spellStart"/>
+      <w:r>
+        <w:t>MWth</w:t>
+      </w:r>
+      <w:proofErr w:type="spellEnd"/>
+      <w:r>
+        <w:t xml:space="preserve"> typical for naval cruise), reduced fission rate lowers thermal loads, minimizing </w:t>
+      </w:r>
+      <w:proofErr w:type="spellStart"/>
+      <w:r>
+        <w:t>Be₂C's</w:t>
+      </w:r>
+      <w:proofErr w:type="spellEnd"/>
+      <w:r>
+        <w:t xml:space="preserve"> brittleness risks and extending lifetime under lower fluence accumulation.</w:t>
+      </w:r>
+    </w:p>
+    <w:p>
+      <w:r>
+        <w:t>Simulations of Be-based composites (e.g., MgO-</w:t>
+      </w:r>
+      <w:proofErr w:type="spellStart"/>
+      <w:r>
+        <w:t>BeO</w:t>
+      </w:r>
+      <w:proofErr w:type="spellEnd"/>
+      <w:r>
+        <w:t>) in modular HTGRs show viable compactness with improved safety margins, adaptable to ULIMES.</w:t>
+      </w:r>
+    </w:p>
+    <w:p>
+      <w:pPr>
+        <w:rPr>
+          <w:b/>
+          <w:bCs/>
+        </w:rPr>
+      </w:pPr>
+      <w:r>
+        <w:rPr>
+          <w:b/>
+          <w:bCs/>
+        </w:rPr>
+        <w:t>Section 3: Suitability for Naval Applications and Greedy Cup Integration</w:t>
+      </w:r>
+    </w:p>
+    <w:p>
+      <w:proofErr w:type="spellStart"/>
+      <w:r>
+        <w:t>Be₂C</w:t>
+      </w:r>
+      <w:proofErr w:type="spellEnd"/>
+      <w:r>
+        <w:t xml:space="preserve"> is well-suited for naval reactors due to its high-temperature stability, enabling natural circulation without pumps (reducing mechanical failures) and compatibility with lead coolant for radiation shielding in confined spaces. In the greedy cup mechanism, ECCS </w:t>
+      </w:r>
+      <w:r>
+        <w:lastRenderedPageBreak/>
+        <w:t xml:space="preserve">salt injection raises levels for passive drainage, where </w:t>
+      </w:r>
+      <w:proofErr w:type="spellStart"/>
+      <w:r>
+        <w:t>Be₂C's</w:t>
+      </w:r>
+      <w:proofErr w:type="spellEnd"/>
+      <w:r>
+        <w:t xml:space="preserve"> impermeability (with coatings) prevents salt infiltration. At one-third power, lower heat flux (~1/3 full) reduces thermal gradients, mitigating cracking risks.</w:t>
+      </w:r>
+      <w:r>
+        <w:t xml:space="preserve"> </w:t>
+      </w:r>
+    </w:p>
+    <w:p>
+      <w:r>
+        <w:t xml:space="preserve">[Note: Greedy cup probably not useful for naval applications as it is too extreme for shutdown. </w:t>
+      </w:r>
+      <w:proofErr w:type="gramStart"/>
+      <w:r>
+        <w:t>However</w:t>
+      </w:r>
+      <w:proofErr w:type="gramEnd"/>
+      <w:r>
+        <w:t xml:space="preserve"> the Greedy cup reactor would be perfect for commercial AND prototype training reactors.]</w:t>
+      </w:r>
+    </w:p>
+    <w:p>
+      <w:pPr>
+        <w:numPr>
+          <w:ilvl w:val="0"/>
+          <w:numId w:val="16"/>
+        </w:numPr>
+      </w:pPr>
+      <w:r>
+        <w:rPr>
+          <w:b/>
+          <w:bCs/>
+        </w:rPr>
+        <w:t>Advantages for Compactness</w:t>
+      </w:r>
+      <w:r>
+        <w:t>:</w:t>
+      </w:r>
+    </w:p>
+    <w:p>
+      <w:pPr>
+        <w:numPr>
+          <w:ilvl w:val="1"/>
+          <w:numId w:val="16"/>
+        </w:numPr>
+      </w:pPr>
+      <w:r>
+        <w:t>Enables smaller cores (e.g., &lt;10 m³ vs. &gt;15 m³ for graphite) while supporting long refueling intervals (&gt;10 years).</w:t>
+      </w:r>
+    </w:p>
+    <w:p>
+      <w:pPr>
+        <w:numPr>
+          <w:ilvl w:val="1"/>
+          <w:numId w:val="16"/>
+        </w:numPr>
+      </w:pPr>
+      <w:r>
+        <w:t>Improved neutron economy boosts breeding in Th blanket, enhancing fuel utilization.</w:t>
+      </w:r>
+    </w:p>
+    <w:p>
+      <w:pPr>
+        <w:numPr>
+          <w:ilvl w:val="0"/>
+          <w:numId w:val="16"/>
+        </w:numPr>
+      </w:pPr>
+      <w:r>
+        <w:rPr>
+          <w:b/>
+          <w:bCs/>
+        </w:rPr>
+        <w:t>Challenges and Mitigations</w:t>
+      </w:r>
+      <w:r>
+        <w:t>:</w:t>
+      </w:r>
+    </w:p>
+    <w:p>
+      <w:pPr>
+        <w:numPr>
+          <w:ilvl w:val="1"/>
+          <w:numId w:val="16"/>
+        </w:numPr>
+      </w:pPr>
+      <w:r>
+        <w:t xml:space="preserve">Toxicity: Handle with ventilated systems; </w:t>
+      </w:r>
+      <w:proofErr w:type="spellStart"/>
+      <w:r>
+        <w:t>Be₂C</w:t>
+      </w:r>
+      <w:proofErr w:type="spellEnd"/>
+      <w:r>
+        <w:t xml:space="preserve"> less volatile than pure Be.</w:t>
+      </w:r>
+    </w:p>
+    <w:p>
+      <w:pPr>
+        <w:numPr>
+          <w:ilvl w:val="1"/>
+          <w:numId w:val="16"/>
+        </w:numPr>
+      </w:pPr>
+      <w:r>
+        <w:t xml:space="preserve">Irradiation Effects: Potential swelling; use fiber-reinforced variants or hybrid </w:t>
+      </w:r>
+      <w:proofErr w:type="spellStart"/>
+      <w:r>
+        <w:t>Be₂C-C</w:t>
+      </w:r>
+      <w:proofErr w:type="spellEnd"/>
+      <w:r>
+        <w:t xml:space="preserve"> structures for resilience.</w:t>
+      </w:r>
+    </w:p>
+    <w:p>
+      <w:pPr>
+        <w:numPr>
+          <w:ilvl w:val="1"/>
+          <w:numId w:val="16"/>
+        </w:numPr>
+      </w:pPr>
+      <w:r>
+        <w:t xml:space="preserve">Cost: Higher than </w:t>
+      </w:r>
+      <w:proofErr w:type="gramStart"/>
+      <w:r>
+        <w:t>graphite, but</w:t>
+      </w:r>
+      <w:proofErr w:type="gramEnd"/>
+      <w:r>
+        <w:t xml:space="preserve"> offset by reduced core size and extended life.</w:t>
+      </w:r>
+    </w:p>
+    <w:p>
+      <w:r>
+        <w:t xml:space="preserve">Overall, </w:t>
+      </w:r>
+      <w:proofErr w:type="spellStart"/>
+      <w:proofErr w:type="gramStart"/>
+      <w:r>
+        <w:t>Be</w:t>
+      </w:r>
+      <w:proofErr w:type="gramEnd"/>
+      <w:r>
+        <w:t>₂C</w:t>
+      </w:r>
+      <w:proofErr w:type="spellEnd"/>
+      <w:r>
+        <w:t xml:space="preserve"> can effectively shrink core size in compact naval designs, provided irradiation testing confirms performance.</w:t>
+      </w:r>
+    </w:p>
+    <w:p>
+      <w:pPr>
+        <w:rPr>
+          <w:b/>
+          <w:bCs/>
+        </w:rPr>
+      </w:pPr>
+      <w:r>
+        <w:rPr>
+          <w:b/>
+          <w:bCs/>
+        </w:rPr>
+        <w:t>Section 4: Design Implications and Recommendations</w:t>
+      </w:r>
+    </w:p>
+    <w:p>
+      <w:r>
+        <w:t xml:space="preserve">Integrating </w:t>
+      </w:r>
+      <w:proofErr w:type="spellStart"/>
+      <w:r>
+        <w:t>Be₂C</w:t>
+      </w:r>
+      <w:proofErr w:type="spellEnd"/>
+      <w:r>
+        <w:t xml:space="preserve"> supports passive safety via natural circulation and greedy cup drainage, with peak temperatures &lt;1000 K during transients. Recommend experimental validation of </w:t>
+      </w:r>
+      <w:proofErr w:type="spellStart"/>
+      <w:r>
+        <w:t>Be₂C</w:t>
+      </w:r>
+      <w:proofErr w:type="spellEnd"/>
+      <w:r>
+        <w:t xml:space="preserve"> in ULIMES loops, focusing on naval-scale prototypes. This design enhances proliferation resistance through Th breeding and aligns with public domain goals for sustainable nuclear propulsion.</w:t>
+      </w:r>
+    </w:p>
+    <w:p>
+      <w:pPr>
+        <w:rPr>
+          <w:b/>
+          <w:bCs/>
+        </w:rPr>
+      </w:pPr>
+      <w:r>
+        <w:rPr>
+          <w:b/>
+          <w:bCs/>
+        </w:rPr>
+        <w:t>Public Domain Document: Contact Resources for ULIMES Fuel Development at ORNL in Support of Advanced Greedy Cup Reactor Designs</w:t>
+      </w:r>
+    </w:p>
+    <w:p>
+      <w:pPr>
+        <w:rPr>
+          <w:b/>
+          <w:bCs/>
+        </w:rPr>
+      </w:pPr>
+      <w:r>
+        <w:rPr>
+          <w:b/>
+          <w:bCs/>
+        </w:rPr>
+        <w:t>Overview</w:t>
+      </w:r>
+    </w:p>
+    <w:p>
+      <w:r>
+        <w:t xml:space="preserve">This document compiles publicly available contact information for key researchers involved in the Uranium Dioxide Liquid Metal Suspension (ULIMES) fuel concept at Oak Ridge National Laboratory (ORNL). ULIMES, consisting of </w:t>
+      </w:r>
+      <w:proofErr w:type="spellStart"/>
+      <w:r>
+        <w:t>unsintered</w:t>
+      </w:r>
+      <w:proofErr w:type="spellEnd"/>
+      <w:r>
+        <w:t xml:space="preserve"> UO₂ particles suspended in a liquid metal matrix (e.g., Pb-Sn or Bi-Pb-Sn alloys), represents a promising </w:t>
+      </w:r>
+      <w:r>
+        <w:lastRenderedPageBreak/>
+        <w:t>fuel innovation for enhancing efficiency, safety, and performance in light water reactors (LWRs) and advanced designs. When integrated into a Greedy Cup reactor configuration—with natural circulation loops for both fuel and coolant (using separate molten salt, lead, or lead-bismuth eutectic), ECCS molten salt injection (potentially in solid form) to elevate fluid levels for passive drainage, a mixed-spectrum core featuring a central thermal zone with solid moderators (</w:t>
+      </w:r>
+      <w:proofErr w:type="spellStart"/>
+      <w:r>
+        <w:t>ZrH</w:t>
+      </w:r>
+      <w:proofErr w:type="spellEnd"/>
+      <w:r>
+        <w:t xml:space="preserve">₂, carbon, or preferably beryllium carbide for compactness), an epithermal fuel region without moderators, and a thorium blanket (molten salt or dissolved </w:t>
+      </w:r>
+      <w:proofErr w:type="spellStart"/>
+      <w:r>
+        <w:t>ThO</w:t>
+      </w:r>
+      <w:proofErr w:type="spellEnd"/>
+      <w:r>
+        <w:t>₂ in liquid metal) in hexagonal close-packed geometry—ULIMES enables compact applications such as naval propulsion. Operating at reduced power (e.g., one-third for cruise modes), this setup prioritizes passive safety, neutron economy, and breeding. The information herein supports collaborative inquiries into ULIMES for such systems, drawing from public ORNL resources to facilitate open advancement in nuclear technology.</w:t>
+      </w:r>
+    </w:p>
+    <w:p>
+      <w:pPr>
+        <w:rPr>
+          <w:b/>
+          <w:bCs/>
+        </w:rPr>
+      </w:pPr>
+      <w:r>
+        <w:rPr>
+          <w:b/>
+          <w:bCs/>
+        </w:rPr>
+        <w:t>Section 1: Key Personnel and Roles in ULIMES Development</w:t>
+      </w:r>
+    </w:p>
+    <w:p>
+      <w:r>
+        <w:t>ULIMES research at ORNL focuses on fuel performance modeling, alloy selection, depletion calculations, and compatibility with LWR materials like Zircaloy-4. Principal efforts emphasize passive safety enhancements, such as improved heat transfer and reduced burnup degradation, aligning with Greedy Cup mechanisms for emergency drainage without active intervention.</w:t>
+      </w:r>
+    </w:p>
+    <w:p>
+      <w:pPr>
+        <w:numPr>
+          <w:ilvl w:val="0"/>
+          <w:numId w:val="19"/>
+        </w:numPr>
+      </w:pPr>
+      <w:r>
+        <w:rPr>
+          <w:b/>
+          <w:bCs/>
+        </w:rPr>
+        <w:t>Ian T. Greenquist, PhD</w:t>
+      </w:r>
+      <w:r>
+        <w:t xml:space="preserve">: Lead researcher and principal investigator for ULIMES. As a Nuclear Fuels Analyst in the Advanced Reactor Systems Group, Dr. Greenquist specializes in fuel performance simulations, novel fuel concepts, and </w:t>
+      </w:r>
+      <w:proofErr w:type="spellStart"/>
+      <w:r>
+        <w:t>multiphysics</w:t>
+      </w:r>
+      <w:proofErr w:type="spellEnd"/>
+      <w:r>
+        <w:t xml:space="preserve"> analyses. He has authored key reports on ULIMES alloy selection, depletion, and its application in LWRs with liquid metal suspensions for enhanced cooling and safety. His work bridges current LWR technologies with advanced reactors, including potential integrations in mixed-spectrum designs for compact naval use.</w:t>
+      </w:r>
+    </w:p>
+    <w:p>
+      <w:pPr>
+        <w:numPr>
+          <w:ilvl w:val="1"/>
+          <w:numId w:val="19"/>
+        </w:numPr>
+      </w:pPr>
+      <w:r>
+        <w:rPr>
+          <w:b/>
+          <w:bCs/>
+        </w:rPr>
+        <w:t>Contact Email</w:t>
+      </w:r>
+      <w:r>
+        <w:t xml:space="preserve">: </w:t>
+      </w:r>
+      <w:hyperlink r:id="rId9" w:tgtFrame="_blank" w:history="1">
+        <w:r>
+          <w:rPr>
+            <w:rStyle w:val="Hyperlink"/>
+          </w:rPr>
+          <w:t>greenquistit@ornl.gov</w:t>
+        </w:r>
+      </w:hyperlink>
+      <w:r>
+        <w:t xml:space="preserve"> (Note: ORNL emails are typically formatted in lowercase for use, though displayed in uppercase in some directories.)</w:t>
+      </w:r>
+    </w:p>
+    <w:p>
+      <w:pPr>
+        <w:numPr>
+          <w:ilvl w:val="1"/>
+          <w:numId w:val="19"/>
+        </w:numPr>
+      </w:pPr>
+      <w:r>
+        <w:rPr>
+          <w:b/>
+          <w:bCs/>
+        </w:rPr>
+        <w:t>Additional Contact</w:t>
+      </w:r>
+      <w:r>
+        <w:t>: ORNL staff profiles often include phone numbers or division lines; refer to the Advanced Reactor Systems Group for further details if needed.</w:t>
+      </w:r>
+    </w:p>
+    <w:p>
+      <w:pPr>
+        <w:numPr>
+          <w:ilvl w:val="0"/>
+          <w:numId w:val="19"/>
+        </w:numPr>
+      </w:pPr>
+      <w:r>
+        <w:rPr>
+          <w:b/>
+          <w:bCs/>
+        </w:rPr>
+        <w:t>Marie Romedenne</w:t>
+      </w:r>
+      <w:r>
+        <w:t xml:space="preserve">: Co-researcher contributing to ULIMES compatibility studies, particularly corrosion assessments of Zircaloy-4 in eutectic </w:t>
+      </w:r>
+      <w:proofErr w:type="spellStart"/>
+      <w:r>
+        <w:t>PbSn</w:t>
+      </w:r>
+      <w:proofErr w:type="spellEnd"/>
+      <w:r>
+        <w:t xml:space="preserve"> and </w:t>
+      </w:r>
+      <w:proofErr w:type="spellStart"/>
+      <w:r>
+        <w:t>PbBiSn</w:t>
+      </w:r>
+      <w:proofErr w:type="spellEnd"/>
+      <w:r>
+        <w:t xml:space="preserve"> alloys at operating temperatures (~400–600°C). Her work supports material validation for </w:t>
+      </w:r>
+      <w:r>
+        <w:lastRenderedPageBreak/>
+        <w:t>ULIMES in Greedy Cup configurations, ensuring minimal reaction layers for long-term stability.</w:t>
+      </w:r>
+    </w:p>
+    <w:p>
+      <w:pPr>
+        <w:numPr>
+          <w:ilvl w:val="1"/>
+          <w:numId w:val="19"/>
+        </w:numPr>
+      </w:pPr>
+      <w:r>
+        <w:rPr>
+          <w:b/>
+          <w:bCs/>
+        </w:rPr>
+        <w:t>Contact Email</w:t>
+      </w:r>
+      <w:r>
+        <w:t>: Not directly listed in searched public sources; inquiries may be directed through the Nuclear Energy and Fuel Cycle Division general contact or via Dr. Greenquist for collaboration.</w:t>
+      </w:r>
+    </w:p>
+    <w:p>
+      <w:pPr>
+        <w:rPr>
+          <w:b/>
+          <w:bCs/>
+        </w:rPr>
+      </w:pPr>
+      <w:r>
+        <w:rPr>
+          <w:b/>
+          <w:bCs/>
+        </w:rPr>
+        <w:t>Section 2: General ORNL Contacts for ULIMES-Related Inquiries</w:t>
+      </w:r>
+    </w:p>
+    <w:p>
+      <w:r>
+        <w:t>For broader project management or division-level discussions on ULIMES integration into advanced reactors:</w:t>
+      </w:r>
+    </w:p>
+    <w:p>
+      <w:pPr>
+        <w:numPr>
+          <w:ilvl w:val="0"/>
+          <w:numId w:val="20"/>
+        </w:numPr>
+      </w:pPr>
+      <w:r>
+        <w:rPr>
+          <w:b/>
+          <w:bCs/>
+        </w:rPr>
+        <w:t>Nuclear Energy and Fuel Cycle Division</w:t>
+      </w:r>
+      <w:r>
+        <w:t>: Oversees fuel development, including ULIMES. Staff directory available for targeted searches.</w:t>
+      </w:r>
+    </w:p>
+    <w:p>
+      <w:pPr>
+        <w:numPr>
+          <w:ilvl w:val="1"/>
+          <w:numId w:val="20"/>
+        </w:numPr>
+      </w:pPr>
+      <w:r>
+        <w:t xml:space="preserve">General Email: Contact via division leads or </w:t>
+      </w:r>
+      <w:hyperlink r:id="rId10" w:tgtFrame="_blank" w:history="1">
+        <w:r>
+          <w:rPr>
+            <w:rStyle w:val="Hyperlink"/>
+          </w:rPr>
+          <w:t>askhr@ornl.gov</w:t>
+        </w:r>
+      </w:hyperlink>
+      <w:r>
+        <w:t xml:space="preserve"> for routing.</w:t>
+      </w:r>
+    </w:p>
+    <w:p>
+      <w:pPr>
+        <w:numPr>
+          <w:ilvl w:val="0"/>
+          <w:numId w:val="20"/>
+        </w:numPr>
+      </w:pPr>
+      <w:r>
+        <w:rPr>
+          <w:b/>
+          <w:bCs/>
+        </w:rPr>
+        <w:t>Fusion and Fission Energy and Science Directorate</w:t>
+      </w:r>
+      <w:r>
+        <w:t>: Relevant for advanced reactor systems incorporating ULIMES.</w:t>
+      </w:r>
+    </w:p>
+    <w:p>
+      <w:pPr>
+        <w:numPr>
+          <w:ilvl w:val="1"/>
+          <w:numId w:val="20"/>
+        </w:numPr>
+      </w:pPr>
+      <w:r>
+        <w:t xml:space="preserve">Contact: </w:t>
+      </w:r>
+      <w:hyperlink r:id="rId11" w:tgtFrame="_blank" w:history="1">
+        <w:r>
+          <w:rPr>
+            <w:rStyle w:val="Hyperlink"/>
+          </w:rPr>
+          <w:t>hoaglandjj@ornl.gov</w:t>
+        </w:r>
+      </w:hyperlink>
+      <w:r>
+        <w:t xml:space="preserve"> (Directorate lead).</w:t>
+      </w:r>
+    </w:p>
+    <w:p>
+      <w:r>
+        <w:t>ORNL encourages collaborative research; direct emails to researchers like Dr. Greenquist are appropriate for technical discussions on ULIMES applications in Greedy Cup designs.</w:t>
+      </w:r>
+    </w:p>
+    <w:p>
+      <w:pPr>
+        <w:rPr>
+          <w:b/>
+          <w:bCs/>
+        </w:rPr>
+      </w:pPr>
+      <w:r>
+        <w:rPr>
+          <w:b/>
+          <w:bCs/>
+        </w:rPr>
+        <w:t>Section 3: Design Implications for Compact Naval Reactors</w:t>
+      </w:r>
+    </w:p>
+    <w:p>
+      <w:r>
+        <w:t xml:space="preserve">Incorporating ULIMES in naval Greedy Cup reactors leverages its flowing fuel for natural circulation, reducing pump dependencies and enhancing compactness with beryllium carbide moderators. At one-third power, ULIMES minimizes thermal </w:t>
+      </w:r>
+      <w:proofErr w:type="gramStart"/>
+      <w:r>
+        <w:t>stresses</w:t>
+      </w:r>
+      <w:proofErr w:type="gramEnd"/>
+      <w:r>
+        <w:t>, supporting extended operations. Contacting ORNL experts can aid in tailoring ULIMES for thorium breeding blankets and passive ECCS features.</w:t>
+      </w:r>
+    </w:p>
+    <w:p>
+      <w:pPr>
+        <w:rPr>
+          <w:b/>
+          <w:bCs/>
+        </w:rPr>
+      </w:pPr>
+      <w:r>
+        <w:rPr>
+          <w:b/>
+          <w:bCs/>
+        </w:rPr>
+        <w:t>Section 4: Recommendations</w:t>
+      </w:r>
+    </w:p>
+    <w:p>
+      <w:r>
+        <w:t>Use the provided emails for professional inquiries, citing public interest in advancing ULIMES for sustainable nuclear propulsion. This document promotes open collaboration under public domain principles.</w:t>
+      </w:r>
+    </w:p>
+    <w:p/>
     <w:p/>
     <w:p/>
     <w:p/>
@@ -1613,6 +4717,304 @@
 <file path=word/numbering.xml><?xml version="1.0" encoding="utf-8"?>
 <w:numbering xmlns:wpc="http://schemas.microsoft.com/office/word/2010/wordprocessingCanvas" xmlns:cx="http://schemas.microsoft.com/office/drawing/2014/chartex" xmlns:cx1="http://schemas.microsoft.com/office/drawing/2015/9/8/chartex" xmlns:cx2="http://schemas.microsoft.com/office/drawing/2015/10/21/chartex" xmlns:cx3="http://schemas.microsoft.com/office/drawing/2016/5/9/chartex" xmlns:cx4="http://schemas.microsoft.com/office/drawing/2016/5/10/chartex" xmlns:cx5="http://schemas.microsoft.com/office/drawing/2016/5/11/chartex" xmlns:cx6="http://schemas.microsoft.com/office/drawing/2016/5/12/chartex" xmlns:cx7="http://schemas.microsoft.com/office/drawing/2016/5/13/chartex" xmlns:cx8="http://schemas.microsoft.com/office/drawing/2016/5/14/chartex" xmlns:mc="http://schemas.openxmlformats.org/markup-compatibility/2006" xmlns:aink="http://schemas.microsoft.com/office/drawing/2016/ink" xmlns:am3d="http://schemas.microsoft.com/office/drawing/2017/model3d" xmlns:o="urn:schemas-microsoft-com:office:office" xmlns:oel="http://schemas.microsoft.com/office/2019/extlst" xmlns:r="http://schemas.openxmlformats.org/officeDocument/2006/relationships" xmlns:m="http://schemas.openxmlformats.org/officeDocument/2006/math" xmlns:v="urn:schemas-microsoft-com:vml" xmlns:wp14="http://schemas.microsoft.com/office/word/2010/wordprocessingDrawing" xmlns:wp="http://schemas.openxmlformats.org/drawingml/2006/wordprocessingDrawing" xmlns:w10="urn:schemas-microsoft-com:office:word" xmlns:w="http://schemas.openxmlformats.org/wordprocessingml/2006/main" xmlns:w14="http://schemas.microsoft.com/office/word/2010/wordml" xmlns:w15="http://schemas.microsoft.com/office/word/2012/wordml" xmlns:w16cex="http://schemas.microsoft.com/office/word/2018/wordml/cex" xmlns:w16cid="http://schemas.microsoft.com/office/word/2016/wordml/cid" xmlns:w16="http://schemas.microsoft.com/office/word/2018/wordml" xmlns:w16du="http://schemas.microsoft.com/office/word/2023/wordml/word16du" xmlns:w16sdtdh="http://schemas.microsoft.com/office/word/2020/wordml/sdtdatahash" xmlns:w16sdtfl="http://schemas.microsoft.com/office/word/2024/wordml/sdtformatlock" xmlns:w16se="http://schemas.microsoft.com/office/word/2015/wordml/symex" xmlns:wpg="http://schemas.microsoft.com/office/word/2010/wordprocessingGroup" xmlns:wpi="http://schemas.microsoft.com/office/word/2010/wordprocessingInk" xmlns:wne="http://schemas.microsoft.com/office/word/2006/wordml" xmlns:wps="http://schemas.microsoft.com/office/word/2010/wordprocessingShape" mc:Ignorable="w14 w15 w16se w16cid w16 w16cex w16sdtdh w16sdtfl w16du wp14">
   <w:abstractNum w:abstractNumId="0" w15:restartNumberingAfterBreak="0">
+    <w:nsid w:val="06245358"/>
+    <w:multiLevelType w:val="multilevel"/>
+    <w:tmpl w:val="3B1AD268"/>
+    <w:lvl w:ilvl="0">
+      <w:start w:val="1"/>
+      <w:numFmt w:val="bullet"/>
+      <w:lvlText w:val=""/>
+      <w:lvlJc w:val="left"/>
+      <w:pPr>
+        <w:tabs>
+          <w:tab w:val="num" w:pos="720"/>
+        </w:tabs>
+        <w:ind w:left="720" w:hanging="360"/>
+      </w:pPr>
+      <w:rPr>
+        <w:rFonts w:ascii="Symbol" w:hAnsi="Symbol" w:hint="default"/>
+        <w:sz w:val="20"/>
+      </w:rPr>
+    </w:lvl>
+    <w:lvl w:ilvl="1" w:tentative="1">
+      <w:start w:val="1"/>
+      <w:numFmt w:val="bullet"/>
+      <w:lvlText w:val="o"/>
+      <w:lvlJc w:val="left"/>
+      <w:pPr>
+        <w:tabs>
+          <w:tab w:val="num" w:pos="1440"/>
+        </w:tabs>
+        <w:ind w:left="1440" w:hanging="360"/>
+      </w:pPr>
+      <w:rPr>
+        <w:rFonts w:ascii="Courier New" w:hAnsi="Courier New" w:hint="default"/>
+        <w:sz w:val="20"/>
+      </w:rPr>
+    </w:lvl>
+    <w:lvl w:ilvl="2" w:tentative="1">
+      <w:start w:val="1"/>
+      <w:numFmt w:val="bullet"/>
+      <w:lvlText w:val=""/>
+      <w:lvlJc w:val="left"/>
+      <w:pPr>
+        <w:tabs>
+          <w:tab w:val="num" w:pos="2160"/>
+        </w:tabs>
+        <w:ind w:left="2160" w:hanging="360"/>
+      </w:pPr>
+      <w:rPr>
+        <w:rFonts w:ascii="Wingdings" w:hAnsi="Wingdings" w:hint="default"/>
+        <w:sz w:val="20"/>
+      </w:rPr>
+    </w:lvl>
+    <w:lvl w:ilvl="3" w:tentative="1">
+      <w:start w:val="1"/>
+      <w:numFmt w:val="bullet"/>
+      <w:lvlText w:val=""/>
+      <w:lvlJc w:val="left"/>
+      <w:pPr>
+        <w:tabs>
+          <w:tab w:val="num" w:pos="2880"/>
+        </w:tabs>
+        <w:ind w:left="2880" w:hanging="360"/>
+      </w:pPr>
+      <w:rPr>
+        <w:rFonts w:ascii="Wingdings" w:hAnsi="Wingdings" w:hint="default"/>
+        <w:sz w:val="20"/>
+      </w:rPr>
+    </w:lvl>
+    <w:lvl w:ilvl="4" w:tentative="1">
+      <w:start w:val="1"/>
+      <w:numFmt w:val="bullet"/>
+      <w:lvlText w:val=""/>
+      <w:lvlJc w:val="left"/>
+      <w:pPr>
+        <w:tabs>
+          <w:tab w:val="num" w:pos="3600"/>
+        </w:tabs>
+        <w:ind w:left="3600" w:hanging="360"/>
+      </w:pPr>
+      <w:rPr>
+        <w:rFonts w:ascii="Wingdings" w:hAnsi="Wingdings" w:hint="default"/>
+        <w:sz w:val="20"/>
+      </w:rPr>
+    </w:lvl>
+    <w:lvl w:ilvl="5" w:tentative="1">
+      <w:start w:val="1"/>
+      <w:numFmt w:val="bullet"/>
+      <w:lvlText w:val=""/>
+      <w:lvlJc w:val="left"/>
+      <w:pPr>
+        <w:tabs>
+          <w:tab w:val="num" w:pos="4320"/>
+        </w:tabs>
+        <w:ind w:left="4320" w:hanging="360"/>
+      </w:pPr>
+      <w:rPr>
+        <w:rFonts w:ascii="Wingdings" w:hAnsi="Wingdings" w:hint="default"/>
+        <w:sz w:val="20"/>
+      </w:rPr>
+    </w:lvl>
+    <w:lvl w:ilvl="6" w:tentative="1">
+      <w:start w:val="1"/>
+      <w:numFmt w:val="bullet"/>
+      <w:lvlText w:val=""/>
+      <w:lvlJc w:val="left"/>
+      <w:pPr>
+        <w:tabs>
+          <w:tab w:val="num" w:pos="5040"/>
+        </w:tabs>
+        <w:ind w:left="5040" w:hanging="360"/>
+      </w:pPr>
+      <w:rPr>
+        <w:rFonts w:ascii="Wingdings" w:hAnsi="Wingdings" w:hint="default"/>
+        <w:sz w:val="20"/>
+      </w:rPr>
+    </w:lvl>
+    <w:lvl w:ilvl="7" w:tentative="1">
+      <w:start w:val="1"/>
+      <w:numFmt w:val="bullet"/>
+      <w:lvlText w:val=""/>
+      <w:lvlJc w:val="left"/>
+      <w:pPr>
+        <w:tabs>
+          <w:tab w:val="num" w:pos="5760"/>
+        </w:tabs>
+        <w:ind w:left="5760" w:hanging="360"/>
+      </w:pPr>
+      <w:rPr>
+        <w:rFonts w:ascii="Wingdings" w:hAnsi="Wingdings" w:hint="default"/>
+        <w:sz w:val="20"/>
+      </w:rPr>
+    </w:lvl>
+    <w:lvl w:ilvl="8" w:tentative="1">
+      <w:start w:val="1"/>
+      <w:numFmt w:val="bullet"/>
+      <w:lvlText w:val=""/>
+      <w:lvlJc w:val="left"/>
+      <w:pPr>
+        <w:tabs>
+          <w:tab w:val="num" w:pos="6480"/>
+        </w:tabs>
+        <w:ind w:left="6480" w:hanging="360"/>
+      </w:pPr>
+      <w:rPr>
+        <w:rFonts w:ascii="Wingdings" w:hAnsi="Wingdings" w:hint="default"/>
+        <w:sz w:val="20"/>
+      </w:rPr>
+    </w:lvl>
+  </w:abstractNum>
+  <w:abstractNum w:abstractNumId="1" w15:restartNumberingAfterBreak="0">
+    <w:nsid w:val="0A6D295F"/>
+    <w:multiLevelType w:val="multilevel"/>
+    <w:tmpl w:val="D92C1346"/>
+    <w:lvl w:ilvl="0">
+      <w:start w:val="1"/>
+      <w:numFmt w:val="bullet"/>
+      <w:lvlText w:val=""/>
+      <w:lvlJc w:val="left"/>
+      <w:pPr>
+        <w:tabs>
+          <w:tab w:val="num" w:pos="720"/>
+        </w:tabs>
+        <w:ind w:left="720" w:hanging="360"/>
+      </w:pPr>
+      <w:rPr>
+        <w:rFonts w:ascii="Symbol" w:hAnsi="Symbol" w:hint="default"/>
+        <w:sz w:val="20"/>
+      </w:rPr>
+    </w:lvl>
+    <w:lvl w:ilvl="1">
+      <w:start w:val="1"/>
+      <w:numFmt w:val="bullet"/>
+      <w:lvlText w:val="o"/>
+      <w:lvlJc w:val="left"/>
+      <w:pPr>
+        <w:tabs>
+          <w:tab w:val="num" w:pos="1440"/>
+        </w:tabs>
+        <w:ind w:left="1440" w:hanging="360"/>
+      </w:pPr>
+      <w:rPr>
+        <w:rFonts w:ascii="Courier New" w:hAnsi="Courier New" w:hint="default"/>
+        <w:sz w:val="20"/>
+      </w:rPr>
+    </w:lvl>
+    <w:lvl w:ilvl="2" w:tentative="1">
+      <w:start w:val="1"/>
+      <w:numFmt w:val="bullet"/>
+      <w:lvlText w:val=""/>
+      <w:lvlJc w:val="left"/>
+      <w:pPr>
+        <w:tabs>
+          <w:tab w:val="num" w:pos="2160"/>
+        </w:tabs>
+        <w:ind w:left="2160" w:hanging="360"/>
+      </w:pPr>
+      <w:rPr>
+        <w:rFonts w:ascii="Wingdings" w:hAnsi="Wingdings" w:hint="default"/>
+        <w:sz w:val="20"/>
+      </w:rPr>
+    </w:lvl>
+    <w:lvl w:ilvl="3" w:tentative="1">
+      <w:start w:val="1"/>
+      <w:numFmt w:val="bullet"/>
+      <w:lvlText w:val=""/>
+      <w:lvlJc w:val="left"/>
+      <w:pPr>
+        <w:tabs>
+          <w:tab w:val="num" w:pos="2880"/>
+        </w:tabs>
+        <w:ind w:left="2880" w:hanging="360"/>
+      </w:pPr>
+      <w:rPr>
+        <w:rFonts w:ascii="Wingdings" w:hAnsi="Wingdings" w:hint="default"/>
+        <w:sz w:val="20"/>
+      </w:rPr>
+    </w:lvl>
+    <w:lvl w:ilvl="4" w:tentative="1">
+      <w:start w:val="1"/>
+      <w:numFmt w:val="bullet"/>
+      <w:lvlText w:val=""/>
+      <w:lvlJc w:val="left"/>
+      <w:pPr>
+        <w:tabs>
+          <w:tab w:val="num" w:pos="3600"/>
+        </w:tabs>
+        <w:ind w:left="3600" w:hanging="360"/>
+      </w:pPr>
+      <w:rPr>
+        <w:rFonts w:ascii="Wingdings" w:hAnsi="Wingdings" w:hint="default"/>
+        <w:sz w:val="20"/>
+      </w:rPr>
+    </w:lvl>
+    <w:lvl w:ilvl="5" w:tentative="1">
+      <w:start w:val="1"/>
+      <w:numFmt w:val="bullet"/>
+      <w:lvlText w:val=""/>
+      <w:lvlJc w:val="left"/>
+      <w:pPr>
+        <w:tabs>
+          <w:tab w:val="num" w:pos="4320"/>
+        </w:tabs>
+        <w:ind w:left="4320" w:hanging="360"/>
+      </w:pPr>
+      <w:rPr>
+        <w:rFonts w:ascii="Wingdings" w:hAnsi="Wingdings" w:hint="default"/>
+        <w:sz w:val="20"/>
+      </w:rPr>
+    </w:lvl>
+    <w:lvl w:ilvl="6" w:tentative="1">
+      <w:start w:val="1"/>
+      <w:numFmt w:val="bullet"/>
+      <w:lvlText w:val=""/>
+      <w:lvlJc w:val="left"/>
+      <w:pPr>
+        <w:tabs>
+          <w:tab w:val="num" w:pos="5040"/>
+        </w:tabs>
+        <w:ind w:left="5040" w:hanging="360"/>
+      </w:pPr>
+      <w:rPr>
+        <w:rFonts w:ascii="Wingdings" w:hAnsi="Wingdings" w:hint="default"/>
+        <w:sz w:val="20"/>
+      </w:rPr>
+    </w:lvl>
+    <w:lvl w:ilvl="7" w:tentative="1">
+      <w:start w:val="1"/>
+      <w:numFmt w:val="bullet"/>
+      <w:lvlText w:val=""/>
+      <w:lvlJc w:val="left"/>
+      <w:pPr>
+        <w:tabs>
+          <w:tab w:val="num" w:pos="5760"/>
+        </w:tabs>
+        <w:ind w:left="5760" w:hanging="360"/>
+      </w:pPr>
+      <w:rPr>
+        <w:rFonts w:ascii="Wingdings" w:hAnsi="Wingdings" w:hint="default"/>
+        <w:sz w:val="20"/>
+      </w:rPr>
+    </w:lvl>
+    <w:lvl w:ilvl="8" w:tentative="1">
+      <w:start w:val="1"/>
+      <w:numFmt w:val="bullet"/>
+      <w:lvlText w:val=""/>
+      <w:lvlJc w:val="left"/>
+      <w:pPr>
+        <w:tabs>
+          <w:tab w:val="num" w:pos="6480"/>
+        </w:tabs>
+        <w:ind w:left="6480" w:hanging="360"/>
+      </w:pPr>
+      <w:rPr>
+        <w:rFonts w:ascii="Wingdings" w:hAnsi="Wingdings" w:hint="default"/>
+        <w:sz w:val="20"/>
+      </w:rPr>
+    </w:lvl>
+  </w:abstractNum>
+  <w:abstractNum w:abstractNumId="2" w15:restartNumberingAfterBreak="0">
     <w:nsid w:val="179A1D92"/>
     <w:multiLevelType w:val="multilevel"/>
     <w:tmpl w:val="5BCAC8F6"/>
@@ -1761,7 +5163,305 @@
       </w:rPr>
     </w:lvl>
   </w:abstractNum>
-  <w:abstractNum w:abstractNumId="1" w15:restartNumberingAfterBreak="0">
+  <w:abstractNum w:abstractNumId="3" w15:restartNumberingAfterBreak="0">
+    <w:nsid w:val="1D601677"/>
+    <w:multiLevelType w:val="multilevel"/>
+    <w:tmpl w:val="F636FA76"/>
+    <w:lvl w:ilvl="0">
+      <w:start w:val="1"/>
+      <w:numFmt w:val="bullet"/>
+      <w:lvlText w:val=""/>
+      <w:lvlJc w:val="left"/>
+      <w:pPr>
+        <w:tabs>
+          <w:tab w:val="num" w:pos="720"/>
+        </w:tabs>
+        <w:ind w:left="720" w:hanging="360"/>
+      </w:pPr>
+      <w:rPr>
+        <w:rFonts w:ascii="Symbol" w:hAnsi="Symbol" w:hint="default"/>
+        <w:sz w:val="20"/>
+      </w:rPr>
+    </w:lvl>
+    <w:lvl w:ilvl="1">
+      <w:start w:val="1"/>
+      <w:numFmt w:val="bullet"/>
+      <w:lvlText w:val="o"/>
+      <w:lvlJc w:val="left"/>
+      <w:pPr>
+        <w:tabs>
+          <w:tab w:val="num" w:pos="1440"/>
+        </w:tabs>
+        <w:ind w:left="1440" w:hanging="360"/>
+      </w:pPr>
+      <w:rPr>
+        <w:rFonts w:ascii="Courier New" w:hAnsi="Courier New" w:hint="default"/>
+        <w:sz w:val="20"/>
+      </w:rPr>
+    </w:lvl>
+    <w:lvl w:ilvl="2">
+      <w:start w:val="1"/>
+      <w:numFmt w:val="bullet"/>
+      <w:lvlText w:val=""/>
+      <w:lvlJc w:val="left"/>
+      <w:pPr>
+        <w:tabs>
+          <w:tab w:val="num" w:pos="2160"/>
+        </w:tabs>
+        <w:ind w:left="2160" w:hanging="360"/>
+      </w:pPr>
+      <w:rPr>
+        <w:rFonts w:ascii="Wingdings" w:hAnsi="Wingdings" w:hint="default"/>
+        <w:sz w:val="20"/>
+      </w:rPr>
+    </w:lvl>
+    <w:lvl w:ilvl="3" w:tentative="1">
+      <w:start w:val="1"/>
+      <w:numFmt w:val="bullet"/>
+      <w:lvlText w:val=""/>
+      <w:lvlJc w:val="left"/>
+      <w:pPr>
+        <w:tabs>
+          <w:tab w:val="num" w:pos="2880"/>
+        </w:tabs>
+        <w:ind w:left="2880" w:hanging="360"/>
+      </w:pPr>
+      <w:rPr>
+        <w:rFonts w:ascii="Wingdings" w:hAnsi="Wingdings" w:hint="default"/>
+        <w:sz w:val="20"/>
+      </w:rPr>
+    </w:lvl>
+    <w:lvl w:ilvl="4" w:tentative="1">
+      <w:start w:val="1"/>
+      <w:numFmt w:val="bullet"/>
+      <w:lvlText w:val=""/>
+      <w:lvlJc w:val="left"/>
+      <w:pPr>
+        <w:tabs>
+          <w:tab w:val="num" w:pos="3600"/>
+        </w:tabs>
+        <w:ind w:left="3600" w:hanging="360"/>
+      </w:pPr>
+      <w:rPr>
+        <w:rFonts w:ascii="Wingdings" w:hAnsi="Wingdings" w:hint="default"/>
+        <w:sz w:val="20"/>
+      </w:rPr>
+    </w:lvl>
+    <w:lvl w:ilvl="5" w:tentative="1">
+      <w:start w:val="1"/>
+      <w:numFmt w:val="bullet"/>
+      <w:lvlText w:val=""/>
+      <w:lvlJc w:val="left"/>
+      <w:pPr>
+        <w:tabs>
+          <w:tab w:val="num" w:pos="4320"/>
+        </w:tabs>
+        <w:ind w:left="4320" w:hanging="360"/>
+      </w:pPr>
+      <w:rPr>
+        <w:rFonts w:ascii="Wingdings" w:hAnsi="Wingdings" w:hint="default"/>
+        <w:sz w:val="20"/>
+      </w:rPr>
+    </w:lvl>
+    <w:lvl w:ilvl="6" w:tentative="1">
+      <w:start w:val="1"/>
+      <w:numFmt w:val="bullet"/>
+      <w:lvlText w:val=""/>
+      <w:lvlJc w:val="left"/>
+      <w:pPr>
+        <w:tabs>
+          <w:tab w:val="num" w:pos="5040"/>
+        </w:tabs>
+        <w:ind w:left="5040" w:hanging="360"/>
+      </w:pPr>
+      <w:rPr>
+        <w:rFonts w:ascii="Wingdings" w:hAnsi="Wingdings" w:hint="default"/>
+        <w:sz w:val="20"/>
+      </w:rPr>
+    </w:lvl>
+    <w:lvl w:ilvl="7" w:tentative="1">
+      <w:start w:val="1"/>
+      <w:numFmt w:val="bullet"/>
+      <w:lvlText w:val=""/>
+      <w:lvlJc w:val="left"/>
+      <w:pPr>
+        <w:tabs>
+          <w:tab w:val="num" w:pos="5760"/>
+        </w:tabs>
+        <w:ind w:left="5760" w:hanging="360"/>
+      </w:pPr>
+      <w:rPr>
+        <w:rFonts w:ascii="Wingdings" w:hAnsi="Wingdings" w:hint="default"/>
+        <w:sz w:val="20"/>
+      </w:rPr>
+    </w:lvl>
+    <w:lvl w:ilvl="8" w:tentative="1">
+      <w:start w:val="1"/>
+      <w:numFmt w:val="bullet"/>
+      <w:lvlText w:val=""/>
+      <w:lvlJc w:val="left"/>
+      <w:pPr>
+        <w:tabs>
+          <w:tab w:val="num" w:pos="6480"/>
+        </w:tabs>
+        <w:ind w:left="6480" w:hanging="360"/>
+      </w:pPr>
+      <w:rPr>
+        <w:rFonts w:ascii="Wingdings" w:hAnsi="Wingdings" w:hint="default"/>
+        <w:sz w:val="20"/>
+      </w:rPr>
+    </w:lvl>
+  </w:abstractNum>
+  <w:abstractNum w:abstractNumId="4" w15:restartNumberingAfterBreak="0">
+    <w:nsid w:val="2E5B2305"/>
+    <w:multiLevelType w:val="multilevel"/>
+    <w:tmpl w:val="476A2378"/>
+    <w:lvl w:ilvl="0">
+      <w:start w:val="1"/>
+      <w:numFmt w:val="bullet"/>
+      <w:lvlText w:val=""/>
+      <w:lvlJc w:val="left"/>
+      <w:pPr>
+        <w:tabs>
+          <w:tab w:val="num" w:pos="720"/>
+        </w:tabs>
+        <w:ind w:left="720" w:hanging="360"/>
+      </w:pPr>
+      <w:rPr>
+        <w:rFonts w:ascii="Symbol" w:hAnsi="Symbol" w:hint="default"/>
+        <w:sz w:val="20"/>
+      </w:rPr>
+    </w:lvl>
+    <w:lvl w:ilvl="1">
+      <w:start w:val="1"/>
+      <w:numFmt w:val="bullet"/>
+      <w:lvlText w:val="o"/>
+      <w:lvlJc w:val="left"/>
+      <w:pPr>
+        <w:tabs>
+          <w:tab w:val="num" w:pos="1440"/>
+        </w:tabs>
+        <w:ind w:left="1440" w:hanging="360"/>
+      </w:pPr>
+      <w:rPr>
+        <w:rFonts w:ascii="Courier New" w:hAnsi="Courier New" w:hint="default"/>
+        <w:sz w:val="20"/>
+      </w:rPr>
+    </w:lvl>
+    <w:lvl w:ilvl="2" w:tentative="1">
+      <w:start w:val="1"/>
+      <w:numFmt w:val="bullet"/>
+      <w:lvlText w:val=""/>
+      <w:lvlJc w:val="left"/>
+      <w:pPr>
+        <w:tabs>
+          <w:tab w:val="num" w:pos="2160"/>
+        </w:tabs>
+        <w:ind w:left="2160" w:hanging="360"/>
+      </w:pPr>
+      <w:rPr>
+        <w:rFonts w:ascii="Wingdings" w:hAnsi="Wingdings" w:hint="default"/>
+        <w:sz w:val="20"/>
+      </w:rPr>
+    </w:lvl>
+    <w:lvl w:ilvl="3" w:tentative="1">
+      <w:start w:val="1"/>
+      <w:numFmt w:val="bullet"/>
+      <w:lvlText w:val=""/>
+      <w:lvlJc w:val="left"/>
+      <w:pPr>
+        <w:tabs>
+          <w:tab w:val="num" w:pos="2880"/>
+        </w:tabs>
+        <w:ind w:left="2880" w:hanging="360"/>
+      </w:pPr>
+      <w:rPr>
+        <w:rFonts w:ascii="Wingdings" w:hAnsi="Wingdings" w:hint="default"/>
+        <w:sz w:val="20"/>
+      </w:rPr>
+    </w:lvl>
+    <w:lvl w:ilvl="4" w:tentative="1">
+      <w:start w:val="1"/>
+      <w:numFmt w:val="bullet"/>
+      <w:lvlText w:val=""/>
+      <w:lvlJc w:val="left"/>
+      <w:pPr>
+        <w:tabs>
+          <w:tab w:val="num" w:pos="3600"/>
+        </w:tabs>
+        <w:ind w:left="3600" w:hanging="360"/>
+      </w:pPr>
+      <w:rPr>
+        <w:rFonts w:ascii="Wingdings" w:hAnsi="Wingdings" w:hint="default"/>
+        <w:sz w:val="20"/>
+      </w:rPr>
+    </w:lvl>
+    <w:lvl w:ilvl="5" w:tentative="1">
+      <w:start w:val="1"/>
+      <w:numFmt w:val="bullet"/>
+      <w:lvlText w:val=""/>
+      <w:lvlJc w:val="left"/>
+      <w:pPr>
+        <w:tabs>
+          <w:tab w:val="num" w:pos="4320"/>
+        </w:tabs>
+        <w:ind w:left="4320" w:hanging="360"/>
+      </w:pPr>
+      <w:rPr>
+        <w:rFonts w:ascii="Wingdings" w:hAnsi="Wingdings" w:hint="default"/>
+        <w:sz w:val="20"/>
+      </w:rPr>
+    </w:lvl>
+    <w:lvl w:ilvl="6" w:tentative="1">
+      <w:start w:val="1"/>
+      <w:numFmt w:val="bullet"/>
+      <w:lvlText w:val=""/>
+      <w:lvlJc w:val="left"/>
+      <w:pPr>
+        <w:tabs>
+          <w:tab w:val="num" w:pos="5040"/>
+        </w:tabs>
+        <w:ind w:left="5040" w:hanging="360"/>
+      </w:pPr>
+      <w:rPr>
+        <w:rFonts w:ascii="Wingdings" w:hAnsi="Wingdings" w:hint="default"/>
+        <w:sz w:val="20"/>
+      </w:rPr>
+    </w:lvl>
+    <w:lvl w:ilvl="7" w:tentative="1">
+      <w:start w:val="1"/>
+      <w:numFmt w:val="bullet"/>
+      <w:lvlText w:val=""/>
+      <w:lvlJc w:val="left"/>
+      <w:pPr>
+        <w:tabs>
+          <w:tab w:val="num" w:pos="5760"/>
+        </w:tabs>
+        <w:ind w:left="5760" w:hanging="360"/>
+      </w:pPr>
+      <w:rPr>
+        <w:rFonts w:ascii="Wingdings" w:hAnsi="Wingdings" w:hint="default"/>
+        <w:sz w:val="20"/>
+      </w:rPr>
+    </w:lvl>
+    <w:lvl w:ilvl="8" w:tentative="1">
+      <w:start w:val="1"/>
+      <w:numFmt w:val="bullet"/>
+      <w:lvlText w:val=""/>
+      <w:lvlJc w:val="left"/>
+      <w:pPr>
+        <w:tabs>
+          <w:tab w:val="num" w:pos="6480"/>
+        </w:tabs>
+        <w:ind w:left="6480" w:hanging="360"/>
+      </w:pPr>
+      <w:rPr>
+        <w:rFonts w:ascii="Wingdings" w:hAnsi="Wingdings" w:hint="default"/>
+        <w:sz w:val="20"/>
+      </w:rPr>
+    </w:lvl>
+  </w:abstractNum>
+  <w:abstractNum w:abstractNumId="5" w15:restartNumberingAfterBreak="0">
     <w:nsid w:val="34A60DF0"/>
     <w:multiLevelType w:val="multilevel"/>
     <w:tmpl w:val="BEA8B324"/>
@@ -1910,7 +5610,7 @@
       </w:rPr>
     </w:lvl>
   </w:abstractNum>
-  <w:abstractNum w:abstractNumId="2" w15:restartNumberingAfterBreak="0">
+  <w:abstractNum w:abstractNumId="6" w15:restartNumberingAfterBreak="0">
     <w:nsid w:val="36837986"/>
     <w:multiLevelType w:val="multilevel"/>
     <w:tmpl w:val="C7FC81D6"/>
@@ -2059,7 +5759,7 @@
       </w:rPr>
     </w:lvl>
   </w:abstractNum>
-  <w:abstractNum w:abstractNumId="3" w15:restartNumberingAfterBreak="0">
+  <w:abstractNum w:abstractNumId="7" w15:restartNumberingAfterBreak="0">
     <w:nsid w:val="38A25DCF"/>
     <w:multiLevelType w:val="multilevel"/>
     <w:tmpl w:val="397CDBFC"/>
@@ -2208,7 +5908,156 @@
       </w:rPr>
     </w:lvl>
   </w:abstractNum>
-  <w:abstractNum w:abstractNumId="4" w15:restartNumberingAfterBreak="0">
+  <w:abstractNum w:abstractNumId="8" w15:restartNumberingAfterBreak="0">
+    <w:nsid w:val="38F606C5"/>
+    <w:multiLevelType w:val="multilevel"/>
+    <w:tmpl w:val="E872DA40"/>
+    <w:lvl w:ilvl="0">
+      <w:start w:val="1"/>
+      <w:numFmt w:val="bullet"/>
+      <w:lvlText w:val=""/>
+      <w:lvlJc w:val="left"/>
+      <w:pPr>
+        <w:tabs>
+          <w:tab w:val="num" w:pos="720"/>
+        </w:tabs>
+        <w:ind w:left="720" w:hanging="360"/>
+      </w:pPr>
+      <w:rPr>
+        <w:rFonts w:ascii="Symbol" w:hAnsi="Symbol" w:hint="default"/>
+        <w:sz w:val="20"/>
+      </w:rPr>
+    </w:lvl>
+    <w:lvl w:ilvl="1" w:tentative="1">
+      <w:start w:val="1"/>
+      <w:numFmt w:val="bullet"/>
+      <w:lvlText w:val="o"/>
+      <w:lvlJc w:val="left"/>
+      <w:pPr>
+        <w:tabs>
+          <w:tab w:val="num" w:pos="1440"/>
+        </w:tabs>
+        <w:ind w:left="1440" w:hanging="360"/>
+      </w:pPr>
+      <w:rPr>
+        <w:rFonts w:ascii="Courier New" w:hAnsi="Courier New" w:hint="default"/>
+        <w:sz w:val="20"/>
+      </w:rPr>
+    </w:lvl>
+    <w:lvl w:ilvl="2" w:tentative="1">
+      <w:start w:val="1"/>
+      <w:numFmt w:val="bullet"/>
+      <w:lvlText w:val=""/>
+      <w:lvlJc w:val="left"/>
+      <w:pPr>
+        <w:tabs>
+          <w:tab w:val="num" w:pos="2160"/>
+        </w:tabs>
+        <w:ind w:left="2160" w:hanging="360"/>
+      </w:pPr>
+      <w:rPr>
+        <w:rFonts w:ascii="Wingdings" w:hAnsi="Wingdings" w:hint="default"/>
+        <w:sz w:val="20"/>
+      </w:rPr>
+    </w:lvl>
+    <w:lvl w:ilvl="3" w:tentative="1">
+      <w:start w:val="1"/>
+      <w:numFmt w:val="bullet"/>
+      <w:lvlText w:val=""/>
+      <w:lvlJc w:val="left"/>
+      <w:pPr>
+        <w:tabs>
+          <w:tab w:val="num" w:pos="2880"/>
+        </w:tabs>
+        <w:ind w:left="2880" w:hanging="360"/>
+      </w:pPr>
+      <w:rPr>
+        <w:rFonts w:ascii="Wingdings" w:hAnsi="Wingdings" w:hint="default"/>
+        <w:sz w:val="20"/>
+      </w:rPr>
+    </w:lvl>
+    <w:lvl w:ilvl="4" w:tentative="1">
+      <w:start w:val="1"/>
+      <w:numFmt w:val="bullet"/>
+      <w:lvlText w:val=""/>
+      <w:lvlJc w:val="left"/>
+      <w:pPr>
+        <w:tabs>
+          <w:tab w:val="num" w:pos="3600"/>
+        </w:tabs>
+        <w:ind w:left="3600" w:hanging="360"/>
+      </w:pPr>
+      <w:rPr>
+        <w:rFonts w:ascii="Wingdings" w:hAnsi="Wingdings" w:hint="default"/>
+        <w:sz w:val="20"/>
+      </w:rPr>
+    </w:lvl>
+    <w:lvl w:ilvl="5" w:tentative="1">
+      <w:start w:val="1"/>
+      <w:numFmt w:val="bullet"/>
+      <w:lvlText w:val=""/>
+      <w:lvlJc w:val="left"/>
+      <w:pPr>
+        <w:tabs>
+          <w:tab w:val="num" w:pos="4320"/>
+        </w:tabs>
+        <w:ind w:left="4320" w:hanging="360"/>
+      </w:pPr>
+      <w:rPr>
+        <w:rFonts w:ascii="Wingdings" w:hAnsi="Wingdings" w:hint="default"/>
+        <w:sz w:val="20"/>
+      </w:rPr>
+    </w:lvl>
+    <w:lvl w:ilvl="6" w:tentative="1">
+      <w:start w:val="1"/>
+      <w:numFmt w:val="bullet"/>
+      <w:lvlText w:val=""/>
+      <w:lvlJc w:val="left"/>
+      <w:pPr>
+        <w:tabs>
+          <w:tab w:val="num" w:pos="5040"/>
+        </w:tabs>
+        <w:ind w:left="5040" w:hanging="360"/>
+      </w:pPr>
+      <w:rPr>
+        <w:rFonts w:ascii="Wingdings" w:hAnsi="Wingdings" w:hint="default"/>
+        <w:sz w:val="20"/>
+      </w:rPr>
+    </w:lvl>
+    <w:lvl w:ilvl="7" w:tentative="1">
+      <w:start w:val="1"/>
+      <w:numFmt w:val="bullet"/>
+      <w:lvlText w:val=""/>
+      <w:lvlJc w:val="left"/>
+      <w:pPr>
+        <w:tabs>
+          <w:tab w:val="num" w:pos="5760"/>
+        </w:tabs>
+        <w:ind w:left="5760" w:hanging="360"/>
+      </w:pPr>
+      <w:rPr>
+        <w:rFonts w:ascii="Wingdings" w:hAnsi="Wingdings" w:hint="default"/>
+        <w:sz w:val="20"/>
+      </w:rPr>
+    </w:lvl>
+    <w:lvl w:ilvl="8" w:tentative="1">
+      <w:start w:val="1"/>
+      <w:numFmt w:val="bullet"/>
+      <w:lvlText w:val=""/>
+      <w:lvlJc w:val="left"/>
+      <w:pPr>
+        <w:tabs>
+          <w:tab w:val="num" w:pos="6480"/>
+        </w:tabs>
+        <w:ind w:left="6480" w:hanging="360"/>
+      </w:pPr>
+      <w:rPr>
+        <w:rFonts w:ascii="Wingdings" w:hAnsi="Wingdings" w:hint="default"/>
+        <w:sz w:val="20"/>
+      </w:rPr>
+    </w:lvl>
+  </w:abstractNum>
+  <w:abstractNum w:abstractNumId="9" w15:restartNumberingAfterBreak="0">
     <w:nsid w:val="460A2CC7"/>
     <w:multiLevelType w:val="multilevel"/>
     <w:tmpl w:val="04801F38"/>
@@ -2357,7 +6206,7 @@
       </w:rPr>
     </w:lvl>
   </w:abstractNum>
-  <w:abstractNum w:abstractNumId="5" w15:restartNumberingAfterBreak="0">
+  <w:abstractNum w:abstractNumId="10" w15:restartNumberingAfterBreak="0">
     <w:nsid w:val="48AA658D"/>
     <w:multiLevelType w:val="multilevel"/>
     <w:tmpl w:val="303821CE"/>
@@ -2506,7 +6355,156 @@
       </w:rPr>
     </w:lvl>
   </w:abstractNum>
-  <w:abstractNum w:abstractNumId="6" w15:restartNumberingAfterBreak="0">
+  <w:abstractNum w:abstractNumId="11" w15:restartNumberingAfterBreak="0">
+    <w:nsid w:val="500C1B01"/>
+    <w:multiLevelType w:val="multilevel"/>
+    <w:tmpl w:val="60CA7A86"/>
+    <w:lvl w:ilvl="0">
+      <w:start w:val="1"/>
+      <w:numFmt w:val="bullet"/>
+      <w:lvlText w:val=""/>
+      <w:lvlJc w:val="left"/>
+      <w:pPr>
+        <w:tabs>
+          <w:tab w:val="num" w:pos="720"/>
+        </w:tabs>
+        <w:ind w:left="720" w:hanging="360"/>
+      </w:pPr>
+      <w:rPr>
+        <w:rFonts w:ascii="Symbol" w:hAnsi="Symbol" w:hint="default"/>
+        <w:sz w:val="20"/>
+      </w:rPr>
+    </w:lvl>
+    <w:lvl w:ilvl="1" w:tentative="1">
+      <w:start w:val="1"/>
+      <w:numFmt w:val="bullet"/>
+      <w:lvlText w:val="o"/>
+      <w:lvlJc w:val="left"/>
+      <w:pPr>
+        <w:tabs>
+          <w:tab w:val="num" w:pos="1440"/>
+        </w:tabs>
+        <w:ind w:left="1440" w:hanging="360"/>
+      </w:pPr>
+      <w:rPr>
+        <w:rFonts w:ascii="Courier New" w:hAnsi="Courier New" w:hint="default"/>
+        <w:sz w:val="20"/>
+      </w:rPr>
+    </w:lvl>
+    <w:lvl w:ilvl="2" w:tentative="1">
+      <w:start w:val="1"/>
+      <w:numFmt w:val="bullet"/>
+      <w:lvlText w:val=""/>
+      <w:lvlJc w:val="left"/>
+      <w:pPr>
+        <w:tabs>
+          <w:tab w:val="num" w:pos="2160"/>
+        </w:tabs>
+        <w:ind w:left="2160" w:hanging="360"/>
+      </w:pPr>
+      <w:rPr>
+        <w:rFonts w:ascii="Wingdings" w:hAnsi="Wingdings" w:hint="default"/>
+        <w:sz w:val="20"/>
+      </w:rPr>
+    </w:lvl>
+    <w:lvl w:ilvl="3" w:tentative="1">
+      <w:start w:val="1"/>
+      <w:numFmt w:val="bullet"/>
+      <w:lvlText w:val=""/>
+      <w:lvlJc w:val="left"/>
+      <w:pPr>
+        <w:tabs>
+          <w:tab w:val="num" w:pos="2880"/>
+        </w:tabs>
+        <w:ind w:left="2880" w:hanging="360"/>
+      </w:pPr>
+      <w:rPr>
+        <w:rFonts w:ascii="Wingdings" w:hAnsi="Wingdings" w:hint="default"/>
+        <w:sz w:val="20"/>
+      </w:rPr>
+    </w:lvl>
+    <w:lvl w:ilvl="4" w:tentative="1">
+      <w:start w:val="1"/>
+      <w:numFmt w:val="bullet"/>
+      <w:lvlText w:val=""/>
+      <w:lvlJc w:val="left"/>
+      <w:pPr>
+        <w:tabs>
+          <w:tab w:val="num" w:pos="3600"/>
+        </w:tabs>
+        <w:ind w:left="3600" w:hanging="360"/>
+      </w:pPr>
+      <w:rPr>
+        <w:rFonts w:ascii="Wingdings" w:hAnsi="Wingdings" w:hint="default"/>
+        <w:sz w:val="20"/>
+      </w:rPr>
+    </w:lvl>
+    <w:lvl w:ilvl="5" w:tentative="1">
+      <w:start w:val="1"/>
+      <w:numFmt w:val="bullet"/>
+      <w:lvlText w:val=""/>
+      <w:lvlJc w:val="left"/>
+      <w:pPr>
+        <w:tabs>
+          <w:tab w:val="num" w:pos="4320"/>
+        </w:tabs>
+        <w:ind w:left="4320" w:hanging="360"/>
+      </w:pPr>
+      <w:rPr>
+        <w:rFonts w:ascii="Wingdings" w:hAnsi="Wingdings" w:hint="default"/>
+        <w:sz w:val="20"/>
+      </w:rPr>
+    </w:lvl>
+    <w:lvl w:ilvl="6" w:tentative="1">
+      <w:start w:val="1"/>
+      <w:numFmt w:val="bullet"/>
+      <w:lvlText w:val=""/>
+      <w:lvlJc w:val="left"/>
+      <w:pPr>
+        <w:tabs>
+          <w:tab w:val="num" w:pos="5040"/>
+        </w:tabs>
+        <w:ind w:left="5040" w:hanging="360"/>
+      </w:pPr>
+      <w:rPr>
+        <w:rFonts w:ascii="Wingdings" w:hAnsi="Wingdings" w:hint="default"/>
+        <w:sz w:val="20"/>
+      </w:rPr>
+    </w:lvl>
+    <w:lvl w:ilvl="7" w:tentative="1">
+      <w:start w:val="1"/>
+      <w:numFmt w:val="bullet"/>
+      <w:lvlText w:val=""/>
+      <w:lvlJc w:val="left"/>
+      <w:pPr>
+        <w:tabs>
+          <w:tab w:val="num" w:pos="5760"/>
+        </w:tabs>
+        <w:ind w:left="5760" w:hanging="360"/>
+      </w:pPr>
+      <w:rPr>
+        <w:rFonts w:ascii="Wingdings" w:hAnsi="Wingdings" w:hint="default"/>
+        <w:sz w:val="20"/>
+      </w:rPr>
+    </w:lvl>
+    <w:lvl w:ilvl="8" w:tentative="1">
+      <w:start w:val="1"/>
+      <w:numFmt w:val="bullet"/>
+      <w:lvlText w:val=""/>
+      <w:lvlJc w:val="left"/>
+      <w:pPr>
+        <w:tabs>
+          <w:tab w:val="num" w:pos="6480"/>
+        </w:tabs>
+        <w:ind w:left="6480" w:hanging="360"/>
+      </w:pPr>
+      <w:rPr>
+        <w:rFonts w:ascii="Wingdings" w:hAnsi="Wingdings" w:hint="default"/>
+        <w:sz w:val="20"/>
+      </w:rPr>
+    </w:lvl>
+  </w:abstractNum>
+  <w:abstractNum w:abstractNumId="12" w15:restartNumberingAfterBreak="0">
     <w:nsid w:val="521B1C4D"/>
     <w:multiLevelType w:val="multilevel"/>
     <w:tmpl w:val="E43214B8"/>
@@ -2619,7 +6617,156 @@
       </w:pPr>
     </w:lvl>
   </w:abstractNum>
-  <w:abstractNum w:abstractNumId="7" w15:restartNumberingAfterBreak="0">
+  <w:abstractNum w:abstractNumId="13" w15:restartNumberingAfterBreak="0">
+    <w:nsid w:val="55F9099A"/>
+    <w:multiLevelType w:val="multilevel"/>
+    <w:tmpl w:val="2EAA9C0A"/>
+    <w:lvl w:ilvl="0">
+      <w:start w:val="1"/>
+      <w:numFmt w:val="bullet"/>
+      <w:lvlText w:val=""/>
+      <w:lvlJc w:val="left"/>
+      <w:pPr>
+        <w:tabs>
+          <w:tab w:val="num" w:pos="720"/>
+        </w:tabs>
+        <w:ind w:left="720" w:hanging="360"/>
+      </w:pPr>
+      <w:rPr>
+        <w:rFonts w:ascii="Symbol" w:hAnsi="Symbol" w:hint="default"/>
+        <w:sz w:val="20"/>
+      </w:rPr>
+    </w:lvl>
+    <w:lvl w:ilvl="1">
+      <w:start w:val="1"/>
+      <w:numFmt w:val="bullet"/>
+      <w:lvlText w:val="o"/>
+      <w:lvlJc w:val="left"/>
+      <w:pPr>
+        <w:tabs>
+          <w:tab w:val="num" w:pos="1440"/>
+        </w:tabs>
+        <w:ind w:left="1440" w:hanging="360"/>
+      </w:pPr>
+      <w:rPr>
+        <w:rFonts w:ascii="Courier New" w:hAnsi="Courier New" w:hint="default"/>
+        <w:sz w:val="20"/>
+      </w:rPr>
+    </w:lvl>
+    <w:lvl w:ilvl="2">
+      <w:start w:val="1"/>
+      <w:numFmt w:val="bullet"/>
+      <w:lvlText w:val=""/>
+      <w:lvlJc w:val="left"/>
+      <w:pPr>
+        <w:tabs>
+          <w:tab w:val="num" w:pos="2160"/>
+        </w:tabs>
+        <w:ind w:left="2160" w:hanging="360"/>
+      </w:pPr>
+      <w:rPr>
+        <w:rFonts w:ascii="Wingdings" w:hAnsi="Wingdings" w:hint="default"/>
+        <w:sz w:val="20"/>
+      </w:rPr>
+    </w:lvl>
+    <w:lvl w:ilvl="3" w:tentative="1">
+      <w:start w:val="1"/>
+      <w:numFmt w:val="bullet"/>
+      <w:lvlText w:val=""/>
+      <w:lvlJc w:val="left"/>
+      <w:pPr>
+        <w:tabs>
+          <w:tab w:val="num" w:pos="2880"/>
+        </w:tabs>
+        <w:ind w:left="2880" w:hanging="360"/>
+      </w:pPr>
+      <w:rPr>
+        <w:rFonts w:ascii="Wingdings" w:hAnsi="Wingdings" w:hint="default"/>
+        <w:sz w:val="20"/>
+      </w:rPr>
+    </w:lvl>
+    <w:lvl w:ilvl="4" w:tentative="1">
+      <w:start w:val="1"/>
+      <w:numFmt w:val="bullet"/>
+      <w:lvlText w:val=""/>
+      <w:lvlJc w:val="left"/>
+      <w:pPr>
+        <w:tabs>
+          <w:tab w:val="num" w:pos="3600"/>
+        </w:tabs>
+        <w:ind w:left="3600" w:hanging="360"/>
+      </w:pPr>
+      <w:rPr>
+        <w:rFonts w:ascii="Wingdings" w:hAnsi="Wingdings" w:hint="default"/>
+        <w:sz w:val="20"/>
+      </w:rPr>
+    </w:lvl>
+    <w:lvl w:ilvl="5" w:tentative="1">
+      <w:start w:val="1"/>
+      <w:numFmt w:val="bullet"/>
+      <w:lvlText w:val=""/>
+      <w:lvlJc w:val="left"/>
+      <w:pPr>
+        <w:tabs>
+          <w:tab w:val="num" w:pos="4320"/>
+        </w:tabs>
+        <w:ind w:left="4320" w:hanging="360"/>
+      </w:pPr>
+      <w:rPr>
+        <w:rFonts w:ascii="Wingdings" w:hAnsi="Wingdings" w:hint="default"/>
+        <w:sz w:val="20"/>
+      </w:rPr>
+    </w:lvl>
+    <w:lvl w:ilvl="6" w:tentative="1">
+      <w:start w:val="1"/>
+      <w:numFmt w:val="bullet"/>
+      <w:lvlText w:val=""/>
+      <w:lvlJc w:val="left"/>
+      <w:pPr>
+        <w:tabs>
+          <w:tab w:val="num" w:pos="5040"/>
+        </w:tabs>
+        <w:ind w:left="5040" w:hanging="360"/>
+      </w:pPr>
+      <w:rPr>
+        <w:rFonts w:ascii="Wingdings" w:hAnsi="Wingdings" w:hint="default"/>
+        <w:sz w:val="20"/>
+      </w:rPr>
+    </w:lvl>
+    <w:lvl w:ilvl="7" w:tentative="1">
+      <w:start w:val="1"/>
+      <w:numFmt w:val="bullet"/>
+      <w:lvlText w:val=""/>
+      <w:lvlJc w:val="left"/>
+      <w:pPr>
+        <w:tabs>
+          <w:tab w:val="num" w:pos="5760"/>
+        </w:tabs>
+        <w:ind w:left="5760" w:hanging="360"/>
+      </w:pPr>
+      <w:rPr>
+        <w:rFonts w:ascii="Wingdings" w:hAnsi="Wingdings" w:hint="default"/>
+        <w:sz w:val="20"/>
+      </w:rPr>
+    </w:lvl>
+    <w:lvl w:ilvl="8" w:tentative="1">
+      <w:start w:val="1"/>
+      <w:numFmt w:val="bullet"/>
+      <w:lvlText w:val=""/>
+      <w:lvlJc w:val="left"/>
+      <w:pPr>
+        <w:tabs>
+          <w:tab w:val="num" w:pos="6480"/>
+        </w:tabs>
+        <w:ind w:left="6480" w:hanging="360"/>
+      </w:pPr>
+      <w:rPr>
+        <w:rFonts w:ascii="Wingdings" w:hAnsi="Wingdings" w:hint="default"/>
+        <w:sz w:val="20"/>
+      </w:rPr>
+    </w:lvl>
+  </w:abstractNum>
+  <w:abstractNum w:abstractNumId="14" w15:restartNumberingAfterBreak="0">
     <w:nsid w:val="560A0F3E"/>
     <w:multiLevelType w:val="multilevel"/>
     <w:tmpl w:val="BDB45386"/>
@@ -2732,7 +6879,156 @@
       </w:pPr>
     </w:lvl>
   </w:abstractNum>
-  <w:abstractNum w:abstractNumId="8" w15:restartNumberingAfterBreak="0">
+  <w:abstractNum w:abstractNumId="15" w15:restartNumberingAfterBreak="0">
+    <w:nsid w:val="5C8D5117"/>
+    <w:multiLevelType w:val="multilevel"/>
+    <w:tmpl w:val="6F988428"/>
+    <w:lvl w:ilvl="0">
+      <w:start w:val="1"/>
+      <w:numFmt w:val="bullet"/>
+      <w:lvlText w:val=""/>
+      <w:lvlJc w:val="left"/>
+      <w:pPr>
+        <w:tabs>
+          <w:tab w:val="num" w:pos="720"/>
+        </w:tabs>
+        <w:ind w:left="720" w:hanging="360"/>
+      </w:pPr>
+      <w:rPr>
+        <w:rFonts w:ascii="Symbol" w:hAnsi="Symbol" w:hint="default"/>
+        <w:sz w:val="20"/>
+      </w:rPr>
+    </w:lvl>
+    <w:lvl w:ilvl="1">
+      <w:start w:val="1"/>
+      <w:numFmt w:val="bullet"/>
+      <w:lvlText w:val="o"/>
+      <w:lvlJc w:val="left"/>
+      <w:pPr>
+        <w:tabs>
+          <w:tab w:val="num" w:pos="1440"/>
+        </w:tabs>
+        <w:ind w:left="1440" w:hanging="360"/>
+      </w:pPr>
+      <w:rPr>
+        <w:rFonts w:ascii="Courier New" w:hAnsi="Courier New" w:hint="default"/>
+        <w:sz w:val="20"/>
+      </w:rPr>
+    </w:lvl>
+    <w:lvl w:ilvl="2" w:tentative="1">
+      <w:start w:val="1"/>
+      <w:numFmt w:val="bullet"/>
+      <w:lvlText w:val=""/>
+      <w:lvlJc w:val="left"/>
+      <w:pPr>
+        <w:tabs>
+          <w:tab w:val="num" w:pos="2160"/>
+        </w:tabs>
+        <w:ind w:left="2160" w:hanging="360"/>
+      </w:pPr>
+      <w:rPr>
+        <w:rFonts w:ascii="Wingdings" w:hAnsi="Wingdings" w:hint="default"/>
+        <w:sz w:val="20"/>
+      </w:rPr>
+    </w:lvl>
+    <w:lvl w:ilvl="3" w:tentative="1">
+      <w:start w:val="1"/>
+      <w:numFmt w:val="bullet"/>
+      <w:lvlText w:val=""/>
+      <w:lvlJc w:val="left"/>
+      <w:pPr>
+        <w:tabs>
+          <w:tab w:val="num" w:pos="2880"/>
+        </w:tabs>
+        <w:ind w:left="2880" w:hanging="360"/>
+      </w:pPr>
+      <w:rPr>
+        <w:rFonts w:ascii="Wingdings" w:hAnsi="Wingdings" w:hint="default"/>
+        <w:sz w:val="20"/>
+      </w:rPr>
+    </w:lvl>
+    <w:lvl w:ilvl="4" w:tentative="1">
+      <w:start w:val="1"/>
+      <w:numFmt w:val="bullet"/>
+      <w:lvlText w:val=""/>
+      <w:lvlJc w:val="left"/>
+      <w:pPr>
+        <w:tabs>
+          <w:tab w:val="num" w:pos="3600"/>
+        </w:tabs>
+        <w:ind w:left="3600" w:hanging="360"/>
+      </w:pPr>
+      <w:rPr>
+        <w:rFonts w:ascii="Wingdings" w:hAnsi="Wingdings" w:hint="default"/>
+        <w:sz w:val="20"/>
+      </w:rPr>
+    </w:lvl>
+    <w:lvl w:ilvl="5" w:tentative="1">
+      <w:start w:val="1"/>
+      <w:numFmt w:val="bullet"/>
+      <w:lvlText w:val=""/>
+      <w:lvlJc w:val="left"/>
+      <w:pPr>
+        <w:tabs>
+          <w:tab w:val="num" w:pos="4320"/>
+        </w:tabs>
+        <w:ind w:left="4320" w:hanging="360"/>
+      </w:pPr>
+      <w:rPr>
+        <w:rFonts w:ascii="Wingdings" w:hAnsi="Wingdings" w:hint="default"/>
+        <w:sz w:val="20"/>
+      </w:rPr>
+    </w:lvl>
+    <w:lvl w:ilvl="6" w:tentative="1">
+      <w:start w:val="1"/>
+      <w:numFmt w:val="bullet"/>
+      <w:lvlText w:val=""/>
+      <w:lvlJc w:val="left"/>
+      <w:pPr>
+        <w:tabs>
+          <w:tab w:val="num" w:pos="5040"/>
+        </w:tabs>
+        <w:ind w:left="5040" w:hanging="360"/>
+      </w:pPr>
+      <w:rPr>
+        <w:rFonts w:ascii="Wingdings" w:hAnsi="Wingdings" w:hint="default"/>
+        <w:sz w:val="20"/>
+      </w:rPr>
+    </w:lvl>
+    <w:lvl w:ilvl="7" w:tentative="1">
+      <w:start w:val="1"/>
+      <w:numFmt w:val="bullet"/>
+      <w:lvlText w:val=""/>
+      <w:lvlJc w:val="left"/>
+      <w:pPr>
+        <w:tabs>
+          <w:tab w:val="num" w:pos="5760"/>
+        </w:tabs>
+        <w:ind w:left="5760" w:hanging="360"/>
+      </w:pPr>
+      <w:rPr>
+        <w:rFonts w:ascii="Wingdings" w:hAnsi="Wingdings" w:hint="default"/>
+        <w:sz w:val="20"/>
+      </w:rPr>
+    </w:lvl>
+    <w:lvl w:ilvl="8" w:tentative="1">
+      <w:start w:val="1"/>
+      <w:numFmt w:val="bullet"/>
+      <w:lvlText w:val=""/>
+      <w:lvlJc w:val="left"/>
+      <w:pPr>
+        <w:tabs>
+          <w:tab w:val="num" w:pos="6480"/>
+        </w:tabs>
+        <w:ind w:left="6480" w:hanging="360"/>
+      </w:pPr>
+      <w:rPr>
+        <w:rFonts w:ascii="Wingdings" w:hAnsi="Wingdings" w:hint="default"/>
+        <w:sz w:val="20"/>
+      </w:rPr>
+    </w:lvl>
+  </w:abstractNum>
+  <w:abstractNum w:abstractNumId="16" w15:restartNumberingAfterBreak="0">
     <w:nsid w:val="627328FD"/>
     <w:multiLevelType w:val="multilevel"/>
     <w:tmpl w:val="3314F8C2"/>
@@ -2881,7 +7177,7 @@
       </w:rPr>
     </w:lvl>
   </w:abstractNum>
-  <w:abstractNum w:abstractNumId="9" w15:restartNumberingAfterBreak="0">
+  <w:abstractNum w:abstractNumId="17" w15:restartNumberingAfterBreak="0">
     <w:nsid w:val="66686037"/>
     <w:multiLevelType w:val="multilevel"/>
     <w:tmpl w:val="BA249774"/>
@@ -2994,7 +7290,156 @@
       </w:pPr>
     </w:lvl>
   </w:abstractNum>
-  <w:abstractNum w:abstractNumId="10" w15:restartNumberingAfterBreak="0">
+  <w:abstractNum w:abstractNumId="18" w15:restartNumberingAfterBreak="0">
+    <w:nsid w:val="6A1565F5"/>
+    <w:multiLevelType w:val="multilevel"/>
+    <w:tmpl w:val="55C834BA"/>
+    <w:lvl w:ilvl="0">
+      <w:start w:val="1"/>
+      <w:numFmt w:val="bullet"/>
+      <w:lvlText w:val=""/>
+      <w:lvlJc w:val="left"/>
+      <w:pPr>
+        <w:tabs>
+          <w:tab w:val="num" w:pos="720"/>
+        </w:tabs>
+        <w:ind w:left="720" w:hanging="360"/>
+      </w:pPr>
+      <w:rPr>
+        <w:rFonts w:ascii="Symbol" w:hAnsi="Symbol" w:hint="default"/>
+        <w:sz w:val="20"/>
+      </w:rPr>
+    </w:lvl>
+    <w:lvl w:ilvl="1">
+      <w:start w:val="1"/>
+      <w:numFmt w:val="bullet"/>
+      <w:lvlText w:val="o"/>
+      <w:lvlJc w:val="left"/>
+      <w:pPr>
+        <w:tabs>
+          <w:tab w:val="num" w:pos="1440"/>
+        </w:tabs>
+        <w:ind w:left="1440" w:hanging="360"/>
+      </w:pPr>
+      <w:rPr>
+        <w:rFonts w:ascii="Courier New" w:hAnsi="Courier New" w:hint="default"/>
+        <w:sz w:val="20"/>
+      </w:rPr>
+    </w:lvl>
+    <w:lvl w:ilvl="2" w:tentative="1">
+      <w:start w:val="1"/>
+      <w:numFmt w:val="bullet"/>
+      <w:lvlText w:val=""/>
+      <w:lvlJc w:val="left"/>
+      <w:pPr>
+        <w:tabs>
+          <w:tab w:val="num" w:pos="2160"/>
+        </w:tabs>
+        <w:ind w:left="2160" w:hanging="360"/>
+      </w:pPr>
+      <w:rPr>
+        <w:rFonts w:ascii="Wingdings" w:hAnsi="Wingdings" w:hint="default"/>
+        <w:sz w:val="20"/>
+      </w:rPr>
+    </w:lvl>
+    <w:lvl w:ilvl="3" w:tentative="1">
+      <w:start w:val="1"/>
+      <w:numFmt w:val="bullet"/>
+      <w:lvlText w:val=""/>
+      <w:lvlJc w:val="left"/>
+      <w:pPr>
+        <w:tabs>
+          <w:tab w:val="num" w:pos="2880"/>
+        </w:tabs>
+        <w:ind w:left="2880" w:hanging="360"/>
+      </w:pPr>
+      <w:rPr>
+        <w:rFonts w:ascii="Wingdings" w:hAnsi="Wingdings" w:hint="default"/>
+        <w:sz w:val="20"/>
+      </w:rPr>
+    </w:lvl>
+    <w:lvl w:ilvl="4" w:tentative="1">
+      <w:start w:val="1"/>
+      <w:numFmt w:val="bullet"/>
+      <w:lvlText w:val=""/>
+      <w:lvlJc w:val="left"/>
+      <w:pPr>
+        <w:tabs>
+          <w:tab w:val="num" w:pos="3600"/>
+        </w:tabs>
+        <w:ind w:left="3600" w:hanging="360"/>
+      </w:pPr>
+      <w:rPr>
+        <w:rFonts w:ascii="Wingdings" w:hAnsi="Wingdings" w:hint="default"/>
+        <w:sz w:val="20"/>
+      </w:rPr>
+    </w:lvl>
+    <w:lvl w:ilvl="5" w:tentative="1">
+      <w:start w:val="1"/>
+      <w:numFmt w:val="bullet"/>
+      <w:lvlText w:val=""/>
+      <w:lvlJc w:val="left"/>
+      <w:pPr>
+        <w:tabs>
+          <w:tab w:val="num" w:pos="4320"/>
+        </w:tabs>
+        <w:ind w:left="4320" w:hanging="360"/>
+      </w:pPr>
+      <w:rPr>
+        <w:rFonts w:ascii="Wingdings" w:hAnsi="Wingdings" w:hint="default"/>
+        <w:sz w:val="20"/>
+      </w:rPr>
+    </w:lvl>
+    <w:lvl w:ilvl="6" w:tentative="1">
+      <w:start w:val="1"/>
+      <w:numFmt w:val="bullet"/>
+      <w:lvlText w:val=""/>
+      <w:lvlJc w:val="left"/>
+      <w:pPr>
+        <w:tabs>
+          <w:tab w:val="num" w:pos="5040"/>
+        </w:tabs>
+        <w:ind w:left="5040" w:hanging="360"/>
+      </w:pPr>
+      <w:rPr>
+        <w:rFonts w:ascii="Wingdings" w:hAnsi="Wingdings" w:hint="default"/>
+        <w:sz w:val="20"/>
+      </w:rPr>
+    </w:lvl>
+    <w:lvl w:ilvl="7" w:tentative="1">
+      <w:start w:val="1"/>
+      <w:numFmt w:val="bullet"/>
+      <w:lvlText w:val=""/>
+      <w:lvlJc w:val="left"/>
+      <w:pPr>
+        <w:tabs>
+          <w:tab w:val="num" w:pos="5760"/>
+        </w:tabs>
+        <w:ind w:left="5760" w:hanging="360"/>
+      </w:pPr>
+      <w:rPr>
+        <w:rFonts w:ascii="Wingdings" w:hAnsi="Wingdings" w:hint="default"/>
+        <w:sz w:val="20"/>
+      </w:rPr>
+    </w:lvl>
+    <w:lvl w:ilvl="8" w:tentative="1">
+      <w:start w:val="1"/>
+      <w:numFmt w:val="bullet"/>
+      <w:lvlText w:val=""/>
+      <w:lvlJc w:val="left"/>
+      <w:pPr>
+        <w:tabs>
+          <w:tab w:val="num" w:pos="6480"/>
+        </w:tabs>
+        <w:ind w:left="6480" w:hanging="360"/>
+      </w:pPr>
+      <w:rPr>
+        <w:rFonts w:ascii="Wingdings" w:hAnsi="Wingdings" w:hint="default"/>
+        <w:sz w:val="20"/>
+      </w:rPr>
+    </w:lvl>
+  </w:abstractNum>
+  <w:abstractNum w:abstractNumId="19" w15:restartNumberingAfterBreak="0">
     <w:nsid w:val="7F9C61DD"/>
     <w:multiLevelType w:val="multilevel"/>
     <w:tmpl w:val="5BB6DE40"/>
@@ -3144,37 +7589,64 @@
     </w:lvl>
   </w:abstractNum>
   <w:num w:numId="1" w16cid:durableId="197007281">
+    <w:abstractNumId w:val="5"/>
+  </w:num>
+  <w:num w:numId="2" w16cid:durableId="123547876">
+    <w:abstractNumId w:val="2"/>
+  </w:num>
+  <w:num w:numId="3" w16cid:durableId="1627420682">
+    <w:abstractNumId w:val="14"/>
+  </w:num>
+  <w:num w:numId="4" w16cid:durableId="479231708">
+    <w:abstractNumId w:val="12"/>
+  </w:num>
+  <w:num w:numId="5" w16cid:durableId="1973367036">
+    <w:abstractNumId w:val="17"/>
+  </w:num>
+  <w:num w:numId="6" w16cid:durableId="1485465316">
+    <w:abstractNumId w:val="16"/>
+  </w:num>
+  <w:num w:numId="7" w16cid:durableId="277689442">
+    <w:abstractNumId w:val="10"/>
+  </w:num>
+  <w:num w:numId="8" w16cid:durableId="2016105192">
+    <w:abstractNumId w:val="7"/>
+  </w:num>
+  <w:num w:numId="9" w16cid:durableId="243103607">
+    <w:abstractNumId w:val="9"/>
+  </w:num>
+  <w:num w:numId="10" w16cid:durableId="2044623350">
+    <w:abstractNumId w:val="19"/>
+  </w:num>
+  <w:num w:numId="11" w16cid:durableId="1028026139">
+    <w:abstractNumId w:val="6"/>
+  </w:num>
+  <w:num w:numId="12" w16cid:durableId="46297760">
+    <w:abstractNumId w:val="3"/>
+  </w:num>
+  <w:num w:numId="13" w16cid:durableId="1408919817">
+    <w:abstractNumId w:val="13"/>
+  </w:num>
+  <w:num w:numId="14" w16cid:durableId="631447393">
+    <w:abstractNumId w:val="8"/>
+  </w:num>
+  <w:num w:numId="15" w16cid:durableId="242567421">
+    <w:abstractNumId w:val="4"/>
+  </w:num>
+  <w:num w:numId="16" w16cid:durableId="1035428171">
+    <w:abstractNumId w:val="15"/>
+  </w:num>
+  <w:num w:numId="17" w16cid:durableId="920410499">
+    <w:abstractNumId w:val="0"/>
+  </w:num>
+  <w:num w:numId="18" w16cid:durableId="14575576">
+    <w:abstractNumId w:val="11"/>
+  </w:num>
+  <w:num w:numId="19" w16cid:durableId="1909342818">
     <w:abstractNumId w:val="1"/>
   </w:num>
-  <w:num w:numId="2" w16cid:durableId="123547876">
-    <w:abstractNumId w:val="0"/>
-  </w:num>
-  <w:num w:numId="3" w16cid:durableId="1627420682">
-    <w:abstractNumId w:val="7"/>
-  </w:num>
-  <w:num w:numId="4" w16cid:durableId="479231708">
-    <w:abstractNumId w:val="6"/>
-  </w:num>
-  <w:num w:numId="5" w16cid:durableId="1973367036">
-    <w:abstractNumId w:val="9"/>
-  </w:num>
-  <w:num w:numId="6" w16cid:durableId="1485465316">
-    <w:abstractNumId w:val="8"/>
-  </w:num>
-  <w:num w:numId="7" w16cid:durableId="277689442">
-    <w:abstractNumId w:val="5"/>
-  </w:num>
-  <w:num w:numId="8" w16cid:durableId="2016105192">
-    <w:abstractNumId w:val="3"/>
-  </w:num>
-  <w:num w:numId="9" w16cid:durableId="243103607">
-    <w:abstractNumId w:val="4"/>
-  </w:num>
-  <w:num w:numId="10" w16cid:durableId="2044623350">
-    <w:abstractNumId w:val="10"/>
-  </w:num>
-  <w:num w:numId="11" w16cid:durableId="1028026139">
-    <w:abstractNumId w:val="2"/>
+  <w:num w:numId="20" w16cid:durableId="159929573">
+    <w:abstractNumId w:val="18"/>
   </w:num>
 </w:numbering>
 </file>

</xml_diff>